<commit_message>
[update] Final. ponto 2 e metade do 2.1
Finalização do ponto 2 e metade do 2.1
</commit_message>
<xml_diff>
--- a/2026/trabalhos/TCC/ARTIGO_Historiando.docx
+++ b/2026/trabalhos/TCC/ARTIGO_Historiando.docx
@@ -1,6 +1,6 @@
 
 <file path=word/document.xml><?xml version="1.0" encoding="utf-8"?>
-<w:document xmlns:wpc="http://schemas.microsoft.com/office/word/2010/wordprocessingCanvas" xmlns:cx="http://schemas.microsoft.com/office/drawing/2014/chartex" xmlns:mc="http://schemas.openxmlformats.org/markup-compatibility/2006" xmlns:o="urn:schemas-microsoft-com:office:office" xmlns:r="http://schemas.openxmlformats.org/officeDocument/2006/relationships" xmlns:m="http://schemas.openxmlformats.org/officeDocument/2006/math" xmlns:v="urn:schemas-microsoft-com:vml" xmlns:wp14="http://schemas.microsoft.com/office/word/2010/wordprocessingDrawing" xmlns:wp="http://schemas.openxmlformats.org/drawingml/2006/wordprocessingDrawing" xmlns:w10="urn:schemas-microsoft-com:office:word" xmlns:w="http://schemas.openxmlformats.org/wordprocessingml/2006/main" xmlns:w14="http://schemas.microsoft.com/office/word/2010/wordml" xmlns:w15="http://schemas.microsoft.com/office/word/2012/wordml" xmlns:w16se="http://schemas.microsoft.com/office/word/2015/wordml/symex" xmlns:wpg="http://schemas.microsoft.com/office/word/2010/wordprocessingGroup" xmlns:wpi="http://schemas.microsoft.com/office/word/2010/wordprocessingInk" xmlns:wne="http://schemas.microsoft.com/office/word/2006/wordml" xmlns:wps="http://schemas.microsoft.com/office/word/2010/wordprocessingShape" mc:Ignorable="w14 w15 w16se wp14">
+<w:document xmlns:wpc="http://schemas.microsoft.com/office/word/2010/wordprocessingCanvas" xmlns:cx="http://schemas.microsoft.com/office/drawing/2014/chartex" xmlns:cx1="http://schemas.microsoft.com/office/drawing/2015/9/8/chartex" xmlns:cx2="http://schemas.microsoft.com/office/drawing/2015/10/21/chartex" xmlns:cx3="http://schemas.microsoft.com/office/drawing/2016/5/9/chartex" xmlns:cx4="http://schemas.microsoft.com/office/drawing/2016/5/10/chartex" xmlns:cx5="http://schemas.microsoft.com/office/drawing/2016/5/11/chartex" xmlns:cx6="http://schemas.microsoft.com/office/drawing/2016/5/12/chartex" xmlns:cx7="http://schemas.microsoft.com/office/drawing/2016/5/13/chartex" xmlns:cx8="http://schemas.microsoft.com/office/drawing/2016/5/14/chartex" xmlns:mc="http://schemas.openxmlformats.org/markup-compatibility/2006" xmlns:aink="http://schemas.microsoft.com/office/drawing/2016/ink" xmlns:am3d="http://schemas.microsoft.com/office/drawing/2017/model3d" xmlns:o="urn:schemas-microsoft-com:office:office" xmlns:oel="http://schemas.microsoft.com/office/2019/extlst" xmlns:r="http://schemas.openxmlformats.org/officeDocument/2006/relationships" xmlns:m="http://schemas.openxmlformats.org/officeDocument/2006/math" xmlns:v="urn:schemas-microsoft-com:vml" xmlns:wp14="http://schemas.microsoft.com/office/word/2010/wordprocessingDrawing" xmlns:wp="http://schemas.openxmlformats.org/drawingml/2006/wordprocessingDrawing" xmlns:w10="urn:schemas-microsoft-com:office:word" xmlns:w="http://schemas.openxmlformats.org/wordprocessingml/2006/main" xmlns:w14="http://schemas.microsoft.com/office/word/2010/wordml" xmlns:w15="http://schemas.microsoft.com/office/word/2012/wordml" xmlns:w16cex="http://schemas.microsoft.com/office/word/2018/wordml/cex" xmlns:w16cid="http://schemas.microsoft.com/office/word/2016/wordml/cid" xmlns:w16="http://schemas.microsoft.com/office/word/2018/wordml" xmlns:w16du="http://schemas.microsoft.com/office/word/2023/wordml/word16du" xmlns:w16sdtdh="http://schemas.microsoft.com/office/word/2020/wordml/sdtdatahash" xmlns:w16sdtfl="http://schemas.microsoft.com/office/word/2024/wordml/sdtformatlock" xmlns:w16se="http://schemas.microsoft.com/office/word/2015/wordml/symex" xmlns:wpg="http://schemas.microsoft.com/office/word/2010/wordprocessingGroup" xmlns:wpi="http://schemas.microsoft.com/office/word/2010/wordprocessingInk" xmlns:wne="http://schemas.microsoft.com/office/word/2006/wordml" xmlns:wps="http://schemas.microsoft.com/office/word/2010/wordprocessingShape" mc:Ignorable="w14 w15 w16se w16cid w16 w16cex w16sdtdh w16sdtfl w16du wp14">
   <w:body>
     <w:p>
       <w:pPr>
@@ -685,7 +685,23 @@
           <w:sz w:val="24"/>
           <w:szCs w:val="24"/>
         </w:rPr>
-        <w:t>Entretanto, a abordagem de determinados conteúdos históricos pode apresentar desafios no contexto educacional, especialmente quando as metodologias utilizadas não contemplam diferentes formas de aprendizagem ou quando determinados acontecimentos são apresentados predominantemente a partir de perspectivas coloniais. Nesse contexto, recursos digitais e estratégias lúdicas podem constituir alternativas para aproximar os estudantes dos conteúdos históricos e estimular sua participação no processo de aprendizagem.</w:t>
+        <w:t>Entretanto, a abordagem de determinados conteúdos históricos pode apresentar desafios no contexto educacional, especialmente quando as metodologias utilizadas não contemplam diferentes formas de aprendizagem ou quando determinados acontecimentos são apresentados predominantemente a partir de perspectivas coloniais. Nesse contexto, recursos digitais e estratégias lúdicas podem constituir alternativas para aproximar os estudantes dos conteúdos históricos e estimular sua participação</w:t>
+      </w:r>
+      <w:r>
+        <w:rPr>
+          <w:rFonts w:ascii="Arial" w:hAnsi="Arial" w:cs="Arial"/>
+          <w:sz w:val="24"/>
+          <w:szCs w:val="24"/>
+        </w:rPr>
+        <w:t xml:space="preserve"> ativa</w:t>
+      </w:r>
+      <w:r>
+        <w:rPr>
+          <w:rFonts w:ascii="Arial" w:hAnsi="Arial" w:cs="Arial"/>
+          <w:sz w:val="24"/>
+          <w:szCs w:val="24"/>
+        </w:rPr>
+        <w:t xml:space="preserve"> no processo de aprendizagem.</w:t>
       </w:r>
     </w:p>
     <w:p>
@@ -876,47 +892,39 @@
           <w:sz w:val="24"/>
           <w:szCs w:val="24"/>
         </w:rPr>
-        <w:t>Os períodos que impactaram significativamente o ensino da História do Brasil f</w:t>
-      </w:r>
-      <w:r>
-        <w:rPr>
-          <w:rFonts w:ascii="Arial" w:hAnsi="Arial" w:cs="Arial"/>
-          <w:sz w:val="24"/>
-          <w:szCs w:val="24"/>
-        </w:rPr>
-        <w:t>oram Império</w:t>
-      </w:r>
-      <w:r>
-        <w:rPr>
-          <w:rFonts w:ascii="Arial" w:hAnsi="Arial" w:cs="Arial"/>
-          <w:sz w:val="24"/>
-          <w:szCs w:val="24"/>
-        </w:rPr>
-        <w:t xml:space="preserve">, </w:t>
-      </w:r>
-      <w:r>
-        <w:rPr>
-          <w:rFonts w:ascii="Arial" w:hAnsi="Arial" w:cs="Arial"/>
-          <w:sz w:val="24"/>
-          <w:szCs w:val="24"/>
-        </w:rPr>
-        <w:t xml:space="preserve">República e </w:t>
-      </w:r>
-      <w:r>
-        <w:rPr>
-          <w:rFonts w:ascii="Arial" w:hAnsi="Arial" w:cs="Arial"/>
-          <w:sz w:val="24"/>
-          <w:szCs w:val="24"/>
-        </w:rPr>
-        <w:t xml:space="preserve">Ditadura Militar, eles tiveram suas particularidades, mas um ponto em comum </w:t>
-      </w:r>
-      <w:r>
-        <w:rPr>
-          <w:rFonts w:ascii="Arial" w:hAnsi="Arial" w:cs="Arial"/>
-          <w:sz w:val="24"/>
-          <w:szCs w:val="24"/>
-        </w:rPr>
-        <w:t>entre os três</w:t>
+        <w:t xml:space="preserve">No período colonial, </w:t>
+      </w:r>
+      <w:r>
+        <w:rPr>
+          <w:rFonts w:ascii="Arial" w:hAnsi="Arial" w:cs="Arial"/>
+          <w:sz w:val="24"/>
+          <w:szCs w:val="24"/>
+        </w:rPr>
+        <w:t xml:space="preserve">a educação </w:t>
+      </w:r>
+      <w:r>
+        <w:rPr>
+          <w:rFonts w:ascii="Arial" w:hAnsi="Arial" w:cs="Arial"/>
+          <w:sz w:val="24"/>
+          <w:szCs w:val="24"/>
+        </w:rPr>
+        <w:t>formal era disseminada</w:t>
+      </w:r>
+      <w:r>
+        <w:rPr>
+          <w:rFonts w:ascii="Arial" w:hAnsi="Arial" w:cs="Arial"/>
+          <w:sz w:val="24"/>
+          <w:szCs w:val="24"/>
+        </w:rPr>
+        <w:t xml:space="preserve"> por meio dos jesuítas</w:t>
+      </w:r>
+      <w:r>
+        <w:rPr>
+          <w:rFonts w:ascii="Arial" w:hAnsi="Arial" w:cs="Arial"/>
+          <w:sz w:val="24"/>
+          <w:szCs w:val="24"/>
+        </w:rPr>
+        <w:t>,</w:t>
       </w:r>
       <w:r>
         <w:rPr>
@@ -932,115 +940,270 @@
           <w:sz w:val="24"/>
           <w:szCs w:val="24"/>
         </w:rPr>
-        <w:t xml:space="preserve">foi </w:t>
-      </w:r>
-      <w:r>
-        <w:rPr>
-          <w:rFonts w:ascii="Arial" w:hAnsi="Arial" w:cs="Arial"/>
-          <w:sz w:val="24"/>
-          <w:szCs w:val="24"/>
-        </w:rPr>
-        <w:t>a utilização d</w:t>
-      </w:r>
-      <w:r>
-        <w:rPr>
-          <w:rFonts w:ascii="Arial" w:hAnsi="Arial" w:cs="Arial"/>
-          <w:sz w:val="24"/>
-          <w:szCs w:val="24"/>
-        </w:rPr>
-        <w:t>essa disciplina para</w:t>
-      </w:r>
-      <w:r>
-        <w:rPr>
-          <w:rFonts w:ascii="Arial" w:hAnsi="Arial" w:cs="Arial"/>
-          <w:sz w:val="24"/>
-          <w:szCs w:val="24"/>
-        </w:rPr>
-        <w:t xml:space="preserve"> alcançar</w:t>
-      </w:r>
-      <w:r>
-        <w:rPr>
-          <w:rFonts w:ascii="Arial" w:hAnsi="Arial" w:cs="Arial"/>
-          <w:sz w:val="24"/>
-          <w:szCs w:val="24"/>
-        </w:rPr>
-        <w:t xml:space="preserve"> de forma sútil os interesses das </w:t>
-      </w:r>
-      <w:r>
-        <w:rPr>
-          <w:rFonts w:ascii="Arial" w:hAnsi="Arial" w:cs="Arial"/>
-          <w:sz w:val="24"/>
-          <w:szCs w:val="24"/>
-        </w:rPr>
-        <w:t>classes</w:t>
-      </w:r>
-      <w:r>
-        <w:rPr>
-          <w:rFonts w:ascii="Arial" w:hAnsi="Arial" w:cs="Arial"/>
-          <w:sz w:val="24"/>
-          <w:szCs w:val="24"/>
-        </w:rPr>
-        <w:t xml:space="preserve"> dominantes</w:t>
-      </w:r>
-      <w:r>
-        <w:rPr>
-          <w:rFonts w:ascii="Arial" w:hAnsi="Arial" w:cs="Arial"/>
-          <w:sz w:val="24"/>
-          <w:szCs w:val="24"/>
-        </w:rPr>
-        <w:t>.</w:t>
-      </w:r>
-    </w:p>
-    <w:p>
-      <w:pPr>
-        <w:spacing w:after="0" w:line="360" w:lineRule="auto"/>
-        <w:jc w:val="both"/>
-        <w:rPr>
-          <w:rFonts w:ascii="Arial" w:hAnsi="Arial" w:cs="Arial"/>
-          <w:sz w:val="24"/>
-          <w:szCs w:val="24"/>
-        </w:rPr>
-      </w:pPr>
-      <w:r>
-        <w:rPr>
-          <w:rFonts w:ascii="Arial" w:hAnsi="Arial" w:cs="Arial"/>
-          <w:sz w:val="24"/>
-          <w:szCs w:val="24"/>
-        </w:rPr>
-        <w:t xml:space="preserve">Em </w:t>
-      </w:r>
-      <w:r>
-        <w:rPr>
-          <w:rFonts w:ascii="Arial" w:hAnsi="Arial" w:cs="Arial"/>
-          <w:i/>
-          <w:sz w:val="24"/>
-          <w:szCs w:val="24"/>
-        </w:rPr>
-        <w:t xml:space="preserve">Um breve histórico sobre o ensino de História no Brasil, </w:t>
-      </w:r>
-      <w:r>
-        <w:rPr>
-          <w:rFonts w:ascii="Arial" w:hAnsi="Arial" w:cs="Arial"/>
-          <w:sz w:val="24"/>
-          <w:szCs w:val="24"/>
-        </w:rPr>
-        <w:t>Adriana de Carvalho Medeiros</w:t>
-      </w:r>
-      <w:r>
-        <w:rPr>
-          <w:rFonts w:ascii="Arial" w:hAnsi="Arial" w:cs="Arial"/>
-          <w:sz w:val="24"/>
-          <w:szCs w:val="24"/>
-        </w:rPr>
-        <w:t>, expõem</w:t>
-      </w:r>
-      <w:r>
-        <w:rPr>
-          <w:rFonts w:ascii="Arial" w:hAnsi="Arial" w:cs="Arial"/>
-          <w:sz w:val="24"/>
-          <w:szCs w:val="24"/>
-        </w:rPr>
-        <w:t xml:space="preserve"> como era educação brasileira no período imperial: </w:t>
+        <w:t>os quais</w:t>
+      </w:r>
+      <w:r>
+        <w:rPr>
+          <w:rFonts w:ascii="Arial" w:hAnsi="Arial" w:cs="Arial"/>
+          <w:sz w:val="24"/>
+          <w:szCs w:val="24"/>
+        </w:rPr>
+        <w:t xml:space="preserve"> usavam a pedagogia católica para </w:t>
+      </w:r>
+      <w:r>
+        <w:rPr>
+          <w:rFonts w:ascii="Arial" w:hAnsi="Arial" w:cs="Arial"/>
+          <w:sz w:val="24"/>
+          <w:szCs w:val="24"/>
+        </w:rPr>
+        <w:t xml:space="preserve">dar o ensino primário e secundário aos colonos e catequizar os povos originários. </w:t>
+      </w:r>
+      <w:r>
+        <w:rPr>
+          <w:rFonts w:ascii="Arial" w:hAnsi="Arial" w:cs="Arial"/>
+          <w:sz w:val="24"/>
+          <w:szCs w:val="24"/>
+        </w:rPr>
+        <w:t>Des</w:t>
+      </w:r>
+      <w:r>
+        <w:rPr>
+          <w:rFonts w:ascii="Arial" w:hAnsi="Arial" w:cs="Arial"/>
+          <w:sz w:val="24"/>
+          <w:szCs w:val="24"/>
+        </w:rPr>
+        <w:t>s</w:t>
+      </w:r>
+      <w:r>
+        <w:rPr>
+          <w:rFonts w:ascii="Arial" w:hAnsi="Arial" w:cs="Arial"/>
+          <w:sz w:val="24"/>
+          <w:szCs w:val="24"/>
+        </w:rPr>
+        <w:t>e modo</w:t>
+      </w:r>
+      <w:r>
+        <w:rPr>
+          <w:rFonts w:ascii="Arial" w:hAnsi="Arial" w:cs="Arial"/>
+          <w:sz w:val="24"/>
+          <w:szCs w:val="24"/>
+        </w:rPr>
+        <w:t>, eles deram iniciativa ao processo de educar a população</w:t>
+      </w:r>
+      <w:r>
+        <w:rPr>
+          <w:rFonts w:ascii="Arial" w:hAnsi="Arial" w:cs="Arial"/>
+          <w:sz w:val="24"/>
+          <w:szCs w:val="24"/>
+        </w:rPr>
+        <w:t>,</w:t>
+      </w:r>
+      <w:r>
+        <w:rPr>
+          <w:rFonts w:ascii="Arial" w:hAnsi="Arial" w:cs="Arial"/>
+          <w:sz w:val="24"/>
+          <w:szCs w:val="24"/>
+        </w:rPr>
+        <w:t xml:space="preserve"> no entanto,</w:t>
+      </w:r>
+      <w:r>
+        <w:rPr>
+          <w:rFonts w:ascii="Arial" w:hAnsi="Arial" w:cs="Arial"/>
+          <w:sz w:val="24"/>
+          <w:szCs w:val="24"/>
+        </w:rPr>
+        <w:t xml:space="preserve"> eles tinham influência da fé cristã</w:t>
+      </w:r>
+      <w:r>
+        <w:rPr>
+          <w:rFonts w:ascii="Arial" w:hAnsi="Arial" w:cs="Arial"/>
+          <w:sz w:val="24"/>
+          <w:szCs w:val="24"/>
+        </w:rPr>
+        <w:t xml:space="preserve">, logo, o seu ensino tinha como objetivo a uniformização da fé e da consciência </w:t>
+      </w:r>
+      <w:r>
+        <w:rPr>
+          <w:rFonts w:ascii="Arial" w:hAnsi="Arial" w:cs="Arial"/>
+          <w:sz w:val="24"/>
+          <w:szCs w:val="24"/>
+        </w:rPr>
+        <w:t xml:space="preserve">que mantinha o </w:t>
+      </w:r>
+      <w:r>
+        <w:rPr>
+          <w:rFonts w:ascii="Arial" w:hAnsi="Arial" w:cs="Arial"/>
+          <w:sz w:val="24"/>
+          <w:szCs w:val="24"/>
+        </w:rPr>
+        <w:t>projeto colonial. Porém, a Companhia de Jesus entrou em desacordo</w:t>
+      </w:r>
+      <w:r>
+        <w:rPr>
+          <w:rFonts w:ascii="Arial" w:hAnsi="Arial" w:cs="Arial"/>
+          <w:sz w:val="24"/>
+          <w:szCs w:val="24"/>
+        </w:rPr>
+        <w:t>s</w:t>
+      </w:r>
+      <w:r>
+        <w:rPr>
+          <w:rFonts w:ascii="Arial" w:hAnsi="Arial" w:cs="Arial"/>
+          <w:sz w:val="24"/>
+          <w:szCs w:val="24"/>
+        </w:rPr>
+        <w:t xml:space="preserve"> com os interesses da colônia, assim, em 1759</w:t>
+      </w:r>
+      <w:r>
+        <w:rPr>
+          <w:rFonts w:ascii="Arial" w:hAnsi="Arial" w:cs="Arial"/>
+          <w:sz w:val="24"/>
+          <w:szCs w:val="24"/>
+        </w:rPr>
+        <w:t>,</w:t>
+      </w:r>
+      <w:r>
+        <w:rPr>
+          <w:rFonts w:ascii="Arial" w:hAnsi="Arial" w:cs="Arial"/>
+          <w:sz w:val="24"/>
+          <w:szCs w:val="24"/>
+        </w:rPr>
+        <w:t xml:space="preserve"> Marquês de Pombal expulsou os jesuítas, fechou suas escolas e tornou a educação laica. </w:t>
+      </w:r>
+    </w:p>
+    <w:p>
+      <w:pPr>
+        <w:spacing w:after="0" w:line="360" w:lineRule="auto"/>
+        <w:jc w:val="both"/>
+        <w:rPr>
+          <w:rFonts w:ascii="Arial" w:hAnsi="Arial" w:cs="Arial"/>
+          <w:sz w:val="24"/>
+          <w:szCs w:val="24"/>
+        </w:rPr>
+      </w:pPr>
+      <w:r>
+        <w:rPr>
+          <w:rFonts w:ascii="Arial" w:hAnsi="Arial" w:cs="Arial"/>
+          <w:sz w:val="24"/>
+          <w:szCs w:val="24"/>
+        </w:rPr>
+        <w:lastRenderedPageBreak/>
+        <w:t>Essa medida proveniente das reformas pombalinas, inicialmente, aparentou ser um considerável avanço</w:t>
+      </w:r>
+      <w:r>
+        <w:rPr>
+          <w:rFonts w:ascii="Arial" w:hAnsi="Arial" w:cs="Arial"/>
+          <w:sz w:val="24"/>
+          <w:szCs w:val="24"/>
+        </w:rPr>
+        <w:t xml:space="preserve"> visto que</w:t>
+      </w:r>
+      <w:r>
+        <w:rPr>
+          <w:rFonts w:ascii="Arial" w:hAnsi="Arial" w:cs="Arial"/>
+          <w:sz w:val="24"/>
+          <w:szCs w:val="24"/>
+        </w:rPr>
+        <w:t xml:space="preserve"> torn</w:t>
+      </w:r>
+      <w:r>
+        <w:rPr>
+          <w:rFonts w:ascii="Arial" w:hAnsi="Arial" w:cs="Arial"/>
+          <w:sz w:val="24"/>
+          <w:szCs w:val="24"/>
+        </w:rPr>
+        <w:t>ou</w:t>
+      </w:r>
+      <w:r>
+        <w:rPr>
+          <w:rFonts w:ascii="Arial" w:hAnsi="Arial" w:cs="Arial"/>
+          <w:sz w:val="24"/>
+          <w:szCs w:val="24"/>
+        </w:rPr>
+        <w:t xml:space="preserve"> o ensino laico e público, entretanto, percebeu-se que </w:t>
+      </w:r>
+      <w:r>
+        <w:rPr>
+          <w:rFonts w:ascii="Arial" w:hAnsi="Arial" w:cs="Arial"/>
+          <w:sz w:val="24"/>
+          <w:szCs w:val="24"/>
+        </w:rPr>
+        <w:t>era apenas mais uma forma de atingir os interesses da metrópole</w:t>
+      </w:r>
+      <w:r>
+        <w:rPr>
+          <w:rFonts w:ascii="Arial" w:hAnsi="Arial" w:cs="Arial"/>
+          <w:sz w:val="24"/>
+          <w:szCs w:val="24"/>
+        </w:rPr>
+        <w:t xml:space="preserve">. </w:t>
+      </w:r>
+    </w:p>
+    <w:p>
+      <w:pPr>
+        <w:spacing w:after="0" w:line="360" w:lineRule="auto"/>
+        <w:jc w:val="both"/>
+        <w:rPr>
+          <w:rFonts w:ascii="Arial" w:hAnsi="Arial" w:cs="Arial"/>
+          <w:sz w:val="24"/>
+          <w:szCs w:val="24"/>
+        </w:rPr>
+      </w:pPr>
+      <w:r>
+        <w:rPr>
+          <w:rFonts w:ascii="Arial" w:hAnsi="Arial" w:cs="Arial"/>
+          <w:sz w:val="24"/>
+          <w:szCs w:val="24"/>
+        </w:rPr>
+        <w:t>A</w:t>
+      </w:r>
+      <w:r>
+        <w:rPr>
+          <w:rFonts w:ascii="Arial" w:hAnsi="Arial" w:cs="Arial"/>
+          <w:sz w:val="24"/>
+          <w:szCs w:val="24"/>
+        </w:rPr>
+        <w:t xml:space="preserve"> educação</w:t>
+      </w:r>
+      <w:r>
+        <w:rPr>
+          <w:rFonts w:ascii="Arial" w:hAnsi="Arial" w:cs="Arial"/>
+          <w:sz w:val="24"/>
+          <w:szCs w:val="24"/>
+        </w:rPr>
+        <w:t xml:space="preserve"> não se tornou acessível e de qualidade, mas sim</w:t>
+      </w:r>
+      <w:r>
+        <w:rPr>
+          <w:rFonts w:ascii="Arial" w:hAnsi="Arial" w:cs="Arial"/>
+          <w:sz w:val="24"/>
+          <w:szCs w:val="24"/>
+        </w:rPr>
+        <w:t xml:space="preserve"> um status </w:t>
+      </w:r>
+      <w:r>
+        <w:rPr>
+          <w:rFonts w:ascii="Arial" w:hAnsi="Arial" w:cs="Arial"/>
+          <w:sz w:val="24"/>
+          <w:szCs w:val="24"/>
+        </w:rPr>
+        <w:t>social restringido</w:t>
+      </w:r>
+      <w:r>
+        <w:rPr>
+          <w:rFonts w:ascii="Arial" w:hAnsi="Arial" w:cs="Arial"/>
+          <w:sz w:val="24"/>
+          <w:szCs w:val="24"/>
+        </w:rPr>
+        <w:t xml:space="preserve"> à </w:t>
+      </w:r>
+      <w:r>
+        <w:rPr>
+          <w:rFonts w:ascii="Arial" w:hAnsi="Arial" w:cs="Arial"/>
+          <w:sz w:val="24"/>
+          <w:szCs w:val="24"/>
+        </w:rPr>
+        <w:t xml:space="preserve">elite da época. </w:t>
       </w:r>
     </w:p>
     <w:p>
@@ -1071,7 +1234,7 @@
           <w:sz w:val="20"/>
           <w:szCs w:val="20"/>
         </w:rPr>
-        <w:t xml:space="preserve">Podemos aferir que a educação brasileira ao longo deste período, pode ser identificada pelo seu caráter elitista e propedêutico, sendo as escassas escolas, atreladas ao Estado sem autonomia em relação à escolha dos </w:t>
+        <w:t>Estas reformas, cumpriam interesses do colonizador, e por isso, tendiam a cumprir uma agenda que permitia maior controle e exploração sobre a população colonial, não tendo de fato como intuito promover uma educação de amplo alcance (ao que se refere às camadas sociais, formada em sua maioria por trabalhadores escravizados, impedidos de frequentarem os bancos escolares), ou ainda, promover educação de qualidade, que tivesse como princípio a formação do homem para compreensão e transformação de sua realidade.</w:t>
       </w:r>
       <w:r>
         <w:rPr>
@@ -1079,8 +1242,7 @@
           <w:sz w:val="20"/>
           <w:szCs w:val="20"/>
         </w:rPr>
-        <w:lastRenderedPageBreak/>
-        <w:t>conteúdos. Foram ainda influenciados pelas doutrinas religiosas que formaram durante os primeiros séculos de colonização, a base da educação brasileira, devido ao monopólio jesuítico em relação à educação colonial, o que não garantiu uma emancipação do pensamento e da cultura brasileira ao que se refere à herança europeia.</w:t>
+        <w:t xml:space="preserve"> </w:t>
       </w:r>
       <w:r>
         <w:rPr>
@@ -1088,7 +1250,7 @@
           <w:sz w:val="20"/>
           <w:szCs w:val="20"/>
         </w:rPr>
-        <w:t xml:space="preserve"> (MEDEIROS, 2021, p.8)</w:t>
+        <w:t>(MEDEIROS, 2021, p.</w:t>
       </w:r>
       <w:r>
         <w:rPr>
@@ -1096,8 +1258,319 @@
           <w:sz w:val="20"/>
           <w:szCs w:val="20"/>
         </w:rPr>
-        <w:tab/>
-      </w:r>
+        <w:t>6</w:t>
+      </w:r>
+      <w:r>
+        <w:rPr>
+          <w:rFonts w:ascii="Arial" w:hAnsi="Arial" w:cs="Arial"/>
+          <w:sz w:val="20"/>
+          <w:szCs w:val="20"/>
+        </w:rPr>
+        <w:t xml:space="preserve"> | 1</w:t>
+      </w:r>
+      <w:r>
+        <w:rPr>
+          <w:rFonts w:ascii="Arial" w:hAnsi="Arial" w:cs="Arial"/>
+          <w:sz w:val="20"/>
+          <w:szCs w:val="20"/>
+        </w:rPr>
+        <w:t>69</w:t>
+      </w:r>
+      <w:r>
+        <w:rPr>
+          <w:rFonts w:ascii="Arial" w:hAnsi="Arial" w:cs="Arial"/>
+          <w:sz w:val="20"/>
+          <w:szCs w:val="20"/>
+        </w:rPr>
+        <w:t>)</w:t>
+      </w:r>
+    </w:p>
+    <w:p>
+      <w:pPr>
+        <w:spacing w:after="0" w:line="360" w:lineRule="auto"/>
+        <w:jc w:val="both"/>
+        <w:rPr>
+          <w:rFonts w:ascii="Arial" w:hAnsi="Arial" w:cs="Arial"/>
+          <w:sz w:val="24"/>
+          <w:szCs w:val="24"/>
+        </w:rPr>
+      </w:pPr>
+    </w:p>
+    <w:p>
+      <w:pPr>
+        <w:spacing w:after="0" w:line="360" w:lineRule="auto"/>
+        <w:jc w:val="both"/>
+        <w:rPr>
+          <w:rFonts w:ascii="Arial" w:hAnsi="Arial" w:cs="Arial"/>
+          <w:sz w:val="24"/>
+          <w:szCs w:val="24"/>
+        </w:rPr>
+      </w:pPr>
+      <w:r>
+        <w:rPr>
+          <w:rFonts w:ascii="Arial" w:hAnsi="Arial" w:cs="Arial"/>
+          <w:sz w:val="24"/>
+          <w:szCs w:val="24"/>
+        </w:rPr>
+        <w:t>Com a chegada da Família Real Portuguesa no Brasil, em 1808, D. João VI implementou algumas medidas para desenvolver o ensino superior na colônia, como a criação das primeiras universidades, mas o ensino básico e popular foi deixado de lado. Além disso, durante todo o período, a disciplina de História não foi inserida nos projetos de estudo</w:t>
+      </w:r>
+      <w:r>
+        <w:rPr>
+          <w:rFonts w:ascii="Arial" w:hAnsi="Arial" w:cs="Arial"/>
+          <w:sz w:val="24"/>
+          <w:szCs w:val="24"/>
+        </w:rPr>
+        <w:t xml:space="preserve">, segundo Fonseca (2011, apud </w:t>
+      </w:r>
+      <w:r>
+        <w:rPr>
+          <w:rFonts w:ascii="Arial" w:hAnsi="Arial" w:cs="Arial"/>
+          <w:sz w:val="24"/>
+          <w:szCs w:val="24"/>
+        </w:rPr>
+        <w:t>SCHNEIDER</w:t>
+      </w:r>
+      <w:r>
+        <w:rPr>
+          <w:rFonts w:ascii="Arial" w:hAnsi="Arial" w:cs="Arial"/>
+          <w:sz w:val="24"/>
+          <w:szCs w:val="24"/>
+        </w:rPr>
+        <w:t xml:space="preserve">, </w:t>
+      </w:r>
+      <w:r>
+        <w:rPr>
+          <w:rFonts w:ascii="Arial" w:hAnsi="Arial" w:cs="Arial"/>
+          <w:sz w:val="24"/>
+          <w:szCs w:val="24"/>
+        </w:rPr>
+        <w:t>LEON</w:t>
+      </w:r>
+      <w:r>
+        <w:rPr>
+          <w:rFonts w:ascii="Arial" w:hAnsi="Arial" w:cs="Arial"/>
+          <w:sz w:val="24"/>
+          <w:szCs w:val="24"/>
+        </w:rPr>
+        <w:t>, 2022, p.2) “</w:t>
+      </w:r>
+      <w:r>
+        <w:rPr>
+          <w:rFonts w:ascii="Arial" w:hAnsi="Arial" w:cs="Arial"/>
+          <w:sz w:val="24"/>
+          <w:szCs w:val="24"/>
+        </w:rPr>
+        <w:t>é após a independência que a disciplina de História ganha status no espaço escolar</w:t>
+      </w:r>
+      <w:r>
+        <w:rPr>
+          <w:rFonts w:ascii="Arial" w:hAnsi="Arial" w:cs="Arial"/>
+          <w:sz w:val="24"/>
+          <w:szCs w:val="24"/>
+        </w:rPr>
+        <w:t>”.</w:t>
+      </w:r>
+    </w:p>
+    <w:p>
+      <w:pPr>
+        <w:spacing w:after="0" w:line="360" w:lineRule="auto"/>
+        <w:jc w:val="both"/>
+        <w:rPr>
+          <w:rFonts w:ascii="Arial" w:hAnsi="Arial" w:cs="Arial"/>
+          <w:sz w:val="24"/>
+          <w:szCs w:val="24"/>
+        </w:rPr>
+      </w:pPr>
+      <w:r>
+        <w:rPr>
+          <w:rFonts w:ascii="Arial" w:hAnsi="Arial" w:cs="Arial"/>
+          <w:sz w:val="24"/>
+          <w:szCs w:val="24"/>
+        </w:rPr>
+        <w:t>Assim,</w:t>
+      </w:r>
+      <w:r>
+        <w:rPr>
+          <w:rFonts w:ascii="Arial" w:hAnsi="Arial" w:cs="Arial"/>
+          <w:sz w:val="24"/>
+          <w:szCs w:val="24"/>
+        </w:rPr>
+        <w:t xml:space="preserve"> </w:t>
+      </w:r>
+      <w:r>
+        <w:rPr>
+          <w:rFonts w:ascii="Arial" w:hAnsi="Arial" w:cs="Arial"/>
+          <w:sz w:val="24"/>
+          <w:szCs w:val="24"/>
+        </w:rPr>
+        <w:t>os momentos histórico</w:t>
+      </w:r>
+      <w:r>
+        <w:rPr>
+          <w:rFonts w:ascii="Arial" w:hAnsi="Arial" w:cs="Arial"/>
+          <w:sz w:val="24"/>
+          <w:szCs w:val="24"/>
+        </w:rPr>
+        <w:t>s</w:t>
+      </w:r>
+      <w:r>
+        <w:rPr>
+          <w:rFonts w:ascii="Arial" w:hAnsi="Arial" w:cs="Arial"/>
+          <w:sz w:val="24"/>
+          <w:szCs w:val="24"/>
+        </w:rPr>
+        <w:t xml:space="preserve"> que impactaram significativamente o ensino da História do Brasil foram o Império, a República e a Ditadura Militar,</w:t>
+      </w:r>
+      <w:r>
+        <w:rPr>
+          <w:rFonts w:ascii="Arial" w:hAnsi="Arial" w:cs="Arial"/>
+          <w:sz w:val="24"/>
+          <w:szCs w:val="24"/>
+        </w:rPr>
+        <w:t xml:space="preserve"> </w:t>
+      </w:r>
+      <w:r>
+        <w:rPr>
+          <w:rFonts w:ascii="Arial" w:hAnsi="Arial" w:cs="Arial"/>
+          <w:sz w:val="24"/>
+          <w:szCs w:val="24"/>
+        </w:rPr>
+        <w:t>pois</w:t>
+      </w:r>
+      <w:r>
+        <w:rPr>
+          <w:rFonts w:ascii="Arial" w:hAnsi="Arial" w:cs="Arial"/>
+          <w:sz w:val="24"/>
+          <w:szCs w:val="24"/>
+        </w:rPr>
+        <w:t xml:space="preserve"> foi a partir do período imperial que matéria de História começou a ser discutida nas instituições de ensino. </w:t>
+      </w:r>
+    </w:p>
+    <w:p>
+      <w:pPr>
+        <w:spacing w:after="0" w:line="360" w:lineRule="auto"/>
+        <w:jc w:val="both"/>
+        <w:rPr>
+          <w:rFonts w:ascii="Arial" w:hAnsi="Arial" w:cs="Arial"/>
+          <w:sz w:val="24"/>
+          <w:szCs w:val="24"/>
+        </w:rPr>
+      </w:pPr>
+    </w:p>
+    <w:p>
+      <w:pPr>
+        <w:spacing w:after="0" w:line="360" w:lineRule="auto"/>
+        <w:jc w:val="both"/>
+        <w:rPr>
+          <w:rFonts w:ascii="Arial" w:hAnsi="Arial" w:cs="Arial"/>
+          <w:b/>
+          <w:bCs/>
+          <w:sz w:val="24"/>
+          <w:szCs w:val="24"/>
+        </w:rPr>
+      </w:pPr>
+      <w:r>
+        <w:rPr>
+          <w:rFonts w:ascii="Arial" w:hAnsi="Arial" w:cs="Arial"/>
+          <w:b/>
+          <w:bCs/>
+          <w:sz w:val="24"/>
+          <w:szCs w:val="24"/>
+        </w:rPr>
+        <w:t>2.1 Do Império ao século XXI</w:t>
+      </w:r>
+    </w:p>
+    <w:p>
+      <w:pPr>
+        <w:spacing w:after="0" w:line="360" w:lineRule="auto"/>
+        <w:jc w:val="both"/>
+        <w:rPr>
+          <w:rFonts w:ascii="Arial" w:hAnsi="Arial" w:cs="Arial"/>
+          <w:sz w:val="24"/>
+          <w:szCs w:val="24"/>
+        </w:rPr>
+      </w:pPr>
+    </w:p>
+    <w:p>
+      <w:pPr>
+        <w:spacing w:after="0" w:line="360" w:lineRule="auto"/>
+        <w:jc w:val="both"/>
+        <w:rPr>
+          <w:rFonts w:ascii="Arial" w:hAnsi="Arial" w:cs="Arial"/>
+          <w:sz w:val="24"/>
+          <w:szCs w:val="24"/>
+        </w:rPr>
+      </w:pPr>
+      <w:r>
+        <w:rPr>
+          <w:rFonts w:ascii="Arial" w:hAnsi="Arial" w:cs="Arial"/>
+          <w:sz w:val="24"/>
+          <w:szCs w:val="24"/>
+        </w:rPr>
+        <w:t>Desde o período imperial, a</w:t>
+      </w:r>
+      <w:r>
+        <w:rPr>
+          <w:rFonts w:ascii="Arial" w:hAnsi="Arial" w:cs="Arial"/>
+          <w:sz w:val="24"/>
+          <w:szCs w:val="24"/>
+        </w:rPr>
+        <w:t xml:space="preserve"> disciplina de</w:t>
+      </w:r>
+      <w:r>
+        <w:rPr>
+          <w:rFonts w:ascii="Arial" w:hAnsi="Arial" w:cs="Arial"/>
+          <w:sz w:val="24"/>
+          <w:szCs w:val="24"/>
+        </w:rPr>
+        <w:t xml:space="preserve"> História sempre teve um papel moralizante, mas, muitas vezes essa moral era definida de acordo com os ideais e objetivos da classe dominante e do Estado. Além disso, a educação não era acessível a todos e priorizada pelas entidades reguladoras da nação. Apesar de ter ocorrido vários avanços no sistema de ensino, é possível perceber na sociedade brasileira do século XXI vestígios desse passado </w:t>
+      </w:r>
+      <w:r>
+        <w:rPr>
+          <w:rFonts w:ascii="Arial" w:hAnsi="Arial" w:cs="Arial"/>
+          <w:sz w:val="24"/>
+          <w:szCs w:val="24"/>
+        </w:rPr>
+        <w:t xml:space="preserve">histórico. </w:t>
+      </w:r>
+    </w:p>
+    <w:p>
+      <w:pPr>
+        <w:spacing w:after="0" w:line="360" w:lineRule="auto"/>
+        <w:jc w:val="both"/>
+        <w:rPr>
+          <w:rFonts w:ascii="Arial" w:hAnsi="Arial" w:cs="Arial"/>
+          <w:sz w:val="24"/>
+          <w:szCs w:val="24"/>
+        </w:rPr>
+      </w:pPr>
+      <w:r>
+        <w:rPr>
+          <w:rFonts w:ascii="Arial" w:hAnsi="Arial" w:cs="Arial"/>
+          <w:sz w:val="24"/>
+          <w:szCs w:val="24"/>
+        </w:rPr>
+        <w:t>Por isso, é necessário analisar como a educação e o ensino da História do Brasil foram construídos no decorrer do tempo. Então, começando pelo Império, Medeiros (2021) expõem:</w:t>
+      </w:r>
+      <w:r>
+        <w:rPr>
+          <w:rFonts w:ascii="Arial" w:hAnsi="Arial" w:cs="Arial"/>
+          <w:sz w:val="24"/>
+          <w:szCs w:val="24"/>
+        </w:rPr>
+        <w:t xml:space="preserve"> </w:t>
+      </w:r>
+    </w:p>
+    <w:p>
+      <w:pPr>
+        <w:spacing w:after="0" w:line="360" w:lineRule="auto"/>
+        <w:jc w:val="both"/>
+        <w:rPr>
+          <w:rFonts w:ascii="Arial" w:hAnsi="Arial" w:cs="Arial"/>
+          <w:sz w:val="24"/>
+          <w:szCs w:val="24"/>
+        </w:rPr>
+      </w:pPr>
     </w:p>
     <w:p>
       <w:pPr>
@@ -1110,27 +1583,46 @@
           <w:szCs w:val="20"/>
         </w:rPr>
       </w:pPr>
-    </w:p>
-    <w:p>
-      <w:pPr>
-        <w:spacing w:after="0" w:line="360" w:lineRule="auto"/>
-        <w:jc w:val="both"/>
-        <w:rPr>
-          <w:rFonts w:ascii="Arial" w:hAnsi="Arial" w:cs="Arial"/>
-          <w:sz w:val="24"/>
-          <w:szCs w:val="24"/>
-        </w:rPr>
-      </w:pPr>
-      <w:proofErr w:type="gramStart"/>
-      <w:r>
-        <w:rPr>
-          <w:rFonts w:ascii="Arial" w:hAnsi="Arial" w:cs="Arial"/>
-          <w:sz w:val="24"/>
-          <w:szCs w:val="24"/>
-        </w:rPr>
-        <w:t>h</w:t>
-      </w:r>
-      <w:proofErr w:type="gramEnd"/>
+      <w:r>
+        <w:rPr>
+          <w:rFonts w:ascii="Arial" w:hAnsi="Arial" w:cs="Arial"/>
+          <w:sz w:val="20"/>
+          <w:szCs w:val="20"/>
+        </w:rPr>
+        <w:t>Podemos aferir que a educação brasileira ao longo deste período, pode ser identificada pelo seu caráter elitista e propedêutico, sendo as escassas escolas, atreladas ao Estado sem autonomia em relação à escolha dos conteúdos. Foram ainda influenciados pelas doutrinas religiosas que formaram durante os primeiros séculos de colonização, a base da educação brasileira, devido ao monopólio jesuítico em relação à educação colonial, o que não garantiu uma emancipação do pensamento e da cultura brasileira ao que se refere à herança europeia.</w:t>
+      </w:r>
+      <w:r>
+        <w:rPr>
+          <w:rFonts w:ascii="Arial" w:hAnsi="Arial" w:cs="Arial"/>
+          <w:sz w:val="20"/>
+          <w:szCs w:val="20"/>
+        </w:rPr>
+        <w:t xml:space="preserve"> (MEDEIROS, 2021, p.8</w:t>
+      </w:r>
+      <w:r>
+        <w:rPr>
+          <w:rFonts w:ascii="Arial" w:hAnsi="Arial" w:cs="Arial"/>
+          <w:sz w:val="20"/>
+          <w:szCs w:val="20"/>
+        </w:rPr>
+        <w:t xml:space="preserve"> | 171</w:t>
+      </w:r>
+      <w:r>
+        <w:rPr>
+          <w:rFonts w:ascii="Arial" w:hAnsi="Arial" w:cs="Arial"/>
+          <w:sz w:val="20"/>
+          <w:szCs w:val="20"/>
+        </w:rPr>
+        <w:t>)</w:t>
+      </w:r>
+      <w:r>
+        <w:rPr>
+          <w:rFonts w:ascii="Arial" w:hAnsi="Arial" w:cs="Arial"/>
+          <w:sz w:val="20"/>
+          <w:szCs w:val="20"/>
+        </w:rPr>
+        <w:tab/>
+      </w:r>
     </w:p>
     <w:p>
       <w:pPr>
@@ -1146,6 +1638,641 @@
     </w:p>
     <w:p>
       <w:pPr>
+        <w:spacing w:after="0" w:line="360" w:lineRule="auto"/>
+        <w:jc w:val="both"/>
+        <w:rPr>
+          <w:rFonts w:ascii="Arial" w:hAnsi="Arial" w:cs="Arial"/>
+          <w:sz w:val="24"/>
+          <w:szCs w:val="24"/>
+        </w:rPr>
+      </w:pPr>
+    </w:p>
+    <w:p>
+      <w:pPr>
+        <w:spacing w:after="0" w:line="360" w:lineRule="auto"/>
+        <w:jc w:val="both"/>
+        <w:rPr>
+          <w:rFonts w:ascii="Arial" w:hAnsi="Arial" w:cs="Arial"/>
+          <w:sz w:val="24"/>
+          <w:szCs w:val="24"/>
+        </w:rPr>
+      </w:pPr>
+      <w:r>
+        <w:rPr>
+          <w:rFonts w:ascii="Arial" w:hAnsi="Arial" w:cs="Arial"/>
+          <w:sz w:val="24"/>
+          <w:szCs w:val="24"/>
+        </w:rPr>
+        <w:t>Portanto</w:t>
+      </w:r>
+      <w:r>
+        <w:rPr>
+          <w:rFonts w:ascii="Arial" w:hAnsi="Arial" w:cs="Arial"/>
+          <w:sz w:val="24"/>
+          <w:szCs w:val="24"/>
+        </w:rPr>
+        <w:t>, o ensino da História do Brasil</w:t>
+      </w:r>
+      <w:r>
+        <w:rPr>
+          <w:rFonts w:ascii="Arial" w:hAnsi="Arial" w:cs="Arial"/>
+          <w:sz w:val="24"/>
+          <w:szCs w:val="24"/>
+        </w:rPr>
+        <w:t xml:space="preserve">, introduzido pela primeira vez em 1838, no Colégio D. Pedro II, tinha como objetivo instigar o sentimento nacionalista na população por meio das figuras dos heróis nacionais e </w:t>
+      </w:r>
+      <w:r>
+        <w:rPr>
+          <w:rFonts w:ascii="Arial" w:hAnsi="Arial" w:cs="Arial"/>
+          <w:sz w:val="24"/>
+          <w:szCs w:val="24"/>
+        </w:rPr>
+        <w:t>do embelezamento dos feitos históricos.</w:t>
+      </w:r>
+      <w:r>
+        <w:rPr>
+          <w:rFonts w:ascii="Arial" w:hAnsi="Arial" w:cs="Arial"/>
+          <w:sz w:val="24"/>
+          <w:szCs w:val="24"/>
+        </w:rPr>
+        <w:t xml:space="preserve"> Mas,</w:t>
+      </w:r>
+      <w:r>
+        <w:rPr>
+          <w:rFonts w:ascii="Arial" w:hAnsi="Arial" w:cs="Arial"/>
+          <w:sz w:val="24"/>
+          <w:szCs w:val="24"/>
+        </w:rPr>
+        <w:t xml:space="preserve"> </w:t>
+      </w:r>
+      <w:r>
+        <w:rPr>
+          <w:rFonts w:ascii="Arial" w:hAnsi="Arial" w:cs="Arial"/>
+          <w:sz w:val="24"/>
+          <w:szCs w:val="24"/>
+        </w:rPr>
+        <w:t>apesar</w:t>
+      </w:r>
+      <w:r>
+        <w:rPr>
+          <w:rFonts w:ascii="Arial" w:hAnsi="Arial" w:cs="Arial"/>
+          <w:sz w:val="24"/>
+          <w:szCs w:val="24"/>
+        </w:rPr>
+        <w:t xml:space="preserve"> de auxiliar no fortalecimento da nação, a história do país era vista com</w:t>
+      </w:r>
+      <w:r>
+        <w:rPr>
+          <w:rFonts w:ascii="Arial" w:hAnsi="Arial" w:cs="Arial"/>
+          <w:sz w:val="24"/>
+          <w:szCs w:val="24"/>
+        </w:rPr>
+        <w:t xml:space="preserve"> pouca</w:t>
+      </w:r>
+      <w:r>
+        <w:rPr>
+          <w:rFonts w:ascii="Arial" w:hAnsi="Arial" w:cs="Arial"/>
+          <w:sz w:val="24"/>
+          <w:szCs w:val="24"/>
+        </w:rPr>
+        <w:t xml:space="preserve"> importância e estudada junto com a História Universal</w:t>
+      </w:r>
+      <w:r>
+        <w:rPr>
+          <w:rFonts w:ascii="Arial" w:hAnsi="Arial" w:cs="Arial"/>
+          <w:sz w:val="24"/>
+          <w:szCs w:val="24"/>
+        </w:rPr>
+        <w:t>, utilizando a metodologia francesa que favorecia o pensamento eurocêntrico.</w:t>
+      </w:r>
+    </w:p>
+    <w:p>
+      <w:pPr>
+        <w:spacing w:after="0" w:line="360" w:lineRule="auto"/>
+        <w:jc w:val="both"/>
+        <w:rPr>
+          <w:rFonts w:ascii="Arial" w:hAnsi="Arial" w:cs="Arial"/>
+          <w:sz w:val="24"/>
+          <w:szCs w:val="24"/>
+        </w:rPr>
+      </w:pPr>
+      <w:r>
+        <w:rPr>
+          <w:rFonts w:ascii="Arial" w:hAnsi="Arial" w:cs="Arial"/>
+          <w:sz w:val="24"/>
+          <w:szCs w:val="24"/>
+        </w:rPr>
+        <w:t xml:space="preserve">Após a Proclamação da República, em 1889, </w:t>
+      </w:r>
+      <w:r>
+        <w:rPr>
+          <w:rFonts w:ascii="Arial" w:hAnsi="Arial" w:cs="Arial"/>
+          <w:sz w:val="24"/>
+          <w:szCs w:val="24"/>
+        </w:rPr>
+        <w:t xml:space="preserve">o ensino da história do Brasil </w:t>
+      </w:r>
+      <w:r>
+        <w:rPr>
+          <w:rFonts w:ascii="Arial" w:hAnsi="Arial" w:cs="Arial"/>
+          <w:sz w:val="24"/>
+          <w:szCs w:val="24"/>
+        </w:rPr>
+        <w:t xml:space="preserve">foi visto como uma maneira de estimular o patriotismo e </w:t>
+      </w:r>
+      <w:r>
+        <w:rPr>
+          <w:rFonts w:ascii="Arial" w:hAnsi="Arial" w:cs="Arial"/>
+          <w:sz w:val="24"/>
+          <w:szCs w:val="24"/>
+        </w:rPr>
+        <w:t xml:space="preserve">a </w:t>
+      </w:r>
+      <w:r>
+        <w:rPr>
+          <w:rFonts w:ascii="Arial" w:hAnsi="Arial" w:cs="Arial"/>
+          <w:sz w:val="24"/>
+          <w:szCs w:val="24"/>
+        </w:rPr>
+        <w:t>consciência cívica</w:t>
+      </w:r>
+      <w:r>
+        <w:rPr>
+          <w:rFonts w:ascii="Arial" w:hAnsi="Arial" w:cs="Arial"/>
+          <w:sz w:val="24"/>
+          <w:szCs w:val="24"/>
+        </w:rPr>
+        <w:t>, por isso, alguns investimentos foram feitos, por exemplo, a História foi dividida em História Geral e História do Brasil</w:t>
+      </w:r>
+      <w:r>
+        <w:rPr>
+          <w:rFonts w:ascii="Arial" w:hAnsi="Arial" w:cs="Arial"/>
+          <w:sz w:val="24"/>
+          <w:szCs w:val="24"/>
+        </w:rPr>
+        <w:t>.</w:t>
+      </w:r>
+    </w:p>
+    <w:p>
+      <w:pPr>
+        <w:spacing w:after="0" w:line="360" w:lineRule="auto"/>
+        <w:jc w:val="both"/>
+        <w:rPr>
+          <w:rFonts w:ascii="Arial" w:hAnsi="Arial" w:cs="Arial"/>
+          <w:sz w:val="24"/>
+          <w:szCs w:val="24"/>
+        </w:rPr>
+      </w:pPr>
+    </w:p>
+    <w:p>
+      <w:pPr>
+        <w:spacing w:after="0" w:line="360" w:lineRule="auto"/>
+        <w:jc w:val="both"/>
+        <w:rPr>
+          <w:rFonts w:ascii="Arial" w:hAnsi="Arial" w:cs="Arial"/>
+          <w:b/>
+          <w:bCs/>
+          <w:sz w:val="24"/>
+          <w:szCs w:val="24"/>
+        </w:rPr>
+      </w:pPr>
+      <w:r>
+        <w:rPr>
+          <w:rFonts w:ascii="Arial" w:hAnsi="Arial" w:cs="Arial"/>
+          <w:b/>
+          <w:bCs/>
+          <w:sz w:val="24"/>
+          <w:szCs w:val="24"/>
+        </w:rPr>
+        <w:t>3.</w:t>
+      </w:r>
+      <w:r>
+        <w:rPr>
+          <w:rFonts w:ascii="Arial" w:hAnsi="Arial" w:cs="Arial"/>
+          <w:b/>
+          <w:bCs/>
+          <w:sz w:val="24"/>
+          <w:szCs w:val="24"/>
+        </w:rPr>
+        <w:t xml:space="preserve"> </w:t>
+      </w:r>
+      <w:r>
+        <w:rPr>
+          <w:rFonts w:ascii="Arial" w:hAnsi="Arial" w:cs="Arial"/>
+          <w:b/>
+          <w:bCs/>
+          <w:sz w:val="24"/>
+          <w:szCs w:val="24"/>
+        </w:rPr>
+        <w:t>COMO JOGOS DIGITAIS PODEM AUXILIAR NO ENSINO DA HISTÓRIA DO BRASIL</w:t>
+      </w:r>
+    </w:p>
+    <w:p>
+      <w:pPr>
+        <w:spacing w:after="0" w:line="360" w:lineRule="auto"/>
+        <w:jc w:val="both"/>
+        <w:rPr>
+          <w:rFonts w:ascii="Arial" w:hAnsi="Arial" w:cs="Arial"/>
+          <w:b/>
+          <w:bCs/>
+          <w:sz w:val="24"/>
+          <w:szCs w:val="24"/>
+        </w:rPr>
+      </w:pPr>
+      <w:r>
+        <w:rPr>
+          <w:rFonts w:ascii="Arial" w:hAnsi="Arial" w:cs="Arial"/>
+          <w:b/>
+          <w:bCs/>
+          <w:sz w:val="24"/>
+          <w:szCs w:val="24"/>
+        </w:rPr>
+        <w:t>3.1 Gamificação</w:t>
+      </w:r>
+    </w:p>
+    <w:p>
+      <w:pPr>
+        <w:spacing w:after="0" w:line="360" w:lineRule="auto"/>
+        <w:jc w:val="both"/>
+        <w:rPr>
+          <w:rFonts w:ascii="Arial" w:hAnsi="Arial" w:cs="Arial"/>
+          <w:b/>
+          <w:bCs/>
+          <w:sz w:val="24"/>
+          <w:szCs w:val="24"/>
+        </w:rPr>
+      </w:pPr>
+      <w:r>
+        <w:rPr>
+          <w:rFonts w:ascii="Arial" w:hAnsi="Arial" w:cs="Arial"/>
+          <w:b/>
+          <w:bCs/>
+          <w:sz w:val="24"/>
+          <w:szCs w:val="24"/>
+        </w:rPr>
+        <w:t>3.2 Serious games (Jogos Sérios)</w:t>
+      </w:r>
+    </w:p>
+    <w:p>
+      <w:pPr>
+        <w:spacing w:after="0" w:line="360" w:lineRule="auto"/>
+        <w:jc w:val="both"/>
+        <w:rPr>
+          <w:rFonts w:ascii="Arial" w:hAnsi="Arial" w:cs="Arial"/>
+          <w:b/>
+          <w:bCs/>
+          <w:sz w:val="24"/>
+          <w:szCs w:val="24"/>
+        </w:rPr>
+      </w:pPr>
+    </w:p>
+    <w:p>
+      <w:pPr>
+        <w:spacing w:after="0" w:line="360" w:lineRule="auto"/>
+        <w:jc w:val="both"/>
+        <w:rPr>
+          <w:rFonts w:ascii="Arial" w:hAnsi="Arial" w:cs="Arial"/>
+          <w:b/>
+          <w:bCs/>
+          <w:sz w:val="24"/>
+          <w:szCs w:val="24"/>
+        </w:rPr>
+      </w:pPr>
+      <w:r>
+        <w:rPr>
+          <w:rFonts w:ascii="Arial" w:hAnsi="Arial" w:cs="Arial"/>
+          <w:b/>
+          <w:bCs/>
+          <w:sz w:val="24"/>
+          <w:szCs w:val="24"/>
+        </w:rPr>
+        <w:t>4. HISTORIANDO</w:t>
+      </w:r>
+    </w:p>
+    <w:p>
+      <w:pPr>
+        <w:spacing w:after="0" w:line="360" w:lineRule="auto"/>
+        <w:jc w:val="both"/>
+        <w:rPr>
+          <w:rFonts w:ascii="Arial" w:hAnsi="Arial" w:cs="Arial"/>
+          <w:b/>
+          <w:bCs/>
+          <w:sz w:val="24"/>
+          <w:szCs w:val="24"/>
+        </w:rPr>
+      </w:pPr>
+    </w:p>
+    <w:p>
+      <w:pPr>
+        <w:spacing w:after="0" w:line="360" w:lineRule="auto"/>
+        <w:jc w:val="both"/>
+        <w:rPr>
+          <w:rFonts w:ascii="Arial" w:hAnsi="Arial" w:cs="Arial"/>
+          <w:b/>
+          <w:bCs/>
+          <w:sz w:val="24"/>
+          <w:szCs w:val="24"/>
+        </w:rPr>
+      </w:pPr>
+      <w:r>
+        <w:rPr>
+          <w:noProof/>
+        </w:rPr>
+        <w:drawing>
+          <wp:inline distT="0" distB="0" distL="0" distR="0" wp14:anchorId="17F21169" wp14:editId="7BE39370">
+            <wp:extent cx="4320000" cy="1818772"/>
+            <wp:effectExtent l="0" t="0" r="4445" b="0"/>
+            <wp:docPr id="15385014" name="Imagem 1" descr="Gráfico de respostas do Google Formulários. Título da pergunta: Você gosta de História?. Número de respostas: 75 respostas."/>
+            <wp:cNvGraphicFramePr>
+              <a:graphicFrameLocks xmlns:a="http://schemas.openxmlformats.org/drawingml/2006/main" noChangeAspect="1"/>
+            </wp:cNvGraphicFramePr>
+            <a:graphic xmlns:a="http://schemas.openxmlformats.org/drawingml/2006/main">
+              <a:graphicData uri="http://schemas.openxmlformats.org/drawingml/2006/picture">
+                <pic:pic xmlns:pic="http://schemas.openxmlformats.org/drawingml/2006/picture">
+                  <pic:nvPicPr>
+                    <pic:cNvPr id="0" name="Picture 1" descr="Gráfico de respostas do Google Formulários. Título da pergunta: Você gosta de História?. Número de respostas: 75 respostas."/>
+                    <pic:cNvPicPr>
+                      <a:picLocks noChangeAspect="1" noChangeArrowheads="1"/>
+                    </pic:cNvPicPr>
+                  </pic:nvPicPr>
+                  <pic:blipFill>
+                    <a:blip r:embed="rId7" cstate="print">
+                      <a:extLst>
+                        <a:ext uri="{28A0092B-C50C-407E-A947-70E740481C1C}">
+                          <a14:useLocalDpi xmlns:a14="http://schemas.microsoft.com/office/drawing/2010/main" val="0"/>
+                        </a:ext>
+                      </a:extLst>
+                    </a:blip>
+                    <a:srcRect/>
+                    <a:stretch>
+                      <a:fillRect/>
+                    </a:stretch>
+                  </pic:blipFill>
+                  <pic:spPr bwMode="auto">
+                    <a:xfrm>
+                      <a:off x="0" y="0"/>
+                      <a:ext cx="4320000" cy="1818772"/>
+                    </a:xfrm>
+                    <a:prstGeom prst="rect">
+                      <a:avLst/>
+                    </a:prstGeom>
+                    <a:noFill/>
+                    <a:ln>
+                      <a:noFill/>
+                    </a:ln>
+                  </pic:spPr>
+                </pic:pic>
+              </a:graphicData>
+            </a:graphic>
+          </wp:inline>
+        </w:drawing>
+      </w:r>
+    </w:p>
+    <w:p>
+      <w:pPr>
+        <w:spacing w:after="0" w:line="360" w:lineRule="auto"/>
+        <w:jc w:val="both"/>
+        <w:rPr>
+          <w:rFonts w:ascii="Arial" w:hAnsi="Arial" w:cs="Arial"/>
+          <w:b/>
+          <w:bCs/>
+          <w:sz w:val="24"/>
+          <w:szCs w:val="24"/>
+        </w:rPr>
+      </w:pPr>
+    </w:p>
+    <w:p>
+      <w:pPr>
+        <w:spacing w:after="0" w:line="360" w:lineRule="auto"/>
+        <w:jc w:val="both"/>
+        <w:rPr>
+          <w:rFonts w:ascii="Arial" w:hAnsi="Arial" w:cs="Arial"/>
+          <w:b/>
+          <w:bCs/>
+          <w:sz w:val="24"/>
+          <w:szCs w:val="24"/>
+        </w:rPr>
+      </w:pPr>
+      <w:r>
+        <w:rPr>
+          <w:noProof/>
+        </w:rPr>
+        <w:lastRenderedPageBreak/>
+        <w:drawing>
+          <wp:inline distT="0" distB="0" distL="0" distR="0" wp14:anchorId="038A34C6" wp14:editId="31C20917">
+            <wp:extent cx="4320000" cy="1818772"/>
+            <wp:effectExtent l="0" t="0" r="4445" b="0"/>
+            <wp:docPr id="430192039" name="Imagem 2" descr="Gráfico de respostas do Google Formulários. Título da pergunta: Você sente alguma dificuldade ao aprender História?. Número de respostas: 75 respostas."/>
+            <wp:cNvGraphicFramePr>
+              <a:graphicFrameLocks xmlns:a="http://schemas.openxmlformats.org/drawingml/2006/main" noChangeAspect="1"/>
+            </wp:cNvGraphicFramePr>
+            <a:graphic xmlns:a="http://schemas.openxmlformats.org/drawingml/2006/main">
+              <a:graphicData uri="http://schemas.openxmlformats.org/drawingml/2006/picture">
+                <pic:pic xmlns:pic="http://schemas.openxmlformats.org/drawingml/2006/picture">
+                  <pic:nvPicPr>
+                    <pic:cNvPr id="0" name="Picture 3" descr="Gráfico de respostas do Google Formulários. Título da pergunta: Você sente alguma dificuldade ao aprender História?. Número de respostas: 75 respostas."/>
+                    <pic:cNvPicPr>
+                      <a:picLocks noChangeAspect="1" noChangeArrowheads="1"/>
+                    </pic:cNvPicPr>
+                  </pic:nvPicPr>
+                  <pic:blipFill>
+                    <a:blip r:embed="rId8" cstate="print">
+                      <a:extLst>
+                        <a:ext uri="{28A0092B-C50C-407E-A947-70E740481C1C}">
+                          <a14:useLocalDpi xmlns:a14="http://schemas.microsoft.com/office/drawing/2010/main" val="0"/>
+                        </a:ext>
+                      </a:extLst>
+                    </a:blip>
+                    <a:srcRect/>
+                    <a:stretch>
+                      <a:fillRect/>
+                    </a:stretch>
+                  </pic:blipFill>
+                  <pic:spPr bwMode="auto">
+                    <a:xfrm>
+                      <a:off x="0" y="0"/>
+                      <a:ext cx="4320000" cy="1818772"/>
+                    </a:xfrm>
+                    <a:prstGeom prst="rect">
+                      <a:avLst/>
+                    </a:prstGeom>
+                    <a:noFill/>
+                    <a:ln>
+                      <a:noFill/>
+                    </a:ln>
+                  </pic:spPr>
+                </pic:pic>
+              </a:graphicData>
+            </a:graphic>
+          </wp:inline>
+        </w:drawing>
+      </w:r>
+    </w:p>
+    <w:p>
+      <w:pPr>
+        <w:spacing w:after="0" w:line="360" w:lineRule="auto"/>
+        <w:jc w:val="both"/>
+        <w:rPr>
+          <w:rFonts w:ascii="Arial" w:hAnsi="Arial" w:cs="Arial"/>
+          <w:b/>
+          <w:bCs/>
+          <w:sz w:val="24"/>
+          <w:szCs w:val="24"/>
+        </w:rPr>
+      </w:pPr>
+    </w:p>
+    <w:p>
+      <w:pPr>
+        <w:spacing w:after="0" w:line="360" w:lineRule="auto"/>
+        <w:jc w:val="both"/>
+        <w:rPr>
+          <w:rFonts w:ascii="Arial" w:hAnsi="Arial" w:cs="Arial"/>
+          <w:b/>
+          <w:bCs/>
+          <w:sz w:val="24"/>
+          <w:szCs w:val="24"/>
+        </w:rPr>
+      </w:pPr>
+      <w:r>
+        <w:rPr>
+          <w:noProof/>
+        </w:rPr>
+        <w:drawing>
+          <wp:inline distT="0" distB="0" distL="0" distR="0" wp14:anchorId="50975079" wp14:editId="04364A03">
+            <wp:extent cx="4320000" cy="2406932"/>
+            <wp:effectExtent l="0" t="0" r="4445" b="0"/>
+            <wp:docPr id="1413167194" name="Imagem 3" descr="Gráfico de respostas do Google Formulários. Título da pergunta: Se sim a resposta anterior, em quais aspectos?. Número de respostas: 75 respostas."/>
+            <wp:cNvGraphicFramePr>
+              <a:graphicFrameLocks xmlns:a="http://schemas.openxmlformats.org/drawingml/2006/main" noChangeAspect="1"/>
+            </wp:cNvGraphicFramePr>
+            <a:graphic xmlns:a="http://schemas.openxmlformats.org/drawingml/2006/main">
+              <a:graphicData uri="http://schemas.openxmlformats.org/drawingml/2006/picture">
+                <pic:pic xmlns:pic="http://schemas.openxmlformats.org/drawingml/2006/picture">
+                  <pic:nvPicPr>
+                    <pic:cNvPr id="0" name="Picture 5" descr="Gráfico de respostas do Google Formulários. Título da pergunta: Se sim a resposta anterior, em quais aspectos?. Número de respostas: 75 respostas."/>
+                    <pic:cNvPicPr>
+                      <a:picLocks noChangeAspect="1" noChangeArrowheads="1"/>
+                    </pic:cNvPicPr>
+                  </pic:nvPicPr>
+                  <pic:blipFill>
+                    <a:blip r:embed="rId9" cstate="print">
+                      <a:extLst>
+                        <a:ext uri="{28A0092B-C50C-407E-A947-70E740481C1C}">
+                          <a14:useLocalDpi xmlns:a14="http://schemas.microsoft.com/office/drawing/2010/main" val="0"/>
+                        </a:ext>
+                      </a:extLst>
+                    </a:blip>
+                    <a:srcRect/>
+                    <a:stretch>
+                      <a:fillRect/>
+                    </a:stretch>
+                  </pic:blipFill>
+                  <pic:spPr bwMode="auto">
+                    <a:xfrm>
+                      <a:off x="0" y="0"/>
+                      <a:ext cx="4320000" cy="2406932"/>
+                    </a:xfrm>
+                    <a:prstGeom prst="rect">
+                      <a:avLst/>
+                    </a:prstGeom>
+                    <a:noFill/>
+                    <a:ln>
+                      <a:noFill/>
+                    </a:ln>
+                  </pic:spPr>
+                </pic:pic>
+              </a:graphicData>
+            </a:graphic>
+          </wp:inline>
+        </w:drawing>
+      </w:r>
+    </w:p>
+    <w:p>
+      <w:pPr>
+        <w:spacing w:after="0" w:line="360" w:lineRule="auto"/>
+        <w:jc w:val="both"/>
+        <w:rPr>
+          <w:rFonts w:ascii="Arial" w:hAnsi="Arial" w:cs="Arial"/>
+          <w:b/>
+          <w:bCs/>
+          <w:sz w:val="24"/>
+          <w:szCs w:val="24"/>
+        </w:rPr>
+      </w:pPr>
+    </w:p>
+    <w:p>
+      <w:pPr>
+        <w:spacing w:after="0" w:line="360" w:lineRule="auto"/>
+        <w:jc w:val="both"/>
+        <w:rPr>
+          <w:rFonts w:ascii="Arial" w:hAnsi="Arial" w:cs="Arial"/>
+          <w:b/>
+          <w:bCs/>
+          <w:sz w:val="24"/>
+          <w:szCs w:val="24"/>
+        </w:rPr>
+      </w:pPr>
+    </w:p>
+    <w:p>
+      <w:pPr>
+        <w:spacing w:after="0" w:line="360" w:lineRule="auto"/>
+        <w:jc w:val="both"/>
+        <w:rPr>
+          <w:rFonts w:ascii="Arial" w:hAnsi="Arial" w:cs="Arial"/>
+          <w:b/>
+          <w:bCs/>
+          <w:sz w:val="24"/>
+          <w:szCs w:val="24"/>
+        </w:rPr>
+      </w:pPr>
+      <w:r>
+        <w:rPr>
+          <w:rFonts w:ascii="Arial" w:hAnsi="Arial" w:cs="Arial"/>
+          <w:b/>
+          <w:bCs/>
+          <w:sz w:val="24"/>
+          <w:szCs w:val="24"/>
+        </w:rPr>
+        <w:t>Considerações Finais</w:t>
+      </w:r>
+    </w:p>
+    <w:p>
+      <w:pPr>
+        <w:spacing w:after="0" w:line="360" w:lineRule="auto"/>
+        <w:jc w:val="both"/>
+        <w:rPr>
+          <w:rFonts w:ascii="Arial" w:hAnsi="Arial" w:cs="Arial"/>
+          <w:b/>
+          <w:bCs/>
+          <w:sz w:val="24"/>
+          <w:szCs w:val="24"/>
+        </w:rPr>
+      </w:pPr>
+    </w:p>
+    <w:p>
+      <w:pPr>
+        <w:spacing w:after="0" w:line="360" w:lineRule="auto"/>
+        <w:jc w:val="both"/>
+        <w:rPr>
+          <w:rFonts w:ascii="Arial" w:hAnsi="Arial" w:cs="Arial"/>
+          <w:sz w:val="24"/>
+          <w:szCs w:val="24"/>
+        </w:rPr>
+      </w:pPr>
+    </w:p>
+    <w:p>
+      <w:pPr>
+        <w:spacing w:after="0" w:line="360" w:lineRule="auto"/>
+        <w:jc w:val="both"/>
+        <w:rPr>
+          <w:rFonts w:ascii="Arial" w:hAnsi="Arial" w:cs="Arial"/>
+          <w:sz w:val="24"/>
+          <w:szCs w:val="24"/>
+        </w:rPr>
+      </w:pPr>
+    </w:p>
+    <w:p>
+      <w:pPr>
         <w:spacing w:after="0" w:line="240" w:lineRule="auto"/>
         <w:ind w:left="2268"/>
         <w:jc w:val="both"/>
@@ -1155,14 +2282,18 @@
           <w:szCs w:val="20"/>
         </w:rPr>
       </w:pPr>
-      <w:r>
+    </w:p>
+    <w:p>
+      <w:pPr>
+        <w:spacing w:after="0" w:line="240" w:lineRule="auto"/>
+        <w:ind w:left="2268"/>
+        <w:jc w:val="both"/>
         <w:rPr>
           <w:rFonts w:ascii="Arial" w:hAnsi="Arial" w:cs="Arial"/>
           <w:sz w:val="20"/>
           <w:szCs w:val="20"/>
         </w:rPr>
-        <w:tab/>
-      </w:r>
+      </w:pPr>
       <w:r>
         <w:rPr>
           <w:rFonts w:ascii="Arial" w:hAnsi="Arial" w:cs="Arial"/>
@@ -1171,342 +2302,120 @@
         </w:rPr>
         <w:tab/>
       </w:r>
-    </w:p>
-    <w:p>
-      <w:pPr>
-        <w:spacing w:after="0" w:line="360" w:lineRule="auto"/>
-        <w:jc w:val="both"/>
-        <w:rPr>
-          <w:rFonts w:ascii="Arial" w:hAnsi="Arial" w:cs="Arial"/>
-          <w:sz w:val="24"/>
-          <w:szCs w:val="24"/>
-        </w:rPr>
-      </w:pPr>
-    </w:p>
-    <w:p>
-      <w:pPr>
-        <w:spacing w:after="0" w:line="360" w:lineRule="auto"/>
-        <w:jc w:val="both"/>
-        <w:rPr>
-          <w:rFonts w:ascii="Arial" w:hAnsi="Arial" w:cs="Arial"/>
-          <w:b/>
-          <w:sz w:val="24"/>
-          <w:szCs w:val="24"/>
-        </w:rPr>
-      </w:pPr>
-    </w:p>
-    <w:p>
-      <w:pPr>
-        <w:spacing w:after="0" w:line="360" w:lineRule="auto"/>
-        <w:jc w:val="both"/>
-        <w:rPr>
-          <w:rFonts w:ascii="Arial" w:hAnsi="Arial" w:cs="Arial"/>
-          <w:b/>
-          <w:sz w:val="24"/>
-          <w:szCs w:val="24"/>
-        </w:rPr>
-      </w:pPr>
-    </w:p>
-    <w:p>
-      <w:pPr>
-        <w:spacing w:after="0" w:line="360" w:lineRule="auto"/>
-        <w:jc w:val="both"/>
-        <w:rPr>
-          <w:rFonts w:ascii="Arial" w:hAnsi="Arial" w:cs="Arial"/>
-          <w:b/>
-          <w:sz w:val="24"/>
-          <w:szCs w:val="24"/>
-        </w:rPr>
-      </w:pPr>
-    </w:p>
-    <w:p>
-      <w:pPr>
-        <w:spacing w:after="0" w:line="360" w:lineRule="auto"/>
-        <w:jc w:val="both"/>
-        <w:rPr>
-          <w:rFonts w:ascii="Arial" w:hAnsi="Arial" w:cs="Arial"/>
-          <w:b/>
-          <w:sz w:val="24"/>
-          <w:szCs w:val="24"/>
-        </w:rPr>
-      </w:pPr>
-    </w:p>
-    <w:p>
-      <w:pPr>
-        <w:spacing w:after="0" w:line="360" w:lineRule="auto"/>
-        <w:jc w:val="both"/>
-        <w:rPr>
-          <w:rFonts w:ascii="Arial" w:hAnsi="Arial" w:cs="Arial"/>
-          <w:b/>
-          <w:sz w:val="24"/>
-          <w:szCs w:val="24"/>
-        </w:rPr>
-      </w:pPr>
-    </w:p>
-    <w:p>
-      <w:pPr>
-        <w:spacing w:after="0" w:line="360" w:lineRule="auto"/>
-        <w:jc w:val="both"/>
-        <w:rPr>
-          <w:rFonts w:ascii="Arial" w:hAnsi="Arial" w:cs="Arial"/>
-          <w:b/>
-          <w:sz w:val="24"/>
-          <w:szCs w:val="24"/>
-        </w:rPr>
-      </w:pPr>
-    </w:p>
-    <w:p>
-      <w:pPr>
-        <w:spacing w:after="0" w:line="360" w:lineRule="auto"/>
-        <w:jc w:val="both"/>
-        <w:rPr>
-          <w:rFonts w:ascii="Arial" w:hAnsi="Arial" w:cs="Arial"/>
-          <w:b/>
-          <w:sz w:val="24"/>
-          <w:szCs w:val="24"/>
-        </w:rPr>
-      </w:pPr>
-    </w:p>
-    <w:p>
-      <w:pPr>
-        <w:spacing w:after="0" w:line="360" w:lineRule="auto"/>
-        <w:jc w:val="both"/>
-        <w:rPr>
-          <w:rFonts w:ascii="Arial" w:hAnsi="Arial" w:cs="Arial"/>
-          <w:b/>
-          <w:sz w:val="24"/>
-          <w:szCs w:val="24"/>
-        </w:rPr>
-      </w:pPr>
-    </w:p>
-    <w:p>
-      <w:pPr>
-        <w:spacing w:after="0" w:line="360" w:lineRule="auto"/>
-        <w:jc w:val="both"/>
-        <w:rPr>
-          <w:rFonts w:ascii="Arial" w:hAnsi="Arial" w:cs="Arial"/>
-          <w:b/>
-          <w:sz w:val="24"/>
-          <w:szCs w:val="24"/>
-        </w:rPr>
-      </w:pPr>
-    </w:p>
-    <w:p>
-      <w:pPr>
-        <w:spacing w:after="0" w:line="360" w:lineRule="auto"/>
-        <w:jc w:val="both"/>
-        <w:rPr>
-          <w:rFonts w:ascii="Arial" w:hAnsi="Arial" w:cs="Arial"/>
-          <w:b/>
-          <w:sz w:val="24"/>
-          <w:szCs w:val="24"/>
-        </w:rPr>
-      </w:pPr>
-    </w:p>
-    <w:p>
-      <w:pPr>
-        <w:spacing w:after="0" w:line="360" w:lineRule="auto"/>
-        <w:jc w:val="both"/>
-        <w:rPr>
-          <w:rFonts w:ascii="Arial" w:hAnsi="Arial" w:cs="Arial"/>
-          <w:b/>
-          <w:sz w:val="24"/>
-          <w:szCs w:val="24"/>
-        </w:rPr>
-      </w:pPr>
-    </w:p>
-    <w:p>
-      <w:pPr>
-        <w:spacing w:after="0" w:line="360" w:lineRule="auto"/>
-        <w:jc w:val="both"/>
-        <w:rPr>
-          <w:rFonts w:ascii="Arial" w:hAnsi="Arial" w:cs="Arial"/>
-          <w:b/>
-          <w:sz w:val="24"/>
-          <w:szCs w:val="24"/>
-        </w:rPr>
-      </w:pPr>
-    </w:p>
-    <w:p>
-      <w:pPr>
-        <w:spacing w:after="0" w:line="360" w:lineRule="auto"/>
-        <w:jc w:val="both"/>
-        <w:rPr>
-          <w:rFonts w:ascii="Arial" w:hAnsi="Arial" w:cs="Arial"/>
-          <w:b/>
-          <w:sz w:val="24"/>
-          <w:szCs w:val="24"/>
-        </w:rPr>
-      </w:pPr>
-    </w:p>
-    <w:p>
-      <w:pPr>
-        <w:spacing w:after="0" w:line="360" w:lineRule="auto"/>
-        <w:jc w:val="both"/>
-        <w:rPr>
-          <w:rFonts w:ascii="Arial" w:hAnsi="Arial" w:cs="Arial"/>
-          <w:b/>
-          <w:sz w:val="24"/>
-          <w:szCs w:val="24"/>
-        </w:rPr>
-      </w:pPr>
-    </w:p>
-    <w:p>
-      <w:pPr>
-        <w:spacing w:after="0" w:line="360" w:lineRule="auto"/>
-        <w:jc w:val="both"/>
-        <w:rPr>
-          <w:rFonts w:ascii="Arial" w:hAnsi="Arial" w:cs="Arial"/>
-          <w:b/>
-          <w:sz w:val="24"/>
-          <w:szCs w:val="24"/>
-        </w:rPr>
-      </w:pPr>
-    </w:p>
-    <w:p>
-      <w:pPr>
-        <w:spacing w:after="0" w:line="360" w:lineRule="auto"/>
-        <w:jc w:val="both"/>
-        <w:rPr>
-          <w:rFonts w:ascii="Arial" w:hAnsi="Arial" w:cs="Arial"/>
-          <w:b/>
-          <w:sz w:val="24"/>
-          <w:szCs w:val="24"/>
-        </w:rPr>
-      </w:pPr>
-    </w:p>
-    <w:p>
-      <w:pPr>
-        <w:spacing w:after="0" w:line="360" w:lineRule="auto"/>
-        <w:jc w:val="both"/>
-        <w:rPr>
-          <w:rFonts w:ascii="Arial" w:hAnsi="Arial" w:cs="Arial"/>
-          <w:b/>
-          <w:sz w:val="24"/>
-          <w:szCs w:val="24"/>
-        </w:rPr>
-      </w:pPr>
-    </w:p>
-    <w:p>
-      <w:pPr>
-        <w:spacing w:after="0" w:line="360" w:lineRule="auto"/>
-        <w:jc w:val="both"/>
-        <w:rPr>
-          <w:rFonts w:ascii="Arial" w:hAnsi="Arial" w:cs="Arial"/>
-          <w:b/>
-          <w:sz w:val="24"/>
-          <w:szCs w:val="24"/>
-        </w:rPr>
-      </w:pPr>
-    </w:p>
-    <w:p>
-      <w:pPr>
-        <w:spacing w:after="0" w:line="360" w:lineRule="auto"/>
-        <w:jc w:val="both"/>
-        <w:rPr>
-          <w:rFonts w:ascii="Arial" w:hAnsi="Arial" w:cs="Arial"/>
-          <w:b/>
-          <w:sz w:val="24"/>
-          <w:szCs w:val="24"/>
-        </w:rPr>
-      </w:pPr>
-    </w:p>
-    <w:p>
-      <w:pPr>
-        <w:spacing w:after="0" w:line="360" w:lineRule="auto"/>
-        <w:jc w:val="both"/>
-        <w:rPr>
-          <w:rFonts w:ascii="Arial" w:hAnsi="Arial" w:cs="Arial"/>
-          <w:b/>
-          <w:sz w:val="24"/>
-          <w:szCs w:val="24"/>
-        </w:rPr>
-      </w:pPr>
-    </w:p>
-    <w:p>
-      <w:pPr>
-        <w:spacing w:after="0" w:line="360" w:lineRule="auto"/>
-        <w:jc w:val="both"/>
-        <w:rPr>
-          <w:rFonts w:ascii="Arial" w:hAnsi="Arial" w:cs="Arial"/>
-          <w:b/>
-          <w:sz w:val="24"/>
-          <w:szCs w:val="24"/>
-        </w:rPr>
-      </w:pPr>
-    </w:p>
-    <w:p>
-      <w:pPr>
-        <w:spacing w:after="0" w:line="360" w:lineRule="auto"/>
-        <w:jc w:val="both"/>
-        <w:rPr>
-          <w:rFonts w:ascii="Arial" w:hAnsi="Arial" w:cs="Arial"/>
-          <w:b/>
-          <w:sz w:val="24"/>
-          <w:szCs w:val="24"/>
-        </w:rPr>
-      </w:pPr>
-    </w:p>
-    <w:p>
-      <w:pPr>
-        <w:spacing w:after="0" w:line="360" w:lineRule="auto"/>
-        <w:jc w:val="both"/>
-        <w:rPr>
-          <w:rFonts w:ascii="Arial" w:hAnsi="Arial" w:cs="Arial"/>
-          <w:b/>
-          <w:sz w:val="24"/>
-          <w:szCs w:val="24"/>
-        </w:rPr>
-      </w:pPr>
-    </w:p>
-    <w:p>
-      <w:pPr>
-        <w:spacing w:after="0" w:line="360" w:lineRule="auto"/>
-        <w:jc w:val="both"/>
-        <w:rPr>
-          <w:rFonts w:ascii="Arial" w:hAnsi="Arial" w:cs="Arial"/>
-          <w:b/>
-          <w:sz w:val="24"/>
-          <w:szCs w:val="24"/>
-        </w:rPr>
-      </w:pPr>
-    </w:p>
-    <w:p>
-      <w:pPr>
-        <w:spacing w:after="0" w:line="360" w:lineRule="auto"/>
-        <w:jc w:val="both"/>
-        <w:rPr>
-          <w:rFonts w:ascii="Arial" w:hAnsi="Arial" w:cs="Arial"/>
-          <w:b/>
-          <w:sz w:val="24"/>
-          <w:szCs w:val="24"/>
-        </w:rPr>
-      </w:pPr>
-    </w:p>
-    <w:p>
-      <w:pPr>
-        <w:spacing w:after="0" w:line="360" w:lineRule="auto"/>
-        <w:jc w:val="both"/>
-        <w:rPr>
-          <w:rFonts w:ascii="Arial" w:hAnsi="Arial" w:cs="Arial"/>
-          <w:b/>
-          <w:sz w:val="24"/>
-          <w:szCs w:val="24"/>
-        </w:rPr>
-      </w:pPr>
-    </w:p>
-    <w:p>
-      <w:pPr>
-        <w:spacing w:after="0" w:line="360" w:lineRule="auto"/>
-        <w:jc w:val="both"/>
-        <w:rPr>
-          <w:rFonts w:ascii="Arial" w:hAnsi="Arial" w:cs="Arial"/>
-          <w:sz w:val="24"/>
-          <w:szCs w:val="24"/>
-        </w:rPr>
-      </w:pPr>
-      <w:bookmarkStart w:id="0" w:name="_GoBack"/>
-      <w:bookmarkEnd w:id="0"/>
+      <w:r>
+        <w:rPr>
+          <w:rFonts w:ascii="Arial" w:hAnsi="Arial" w:cs="Arial"/>
+          <w:sz w:val="20"/>
+          <w:szCs w:val="20"/>
+        </w:rPr>
+        <w:tab/>
+      </w:r>
+    </w:p>
+    <w:p>
+      <w:pPr>
+        <w:spacing w:after="0" w:line="360" w:lineRule="auto"/>
+        <w:jc w:val="both"/>
+        <w:rPr>
+          <w:rFonts w:ascii="Arial" w:hAnsi="Arial" w:cs="Arial"/>
+          <w:sz w:val="24"/>
+          <w:szCs w:val="24"/>
+        </w:rPr>
+      </w:pPr>
+    </w:p>
+    <w:p>
+      <w:pPr>
+        <w:spacing w:after="0" w:line="360" w:lineRule="auto"/>
+        <w:jc w:val="both"/>
+        <w:rPr>
+          <w:rFonts w:ascii="Arial" w:hAnsi="Arial" w:cs="Arial"/>
+          <w:b/>
+          <w:sz w:val="24"/>
+          <w:szCs w:val="24"/>
+        </w:rPr>
+      </w:pPr>
+    </w:p>
+    <w:p>
+      <w:pPr>
+        <w:spacing w:after="0" w:line="360" w:lineRule="auto"/>
+        <w:jc w:val="both"/>
+        <w:rPr>
+          <w:rFonts w:ascii="Arial" w:hAnsi="Arial" w:cs="Arial"/>
+          <w:b/>
+          <w:sz w:val="24"/>
+          <w:szCs w:val="24"/>
+        </w:rPr>
+      </w:pPr>
+    </w:p>
+    <w:p>
+      <w:pPr>
+        <w:spacing w:after="0" w:line="360" w:lineRule="auto"/>
+        <w:jc w:val="both"/>
+        <w:rPr>
+          <w:rFonts w:ascii="Arial" w:hAnsi="Arial" w:cs="Arial"/>
+          <w:b/>
+          <w:sz w:val="24"/>
+          <w:szCs w:val="24"/>
+        </w:rPr>
+      </w:pPr>
+    </w:p>
+    <w:p>
+      <w:pPr>
+        <w:spacing w:after="0" w:line="360" w:lineRule="auto"/>
+        <w:jc w:val="both"/>
+        <w:rPr>
+          <w:rFonts w:ascii="Arial" w:hAnsi="Arial" w:cs="Arial"/>
+          <w:b/>
+          <w:sz w:val="24"/>
+          <w:szCs w:val="24"/>
+        </w:rPr>
+      </w:pPr>
+    </w:p>
+    <w:p>
+      <w:pPr>
+        <w:spacing w:after="0" w:line="360" w:lineRule="auto"/>
+        <w:jc w:val="both"/>
+        <w:rPr>
+          <w:rFonts w:ascii="Arial" w:hAnsi="Arial" w:cs="Arial"/>
+          <w:b/>
+          <w:sz w:val="24"/>
+          <w:szCs w:val="24"/>
+        </w:rPr>
+      </w:pPr>
+    </w:p>
+    <w:p>
+      <w:pPr>
+        <w:spacing w:after="0" w:line="360" w:lineRule="auto"/>
+        <w:jc w:val="both"/>
+        <w:rPr>
+          <w:rFonts w:ascii="Arial" w:hAnsi="Arial" w:cs="Arial"/>
+          <w:b/>
+          <w:sz w:val="24"/>
+          <w:szCs w:val="24"/>
+        </w:rPr>
+      </w:pPr>
+    </w:p>
+    <w:p>
+      <w:pPr>
+        <w:spacing w:after="0" w:line="360" w:lineRule="auto"/>
+        <w:jc w:val="both"/>
+        <w:rPr>
+          <w:rFonts w:ascii="Arial" w:hAnsi="Arial" w:cs="Arial"/>
+          <w:b/>
+          <w:sz w:val="24"/>
+          <w:szCs w:val="24"/>
+        </w:rPr>
+      </w:pPr>
+    </w:p>
+    <w:p>
+      <w:pPr>
+        <w:spacing w:after="0" w:line="360" w:lineRule="auto"/>
+        <w:jc w:val="both"/>
+        <w:rPr>
+          <w:rFonts w:ascii="Arial" w:hAnsi="Arial" w:cs="Arial"/>
+          <w:sz w:val="24"/>
+          <w:szCs w:val="24"/>
+        </w:rPr>
+      </w:pPr>
     </w:p>
     <w:p>
       <w:pPr>
@@ -1804,15 +2713,7 @@
           <w:sz w:val="24"/>
           <w:szCs w:val="24"/>
         </w:rPr>
-        <w:t xml:space="preserve"> </w:t>
-      </w:r>
-      <w:r>
-        <w:rPr>
-          <w:rFonts w:ascii="Arial" w:hAnsi="Arial" w:cs="Arial"/>
-          <w:sz w:val="24"/>
-          <w:szCs w:val="24"/>
-        </w:rPr>
-        <w:t>Acesso em: 10 set. 2026</w:t>
+        <w:t xml:space="preserve"> Acesso em: 10 set. 2026</w:t>
       </w:r>
     </w:p>
     <w:p>
@@ -1856,15 +2757,7 @@
           <w:sz w:val="24"/>
           <w:szCs w:val="24"/>
         </w:rPr>
-        <w:t xml:space="preserve">. </w:t>
-      </w:r>
-      <w:r>
-        <w:rPr>
-          <w:rFonts w:ascii="Arial" w:hAnsi="Arial" w:cs="Arial"/>
-          <w:sz w:val="24"/>
-          <w:szCs w:val="24"/>
-        </w:rPr>
-        <w:t>Acesso em: 10 set. 2026</w:t>
+        <w:t>. Acesso em: 10 set. 2026</w:t>
       </w:r>
     </w:p>
     <w:p>
@@ -1899,7 +2792,7 @@
 </file>
 
 <file path=word/endnotes.xml><?xml version="1.0" encoding="utf-8"?>
-<w:endnotes xmlns:wpc="http://schemas.microsoft.com/office/word/2010/wordprocessingCanvas" xmlns:cx="http://schemas.microsoft.com/office/drawing/2014/chartex" xmlns:mc="http://schemas.openxmlformats.org/markup-compatibility/2006" xmlns:o="urn:schemas-microsoft-com:office:office" xmlns:r="http://schemas.openxmlformats.org/officeDocument/2006/relationships" xmlns:m="http://schemas.openxmlformats.org/officeDocument/2006/math" xmlns:v="urn:schemas-microsoft-com:vml" xmlns:wp14="http://schemas.microsoft.com/office/word/2010/wordprocessingDrawing" xmlns:wp="http://schemas.openxmlformats.org/drawingml/2006/wordprocessingDrawing" xmlns:w10="urn:schemas-microsoft-com:office:word" xmlns:w="http://schemas.openxmlformats.org/wordprocessingml/2006/main" xmlns:w14="http://schemas.microsoft.com/office/word/2010/wordml" xmlns:w15="http://schemas.microsoft.com/office/word/2012/wordml" xmlns:w16se="http://schemas.microsoft.com/office/word/2015/wordml/symex" xmlns:wpg="http://schemas.microsoft.com/office/word/2010/wordprocessingGroup" xmlns:wpi="http://schemas.microsoft.com/office/word/2010/wordprocessingInk" xmlns:wne="http://schemas.microsoft.com/office/word/2006/wordml" xmlns:wps="http://schemas.microsoft.com/office/word/2010/wordprocessingShape" mc:Ignorable="w14 w15 w16se wp14">
+<w:endnotes xmlns:wpc="http://schemas.microsoft.com/office/word/2010/wordprocessingCanvas" xmlns:cx="http://schemas.microsoft.com/office/drawing/2014/chartex" xmlns:cx1="http://schemas.microsoft.com/office/drawing/2015/9/8/chartex" xmlns:cx2="http://schemas.microsoft.com/office/drawing/2015/10/21/chartex" xmlns:cx3="http://schemas.microsoft.com/office/drawing/2016/5/9/chartex" xmlns:cx4="http://schemas.microsoft.com/office/drawing/2016/5/10/chartex" xmlns:cx5="http://schemas.microsoft.com/office/drawing/2016/5/11/chartex" xmlns:cx6="http://schemas.microsoft.com/office/drawing/2016/5/12/chartex" xmlns:cx7="http://schemas.microsoft.com/office/drawing/2016/5/13/chartex" xmlns:cx8="http://schemas.microsoft.com/office/drawing/2016/5/14/chartex" xmlns:mc="http://schemas.openxmlformats.org/markup-compatibility/2006" xmlns:aink="http://schemas.microsoft.com/office/drawing/2016/ink" xmlns:am3d="http://schemas.microsoft.com/office/drawing/2017/model3d" xmlns:o="urn:schemas-microsoft-com:office:office" xmlns:oel="http://schemas.microsoft.com/office/2019/extlst" xmlns:r="http://schemas.openxmlformats.org/officeDocument/2006/relationships" xmlns:m="http://schemas.openxmlformats.org/officeDocument/2006/math" xmlns:v="urn:schemas-microsoft-com:vml" xmlns:wp14="http://schemas.microsoft.com/office/word/2010/wordprocessingDrawing" xmlns:wp="http://schemas.openxmlformats.org/drawingml/2006/wordprocessingDrawing" xmlns:w10="urn:schemas-microsoft-com:office:word" xmlns:w="http://schemas.openxmlformats.org/wordprocessingml/2006/main" xmlns:w14="http://schemas.microsoft.com/office/word/2010/wordml" xmlns:w15="http://schemas.microsoft.com/office/word/2012/wordml" xmlns:w16cex="http://schemas.microsoft.com/office/word/2018/wordml/cex" xmlns:w16cid="http://schemas.microsoft.com/office/word/2016/wordml/cid" xmlns:w16="http://schemas.microsoft.com/office/word/2018/wordml" xmlns:w16du="http://schemas.microsoft.com/office/word/2023/wordml/word16du" xmlns:w16sdtdh="http://schemas.microsoft.com/office/word/2020/wordml/sdtdatahash" xmlns:w16sdtfl="http://schemas.microsoft.com/office/word/2024/wordml/sdtformatlock" xmlns:w16se="http://schemas.microsoft.com/office/word/2015/wordml/symex" xmlns:wpg="http://schemas.microsoft.com/office/word/2010/wordprocessingGroup" xmlns:wpi="http://schemas.microsoft.com/office/word/2010/wordprocessingInk" xmlns:wne="http://schemas.microsoft.com/office/word/2006/wordml" xmlns:wps="http://schemas.microsoft.com/office/word/2010/wordprocessingShape" mc:Ignorable="w14 w15 w16se w16cid w16 w16cex w16sdtdh w16sdtfl w16du wp14">
   <w:endnote w:type="separator" w:id="-1">
     <w:p>
       <w:pPr>
@@ -1924,7 +2817,7 @@
 </file>
 
 <file path=word/footnotes.xml><?xml version="1.0" encoding="utf-8"?>
-<w:footnotes xmlns:wpc="http://schemas.microsoft.com/office/word/2010/wordprocessingCanvas" xmlns:cx="http://schemas.microsoft.com/office/drawing/2014/chartex" xmlns:mc="http://schemas.openxmlformats.org/markup-compatibility/2006" xmlns:o="urn:schemas-microsoft-com:office:office" xmlns:r="http://schemas.openxmlformats.org/officeDocument/2006/relationships" xmlns:m="http://schemas.openxmlformats.org/officeDocument/2006/math" xmlns:v="urn:schemas-microsoft-com:vml" xmlns:wp14="http://schemas.microsoft.com/office/word/2010/wordprocessingDrawing" xmlns:wp="http://schemas.openxmlformats.org/drawingml/2006/wordprocessingDrawing" xmlns:w10="urn:schemas-microsoft-com:office:word" xmlns:w="http://schemas.openxmlformats.org/wordprocessingml/2006/main" xmlns:w14="http://schemas.microsoft.com/office/word/2010/wordml" xmlns:w15="http://schemas.microsoft.com/office/word/2012/wordml" xmlns:w16se="http://schemas.microsoft.com/office/word/2015/wordml/symex" xmlns:wpg="http://schemas.microsoft.com/office/word/2010/wordprocessingGroup" xmlns:wpi="http://schemas.microsoft.com/office/word/2010/wordprocessingInk" xmlns:wne="http://schemas.microsoft.com/office/word/2006/wordml" xmlns:wps="http://schemas.microsoft.com/office/word/2010/wordprocessingShape" mc:Ignorable="w14 w15 w16se wp14">
+<w:footnotes xmlns:wpc="http://schemas.microsoft.com/office/word/2010/wordprocessingCanvas" xmlns:cx="http://schemas.microsoft.com/office/drawing/2014/chartex" xmlns:cx1="http://schemas.microsoft.com/office/drawing/2015/9/8/chartex" xmlns:cx2="http://schemas.microsoft.com/office/drawing/2015/10/21/chartex" xmlns:cx3="http://schemas.microsoft.com/office/drawing/2016/5/9/chartex" xmlns:cx4="http://schemas.microsoft.com/office/drawing/2016/5/10/chartex" xmlns:cx5="http://schemas.microsoft.com/office/drawing/2016/5/11/chartex" xmlns:cx6="http://schemas.microsoft.com/office/drawing/2016/5/12/chartex" xmlns:cx7="http://schemas.microsoft.com/office/drawing/2016/5/13/chartex" xmlns:cx8="http://schemas.microsoft.com/office/drawing/2016/5/14/chartex" xmlns:mc="http://schemas.openxmlformats.org/markup-compatibility/2006" xmlns:aink="http://schemas.microsoft.com/office/drawing/2016/ink" xmlns:am3d="http://schemas.microsoft.com/office/drawing/2017/model3d" xmlns:o="urn:schemas-microsoft-com:office:office" xmlns:oel="http://schemas.microsoft.com/office/2019/extlst" xmlns:r="http://schemas.openxmlformats.org/officeDocument/2006/relationships" xmlns:m="http://schemas.openxmlformats.org/officeDocument/2006/math" xmlns:v="urn:schemas-microsoft-com:vml" xmlns:wp14="http://schemas.microsoft.com/office/word/2010/wordprocessingDrawing" xmlns:wp="http://schemas.openxmlformats.org/drawingml/2006/wordprocessingDrawing" xmlns:w10="urn:schemas-microsoft-com:office:word" xmlns:w="http://schemas.openxmlformats.org/wordprocessingml/2006/main" xmlns:w14="http://schemas.microsoft.com/office/word/2010/wordml" xmlns:w15="http://schemas.microsoft.com/office/word/2012/wordml" xmlns:w16cex="http://schemas.microsoft.com/office/word/2018/wordml/cex" xmlns:w16cid="http://schemas.microsoft.com/office/word/2016/wordml/cid" xmlns:w16="http://schemas.microsoft.com/office/word/2018/wordml" xmlns:w16du="http://schemas.microsoft.com/office/word/2023/wordml/word16du" xmlns:w16sdtdh="http://schemas.microsoft.com/office/word/2020/wordml/sdtdatahash" xmlns:w16sdtfl="http://schemas.microsoft.com/office/word/2024/wordml/sdtformatlock" xmlns:w16se="http://schemas.microsoft.com/office/word/2015/wordml/symex" xmlns:wpg="http://schemas.microsoft.com/office/word/2010/wordprocessingGroup" xmlns:wpi="http://schemas.microsoft.com/office/word/2010/wordprocessingInk" xmlns:wne="http://schemas.microsoft.com/office/word/2006/wordml" xmlns:wps="http://schemas.microsoft.com/office/word/2010/wordprocessingShape" mc:Ignorable="w14 w15 w16se w16cid w16 w16cex w16sdtdh w16sdtfl w16du wp14">
   <w:footnote w:type="separator" w:id="-1">
     <w:p>
       <w:pPr>
@@ -1949,7 +2842,7 @@
 </file>
 
 <file path=word/styles.xml><?xml version="1.0" encoding="utf-8"?>
-<w:styles xmlns:mc="http://schemas.openxmlformats.org/markup-compatibility/2006" xmlns:r="http://schemas.openxmlformats.org/officeDocument/2006/relationships" xmlns:w="http://schemas.openxmlformats.org/wordprocessingml/2006/main" xmlns:w14="http://schemas.microsoft.com/office/word/2010/wordml" xmlns:w15="http://schemas.microsoft.com/office/word/2012/wordml" xmlns:w16se="http://schemas.microsoft.com/office/word/2015/wordml/symex" mc:Ignorable="w14 w15 w16se">
+<w:styles xmlns:mc="http://schemas.openxmlformats.org/markup-compatibility/2006" xmlns:r="http://schemas.openxmlformats.org/officeDocument/2006/relationships" xmlns:w="http://schemas.openxmlformats.org/wordprocessingml/2006/main" xmlns:w14="http://schemas.microsoft.com/office/word/2010/wordml" xmlns:w15="http://schemas.microsoft.com/office/word/2012/wordml" xmlns:w16cex="http://schemas.microsoft.com/office/word/2018/wordml/cex" xmlns:w16cid="http://schemas.microsoft.com/office/word/2016/wordml/cid" xmlns:w16="http://schemas.microsoft.com/office/word/2018/wordml" xmlns:w16du="http://schemas.microsoft.com/office/word/2023/wordml/word16du" xmlns:w16sdtdh="http://schemas.microsoft.com/office/word/2020/wordml/sdtdatahash" xmlns:w16sdtfl="http://schemas.microsoft.com/office/word/2024/wordml/sdtformatlock" xmlns:w16se="http://schemas.microsoft.com/office/word/2015/wordml/symex" mc:Ignorable="w14 w15 w16se w16cid w16 w16cex w16sdtdh w16sdtfl w16du">
   <w:docDefaults>
     <w:rPrDefault>
       <w:rPr>
@@ -1965,7 +2858,7 @@
       </w:pPr>
     </w:pPrDefault>
   </w:docDefaults>
-  <w:latentStyles w:defLockedState="0" w:defUIPriority="99" w:defSemiHidden="0" w:defUnhideWhenUsed="0" w:defQFormat="0" w:count="371">
+  <w:latentStyles w:defLockedState="0" w:defUIPriority="99" w:defSemiHidden="0" w:defUnhideWhenUsed="0" w:defQFormat="0" w:count="376">
     <w:lsdException w:name="Normal" w:uiPriority="0" w:qFormat="1"/>
     <w:lsdException w:name="heading 1" w:uiPriority="9" w:qFormat="1"/>
     <w:lsdException w:name="heading 2" w:semiHidden="1" w:uiPriority="9" w:unhideWhenUsed="1" w:qFormat="1"/>
@@ -2337,6 +3230,11 @@
     <w:lsdException w:name="List Table 5 Dark Accent 6" w:uiPriority="50"/>
     <w:lsdException w:name="List Table 6 Colorful Accent 6" w:uiPriority="51"/>
     <w:lsdException w:name="List Table 7 Colorful Accent 6" w:uiPriority="52"/>
+    <w:lsdException w:name="Mention" w:semiHidden="1" w:unhideWhenUsed="1"/>
+    <w:lsdException w:name="Smart Hyperlink" w:semiHidden="1" w:unhideWhenUsed="1"/>
+    <w:lsdException w:name="Hashtag" w:semiHidden="1" w:unhideWhenUsed="1"/>
+    <w:lsdException w:name="Unresolved Mention" w:semiHidden="1" w:unhideWhenUsed="1"/>
+    <w:lsdException w:name="Smart Link" w:semiHidden="1" w:unhideWhenUsed="1"/>
   </w:latentStyles>
   <w:style w:type="paragraph" w:default="1" w:styleId="Normal">
     <w:name w:val="Normal"/>

</xml_diff>

<commit_message>
[update] Finalizando ponto 2.1
</commit_message>
<xml_diff>
--- a/2026/trabalhos/TCC/ARTIGO_Historiando.docx
+++ b/2026/trabalhos/TCC/ARTIGO_Historiando.docx
@@ -1,6 +1,6 @@
 
 <file path=word/document.xml><?xml version="1.0" encoding="utf-8"?>
-<w:document xmlns:wpc="http://schemas.microsoft.com/office/word/2010/wordprocessingCanvas" xmlns:cx="http://schemas.microsoft.com/office/drawing/2014/chartex" xmlns:cx1="http://schemas.microsoft.com/office/drawing/2015/9/8/chartex" xmlns:cx2="http://schemas.microsoft.com/office/drawing/2015/10/21/chartex" xmlns:cx3="http://schemas.microsoft.com/office/drawing/2016/5/9/chartex" xmlns:cx4="http://schemas.microsoft.com/office/drawing/2016/5/10/chartex" xmlns:cx5="http://schemas.microsoft.com/office/drawing/2016/5/11/chartex" xmlns:cx6="http://schemas.microsoft.com/office/drawing/2016/5/12/chartex" xmlns:cx7="http://schemas.microsoft.com/office/drawing/2016/5/13/chartex" xmlns:cx8="http://schemas.microsoft.com/office/drawing/2016/5/14/chartex" xmlns:mc="http://schemas.openxmlformats.org/markup-compatibility/2006" xmlns:aink="http://schemas.microsoft.com/office/drawing/2016/ink" xmlns:am3d="http://schemas.microsoft.com/office/drawing/2017/model3d" xmlns:o="urn:schemas-microsoft-com:office:office" xmlns:oel="http://schemas.microsoft.com/office/2019/extlst" xmlns:r="http://schemas.openxmlformats.org/officeDocument/2006/relationships" xmlns:m="http://schemas.openxmlformats.org/officeDocument/2006/math" xmlns:v="urn:schemas-microsoft-com:vml" xmlns:wp14="http://schemas.microsoft.com/office/word/2010/wordprocessingDrawing" xmlns:wp="http://schemas.openxmlformats.org/drawingml/2006/wordprocessingDrawing" xmlns:w10="urn:schemas-microsoft-com:office:word" xmlns:w="http://schemas.openxmlformats.org/wordprocessingml/2006/main" xmlns:w14="http://schemas.microsoft.com/office/word/2010/wordml" xmlns:w15="http://schemas.microsoft.com/office/word/2012/wordml" xmlns:w16cex="http://schemas.microsoft.com/office/word/2018/wordml/cex" xmlns:w16cid="http://schemas.microsoft.com/office/word/2016/wordml/cid" xmlns:w16="http://schemas.microsoft.com/office/word/2018/wordml" xmlns:w16du="http://schemas.microsoft.com/office/word/2023/wordml/word16du" xmlns:w16sdtdh="http://schemas.microsoft.com/office/word/2020/wordml/sdtdatahash" xmlns:w16sdtfl="http://schemas.microsoft.com/office/word/2024/wordml/sdtformatlock" xmlns:w16se="http://schemas.microsoft.com/office/word/2015/wordml/symex" xmlns:wpg="http://schemas.microsoft.com/office/word/2010/wordprocessingGroup" xmlns:wpi="http://schemas.microsoft.com/office/word/2010/wordprocessingInk" xmlns:wne="http://schemas.microsoft.com/office/word/2006/wordml" xmlns:wps="http://schemas.microsoft.com/office/word/2010/wordprocessingShape" mc:Ignorable="w14 w15 w16se w16cid w16 w16cex w16sdtdh w16sdtfl w16du wp14">
+<w:document xmlns:wpc="http://schemas.microsoft.com/office/word/2010/wordprocessingCanvas" xmlns:cx="http://schemas.microsoft.com/office/drawing/2014/chartex" xmlns:mc="http://schemas.openxmlformats.org/markup-compatibility/2006" xmlns:o="urn:schemas-microsoft-com:office:office" xmlns:r="http://schemas.openxmlformats.org/officeDocument/2006/relationships" xmlns:m="http://schemas.openxmlformats.org/officeDocument/2006/math" xmlns:v="urn:schemas-microsoft-com:vml" xmlns:wp14="http://schemas.microsoft.com/office/word/2010/wordprocessingDrawing" xmlns:wp="http://schemas.openxmlformats.org/drawingml/2006/wordprocessingDrawing" xmlns:w10="urn:schemas-microsoft-com:office:word" xmlns:w="http://schemas.openxmlformats.org/wordprocessingml/2006/main" xmlns:w14="http://schemas.microsoft.com/office/word/2010/wordml" xmlns:w15="http://schemas.microsoft.com/office/word/2012/wordml" xmlns:w16se="http://schemas.microsoft.com/office/word/2015/wordml/symex" xmlns:wpg="http://schemas.microsoft.com/office/word/2010/wordprocessingGroup" xmlns:wpi="http://schemas.microsoft.com/office/word/2010/wordprocessingInk" xmlns:wne="http://schemas.microsoft.com/office/word/2006/wordml" xmlns:wps="http://schemas.microsoft.com/office/word/2010/wordprocessingShape" mc:Ignorable="w14 w15 w16se wp14">
   <w:body>
     <w:p>
       <w:pPr>
@@ -908,15 +908,47 @@
           <w:sz w:val="24"/>
           <w:szCs w:val="24"/>
         </w:rPr>
-        <w:t>formal era disseminada</w:t>
-      </w:r>
-      <w:r>
-        <w:rPr>
-          <w:rFonts w:ascii="Arial" w:hAnsi="Arial" w:cs="Arial"/>
-          <w:sz w:val="24"/>
-          <w:szCs w:val="24"/>
-        </w:rPr>
-        <w:t xml:space="preserve"> por meio dos jesuítas</w:t>
+        <w:t>formal foi</w:t>
+      </w:r>
+      <w:r>
+        <w:rPr>
+          <w:rFonts w:ascii="Arial" w:hAnsi="Arial" w:cs="Arial"/>
+          <w:sz w:val="24"/>
+          <w:szCs w:val="24"/>
+        </w:rPr>
+        <w:t xml:space="preserve"> disseminada</w:t>
+      </w:r>
+      <w:r>
+        <w:rPr>
+          <w:rFonts w:ascii="Arial" w:hAnsi="Arial" w:cs="Arial"/>
+          <w:sz w:val="24"/>
+          <w:szCs w:val="24"/>
+        </w:rPr>
+        <w:t xml:space="preserve"> majoritariamente</w:t>
+      </w:r>
+      <w:r>
+        <w:rPr>
+          <w:rFonts w:ascii="Arial" w:hAnsi="Arial" w:cs="Arial"/>
+          <w:sz w:val="24"/>
+          <w:szCs w:val="24"/>
+        </w:rPr>
+        <w:t xml:space="preserve"> por meio</w:t>
+      </w:r>
+      <w:r>
+        <w:rPr>
+          <w:rFonts w:ascii="Arial" w:hAnsi="Arial" w:cs="Arial"/>
+          <w:sz w:val="24"/>
+          <w:szCs w:val="24"/>
+        </w:rPr>
+        <w:t xml:space="preserve"> da atuação</w:t>
+      </w:r>
+      <w:r>
+        <w:rPr>
+          <w:rFonts w:ascii="Arial" w:hAnsi="Arial" w:cs="Arial"/>
+          <w:sz w:val="24"/>
+          <w:szCs w:val="24"/>
+        </w:rPr>
+        <w:t xml:space="preserve"> dos jesuítas</w:t>
       </w:r>
       <w:r>
         <w:rPr>
@@ -940,31 +972,202 @@
           <w:sz w:val="24"/>
           <w:szCs w:val="24"/>
         </w:rPr>
-        <w:t>os quais</w:t>
-      </w:r>
-      <w:r>
-        <w:rPr>
-          <w:rFonts w:ascii="Arial" w:hAnsi="Arial" w:cs="Arial"/>
-          <w:sz w:val="24"/>
-          <w:szCs w:val="24"/>
-        </w:rPr>
-        <w:t xml:space="preserve"> usavam a pedagogia católica para </w:t>
-      </w:r>
-      <w:r>
-        <w:rPr>
-          <w:rFonts w:ascii="Arial" w:hAnsi="Arial" w:cs="Arial"/>
-          <w:sz w:val="24"/>
-          <w:szCs w:val="24"/>
-        </w:rPr>
-        <w:t xml:space="preserve">dar o ensino primário e secundário aos colonos e catequizar os povos originários. </w:t>
-      </w:r>
-      <w:r>
-        <w:rPr>
-          <w:rFonts w:ascii="Arial" w:hAnsi="Arial" w:cs="Arial"/>
-          <w:sz w:val="24"/>
-          <w:szCs w:val="24"/>
-        </w:rPr>
-        <w:t>Des</w:t>
+        <w:t>que</w:t>
+      </w:r>
+      <w:r>
+        <w:rPr>
+          <w:rFonts w:ascii="Arial" w:hAnsi="Arial" w:cs="Arial"/>
+          <w:sz w:val="24"/>
+          <w:szCs w:val="24"/>
+        </w:rPr>
+        <w:t xml:space="preserve"> usavam </w:t>
+      </w:r>
+      <w:r>
+        <w:rPr>
+          <w:rFonts w:ascii="Arial" w:hAnsi="Arial" w:cs="Arial"/>
+          <w:sz w:val="24"/>
+          <w:szCs w:val="24"/>
+        </w:rPr>
+        <w:t>um</w:t>
+      </w:r>
+      <w:r>
+        <w:rPr>
+          <w:rFonts w:ascii="Arial" w:hAnsi="Arial" w:cs="Arial"/>
+          <w:sz w:val="24"/>
+          <w:szCs w:val="24"/>
+        </w:rPr>
+        <w:t>a pedagogia</w:t>
+      </w:r>
+      <w:r>
+        <w:rPr>
+          <w:rFonts w:ascii="Arial" w:hAnsi="Arial" w:cs="Arial"/>
+          <w:sz w:val="24"/>
+          <w:szCs w:val="24"/>
+        </w:rPr>
+        <w:t xml:space="preserve"> fundamentada na doutrina</w:t>
+      </w:r>
+      <w:r>
+        <w:rPr>
+          <w:rFonts w:ascii="Arial" w:hAnsi="Arial" w:cs="Arial"/>
+          <w:sz w:val="24"/>
+          <w:szCs w:val="24"/>
+        </w:rPr>
+        <w:t xml:space="preserve"> católica </w:t>
+      </w:r>
+      <w:r>
+        <w:rPr>
+          <w:rFonts w:ascii="Arial" w:hAnsi="Arial" w:cs="Arial"/>
+          <w:sz w:val="24"/>
+          <w:szCs w:val="24"/>
+        </w:rPr>
+        <w:t>tanto para a formação</w:t>
+      </w:r>
+      <w:r>
+        <w:rPr>
+          <w:rFonts w:ascii="Arial" w:hAnsi="Arial" w:cs="Arial"/>
+          <w:sz w:val="24"/>
+          <w:szCs w:val="24"/>
+        </w:rPr>
+        <w:t xml:space="preserve"> </w:t>
+      </w:r>
+      <w:r>
+        <w:rPr>
+          <w:rFonts w:ascii="Arial" w:hAnsi="Arial" w:cs="Arial"/>
+          <w:sz w:val="24"/>
+          <w:szCs w:val="24"/>
+        </w:rPr>
+        <w:t>primária e secundária dos colonos quanto para a catequização</w:t>
+      </w:r>
+      <w:r>
+        <w:rPr>
+          <w:rFonts w:ascii="Arial" w:hAnsi="Arial" w:cs="Arial"/>
+          <w:sz w:val="24"/>
+          <w:szCs w:val="24"/>
+        </w:rPr>
+        <w:t xml:space="preserve"> </w:t>
+      </w:r>
+      <w:r>
+        <w:rPr>
+          <w:rFonts w:ascii="Arial" w:hAnsi="Arial" w:cs="Arial"/>
+          <w:sz w:val="24"/>
+          <w:szCs w:val="24"/>
+        </w:rPr>
+        <w:t>d</w:t>
+      </w:r>
+      <w:r>
+        <w:rPr>
+          <w:rFonts w:ascii="Arial" w:hAnsi="Arial" w:cs="Arial"/>
+          <w:sz w:val="24"/>
+          <w:szCs w:val="24"/>
+        </w:rPr>
+        <w:t xml:space="preserve">os povos originários. </w:t>
+      </w:r>
+      <w:r>
+        <w:rPr>
+          <w:rFonts w:ascii="Arial" w:hAnsi="Arial" w:cs="Arial"/>
+          <w:sz w:val="24"/>
+          <w:szCs w:val="24"/>
+        </w:rPr>
+        <w:t>Assim</w:t>
+      </w:r>
+      <w:r>
+        <w:rPr>
+          <w:rFonts w:ascii="Arial" w:hAnsi="Arial" w:cs="Arial"/>
+          <w:sz w:val="24"/>
+          <w:szCs w:val="24"/>
+        </w:rPr>
+        <w:t>, eles</w:t>
+      </w:r>
+      <w:r>
+        <w:rPr>
+          <w:rFonts w:ascii="Arial" w:hAnsi="Arial" w:cs="Arial"/>
+          <w:sz w:val="24"/>
+          <w:szCs w:val="24"/>
+        </w:rPr>
+        <w:t xml:space="preserve"> foram os pioneiros no processo de educação da população, mas, devido a </w:t>
+      </w:r>
+      <w:r>
+        <w:rPr>
+          <w:rFonts w:ascii="Arial" w:hAnsi="Arial" w:cs="Arial"/>
+          <w:sz w:val="24"/>
+          <w:szCs w:val="24"/>
+        </w:rPr>
+        <w:t>influência da fé cristã</w:t>
+      </w:r>
+      <w:r>
+        <w:rPr>
+          <w:rFonts w:ascii="Arial" w:hAnsi="Arial" w:cs="Arial"/>
+          <w:sz w:val="24"/>
+          <w:szCs w:val="24"/>
+        </w:rPr>
+        <w:t xml:space="preserve">, o seu ensino tinha como </w:t>
+      </w:r>
+      <w:r>
+        <w:rPr>
+          <w:rFonts w:ascii="Arial" w:hAnsi="Arial" w:cs="Arial"/>
+          <w:sz w:val="24"/>
+          <w:szCs w:val="24"/>
+        </w:rPr>
+        <w:t>intuito</w:t>
+      </w:r>
+      <w:r>
+        <w:rPr>
+          <w:rFonts w:ascii="Arial" w:hAnsi="Arial" w:cs="Arial"/>
+          <w:sz w:val="24"/>
+          <w:szCs w:val="24"/>
+        </w:rPr>
+        <w:t xml:space="preserve"> a uniformização da fé e da consciência </w:t>
+      </w:r>
+      <w:r>
+        <w:rPr>
+          <w:rFonts w:ascii="Arial" w:hAnsi="Arial" w:cs="Arial"/>
+          <w:sz w:val="24"/>
+          <w:szCs w:val="24"/>
+        </w:rPr>
+        <w:t>para a manutenção d</w:t>
+      </w:r>
+      <w:r>
+        <w:rPr>
+          <w:rFonts w:ascii="Arial" w:hAnsi="Arial" w:cs="Arial"/>
+          <w:sz w:val="24"/>
+          <w:szCs w:val="24"/>
+        </w:rPr>
+        <w:t xml:space="preserve">o </w:t>
+      </w:r>
+      <w:r>
+        <w:rPr>
+          <w:rFonts w:ascii="Arial" w:hAnsi="Arial" w:cs="Arial"/>
+          <w:sz w:val="24"/>
+          <w:szCs w:val="24"/>
+        </w:rPr>
+        <w:t xml:space="preserve">projeto colonial. </w:t>
+      </w:r>
+    </w:p>
+    <w:p>
+      <w:pPr>
+        <w:spacing w:after="0" w:line="360" w:lineRule="auto"/>
+        <w:jc w:val="both"/>
+        <w:rPr>
+          <w:rFonts w:ascii="Arial" w:hAnsi="Arial" w:cs="Arial"/>
+          <w:sz w:val="24"/>
+          <w:szCs w:val="24"/>
+        </w:rPr>
+      </w:pPr>
+      <w:r>
+        <w:rPr>
+          <w:rFonts w:ascii="Arial" w:hAnsi="Arial" w:cs="Arial"/>
+          <w:sz w:val="24"/>
+          <w:szCs w:val="24"/>
+        </w:rPr>
+        <w:t>Em 1759</w:t>
+      </w:r>
+      <w:r>
+        <w:rPr>
+          <w:rFonts w:ascii="Arial" w:hAnsi="Arial" w:cs="Arial"/>
+          <w:sz w:val="24"/>
+          <w:szCs w:val="24"/>
+        </w:rPr>
+        <w:t>, a Companhia de Jesus entrou em desacordo</w:t>
       </w:r>
       <w:r>
         <w:rPr>
@@ -980,63 +1183,91 @@
           <w:sz w:val="24"/>
           <w:szCs w:val="24"/>
         </w:rPr>
-        <w:t>e modo</w:t>
-      </w:r>
-      <w:r>
-        <w:rPr>
-          <w:rFonts w:ascii="Arial" w:hAnsi="Arial" w:cs="Arial"/>
-          <w:sz w:val="24"/>
-          <w:szCs w:val="24"/>
-        </w:rPr>
-        <w:t>, eles deram iniciativa ao processo de educar a população</w:t>
-      </w:r>
-      <w:r>
-        <w:rPr>
-          <w:rFonts w:ascii="Arial" w:hAnsi="Arial" w:cs="Arial"/>
-          <w:sz w:val="24"/>
-          <w:szCs w:val="24"/>
-        </w:rPr>
-        <w:t>,</w:t>
-      </w:r>
-      <w:r>
-        <w:rPr>
-          <w:rFonts w:ascii="Arial" w:hAnsi="Arial" w:cs="Arial"/>
-          <w:sz w:val="24"/>
-          <w:szCs w:val="24"/>
-        </w:rPr>
-        <w:t xml:space="preserve"> no entanto,</w:t>
-      </w:r>
-      <w:r>
-        <w:rPr>
-          <w:rFonts w:ascii="Arial" w:hAnsi="Arial" w:cs="Arial"/>
-          <w:sz w:val="24"/>
-          <w:szCs w:val="24"/>
-        </w:rPr>
-        <w:t xml:space="preserve"> eles tinham influência da fé cristã</w:t>
-      </w:r>
-      <w:r>
-        <w:rPr>
-          <w:rFonts w:ascii="Arial" w:hAnsi="Arial" w:cs="Arial"/>
-          <w:sz w:val="24"/>
-          <w:szCs w:val="24"/>
-        </w:rPr>
-        <w:t xml:space="preserve">, logo, o seu ensino tinha como objetivo a uniformização da fé e da consciência </w:t>
-      </w:r>
-      <w:r>
-        <w:rPr>
-          <w:rFonts w:ascii="Arial" w:hAnsi="Arial" w:cs="Arial"/>
-          <w:sz w:val="24"/>
-          <w:szCs w:val="24"/>
-        </w:rPr>
-        <w:t xml:space="preserve">que mantinha o </w:t>
-      </w:r>
-      <w:r>
-        <w:rPr>
-          <w:rFonts w:ascii="Arial" w:hAnsi="Arial" w:cs="Arial"/>
-          <w:sz w:val="24"/>
-          <w:szCs w:val="24"/>
-        </w:rPr>
-        <w:t>projeto colonial. Porém, a Companhia de Jesus entrou em desacordo</w:t>
+        <w:t xml:space="preserve"> com os inter</w:t>
+      </w:r>
+      <w:r>
+        <w:rPr>
+          <w:rFonts w:ascii="Arial" w:hAnsi="Arial" w:cs="Arial"/>
+          <w:sz w:val="24"/>
+          <w:szCs w:val="24"/>
+        </w:rPr>
+        <w:t>esses de Portugal</w:t>
+      </w:r>
+      <w:r>
+        <w:rPr>
+          <w:rFonts w:ascii="Arial" w:hAnsi="Arial" w:cs="Arial"/>
+          <w:sz w:val="24"/>
+          <w:szCs w:val="24"/>
+        </w:rPr>
+        <w:t>, então o</w:t>
+      </w:r>
+      <w:r>
+        <w:rPr>
+          <w:rFonts w:ascii="Arial" w:hAnsi="Arial" w:cs="Arial"/>
+          <w:sz w:val="24"/>
+          <w:szCs w:val="24"/>
+        </w:rPr>
+        <w:t xml:space="preserve"> Marquês de Pombal expulsou os jesuítas</w:t>
+      </w:r>
+      <w:r>
+        <w:rPr>
+          <w:rFonts w:ascii="Arial" w:hAnsi="Arial" w:cs="Arial"/>
+          <w:sz w:val="24"/>
+          <w:szCs w:val="24"/>
+        </w:rPr>
+        <w:t xml:space="preserve"> dos territórios </w:t>
+      </w:r>
+      <w:r>
+        <w:rPr>
+          <w:rFonts w:ascii="Arial" w:hAnsi="Arial" w:cs="Arial"/>
+          <w:sz w:val="24"/>
+          <w:szCs w:val="24"/>
+        </w:rPr>
+        <w:lastRenderedPageBreak/>
+        <w:t>portugueses, incluindo o Brasil</w:t>
+      </w:r>
+      <w:r>
+        <w:rPr>
+          <w:rFonts w:ascii="Arial" w:hAnsi="Arial" w:cs="Arial"/>
+          <w:sz w:val="24"/>
+          <w:szCs w:val="24"/>
+        </w:rPr>
+        <w:t>, fechou suas e</w:t>
+      </w:r>
+      <w:r>
+        <w:rPr>
+          <w:rFonts w:ascii="Arial" w:hAnsi="Arial" w:cs="Arial"/>
+          <w:sz w:val="24"/>
+          <w:szCs w:val="24"/>
+        </w:rPr>
+        <w:t>scolas e tornou a educação responsabilidade da metrópole</w:t>
+      </w:r>
+      <w:r>
+        <w:rPr>
+          <w:rFonts w:ascii="Arial" w:hAnsi="Arial" w:cs="Arial"/>
+          <w:sz w:val="24"/>
+          <w:szCs w:val="24"/>
+        </w:rPr>
+        <w:t xml:space="preserve">. </w:t>
+      </w:r>
+    </w:p>
+    <w:p>
+      <w:pPr>
+        <w:spacing w:after="0" w:line="360" w:lineRule="auto"/>
+        <w:jc w:val="both"/>
+        <w:rPr>
+          <w:rFonts w:ascii="Arial" w:hAnsi="Arial" w:cs="Arial"/>
+          <w:sz w:val="24"/>
+          <w:szCs w:val="24"/>
+        </w:rPr>
+      </w:pPr>
+      <w:r>
+        <w:rPr>
+          <w:rFonts w:ascii="Arial" w:hAnsi="Arial" w:cs="Arial"/>
+          <w:sz w:val="24"/>
+          <w:szCs w:val="24"/>
+        </w:rPr>
+        <w:t>Essa</w:t>
       </w:r>
       <w:r>
         <w:rPr>
@@ -1052,43 +1283,55 @@
           <w:sz w:val="24"/>
           <w:szCs w:val="24"/>
         </w:rPr>
-        <w:t xml:space="preserve"> com os interesses da colônia, assim, em 1759</w:t>
-      </w:r>
-      <w:r>
-        <w:rPr>
-          <w:rFonts w:ascii="Arial" w:hAnsi="Arial" w:cs="Arial"/>
-          <w:sz w:val="24"/>
-          <w:szCs w:val="24"/>
-        </w:rPr>
-        <w:t>,</w:t>
-      </w:r>
-      <w:r>
-        <w:rPr>
-          <w:rFonts w:ascii="Arial" w:hAnsi="Arial" w:cs="Arial"/>
-          <w:sz w:val="24"/>
-          <w:szCs w:val="24"/>
-        </w:rPr>
-        <w:t xml:space="preserve"> Marquês de Pombal expulsou os jesuítas, fechou suas escolas e tornou a educação laica. </w:t>
-      </w:r>
-    </w:p>
-    <w:p>
-      <w:pPr>
-        <w:spacing w:after="0" w:line="360" w:lineRule="auto"/>
-        <w:jc w:val="both"/>
-        <w:rPr>
-          <w:rFonts w:ascii="Arial" w:hAnsi="Arial" w:cs="Arial"/>
-          <w:sz w:val="24"/>
-          <w:szCs w:val="24"/>
-        </w:rPr>
-      </w:pPr>
-      <w:r>
-        <w:rPr>
-          <w:rFonts w:ascii="Arial" w:hAnsi="Arial" w:cs="Arial"/>
-          <w:sz w:val="24"/>
-          <w:szCs w:val="24"/>
-        </w:rPr>
-        <w:lastRenderedPageBreak/>
-        <w:t>Essa medida proveniente das reformas pombalinas, inicialmente, aparentou ser um considerável avanço</w:t>
+        <w:t xml:space="preserve"> medida</w:t>
+      </w:r>
+      <w:r>
+        <w:rPr>
+          <w:rFonts w:ascii="Arial" w:hAnsi="Arial" w:cs="Arial"/>
+          <w:sz w:val="24"/>
+          <w:szCs w:val="24"/>
+        </w:rPr>
+        <w:t>s</w:t>
+      </w:r>
+      <w:r>
+        <w:rPr>
+          <w:rFonts w:ascii="Arial" w:hAnsi="Arial" w:cs="Arial"/>
+          <w:sz w:val="24"/>
+          <w:szCs w:val="24"/>
+        </w:rPr>
+        <w:t xml:space="preserve"> proveniente</w:t>
+      </w:r>
+      <w:r>
+        <w:rPr>
+          <w:rFonts w:ascii="Arial" w:hAnsi="Arial" w:cs="Arial"/>
+          <w:sz w:val="24"/>
+          <w:szCs w:val="24"/>
+        </w:rPr>
+        <w:t>s</w:t>
+      </w:r>
+      <w:r>
+        <w:rPr>
+          <w:rFonts w:ascii="Arial" w:hAnsi="Arial" w:cs="Arial"/>
+          <w:sz w:val="24"/>
+          <w:szCs w:val="24"/>
+        </w:rPr>
+        <w:t xml:space="preserve"> das reformas pom</w:t>
+      </w:r>
+      <w:r>
+        <w:rPr>
+          <w:rFonts w:ascii="Arial" w:hAnsi="Arial" w:cs="Arial"/>
+          <w:sz w:val="24"/>
+          <w:szCs w:val="24"/>
+        </w:rPr>
+        <w:t>balinas, inicialmente, aparentaram</w:t>
+      </w:r>
+      <w:r>
+        <w:rPr>
+          <w:rFonts w:ascii="Arial" w:hAnsi="Arial" w:cs="Arial"/>
+          <w:sz w:val="24"/>
+          <w:szCs w:val="24"/>
+        </w:rPr>
+        <w:t xml:space="preserve"> ser um considerável avanço</w:t>
       </w:r>
       <w:r>
         <w:rPr>
@@ -1104,31 +1347,39 @@
           <w:sz w:val="24"/>
           <w:szCs w:val="24"/>
         </w:rPr>
-        <w:t xml:space="preserve"> torn</w:t>
-      </w:r>
-      <w:r>
-        <w:rPr>
-          <w:rFonts w:ascii="Arial" w:hAnsi="Arial" w:cs="Arial"/>
-          <w:sz w:val="24"/>
-          <w:szCs w:val="24"/>
-        </w:rPr>
-        <w:t>ou</w:t>
-      </w:r>
-      <w:r>
-        <w:rPr>
-          <w:rFonts w:ascii="Arial" w:hAnsi="Arial" w:cs="Arial"/>
-          <w:sz w:val="24"/>
-          <w:szCs w:val="24"/>
-        </w:rPr>
-        <w:t xml:space="preserve"> o ensino laico e público, entretanto, percebeu-se que </w:t>
-      </w:r>
-      <w:r>
-        <w:rPr>
-          <w:rFonts w:ascii="Arial" w:hAnsi="Arial" w:cs="Arial"/>
-          <w:sz w:val="24"/>
-          <w:szCs w:val="24"/>
-        </w:rPr>
-        <w:t>era apenas mais uma forma de atingir os interesses da metrópole</w:t>
+        <w:t xml:space="preserve"> </w:t>
+      </w:r>
+      <w:r>
+        <w:rPr>
+          <w:rFonts w:ascii="Arial" w:hAnsi="Arial" w:cs="Arial"/>
+          <w:sz w:val="24"/>
+          <w:szCs w:val="24"/>
+        </w:rPr>
+        <w:t>tirou o ensino do monopólio jesuíta</w:t>
+      </w:r>
+      <w:r>
+        <w:rPr>
+          <w:rFonts w:ascii="Arial" w:hAnsi="Arial" w:cs="Arial"/>
+          <w:sz w:val="24"/>
+          <w:szCs w:val="24"/>
+        </w:rPr>
+        <w:t xml:space="preserve">, entretanto, percebeu-se que </w:t>
+      </w:r>
+      <w:r>
+        <w:rPr>
+          <w:rFonts w:ascii="Arial" w:hAnsi="Arial" w:cs="Arial"/>
+          <w:sz w:val="24"/>
+          <w:szCs w:val="24"/>
+        </w:rPr>
+        <w:t>era apenas mais uma forma de at</w:t>
+      </w:r>
+      <w:r>
+        <w:rPr>
+          <w:rFonts w:ascii="Arial" w:hAnsi="Arial" w:cs="Arial"/>
+          <w:sz w:val="24"/>
+          <w:szCs w:val="24"/>
+        </w:rPr>
+        <w:t>ingir os interesses da Coroa Portuguesa</w:t>
       </w:r>
       <w:r>
         <w:rPr>
@@ -1234,7 +1485,7 @@
           <w:sz w:val="20"/>
           <w:szCs w:val="20"/>
         </w:rPr>
-        <w:t>Estas reformas, cumpriam interesses do colonizador, e por isso, tendiam a cumprir uma agenda que permitia maior controle e exploração sobre a população colonial, não tendo de fato como intuito promover uma educação de amplo alcance (ao que se refere às camadas sociais, formada em sua maioria por trabalhadores escravizados, impedidos de frequentarem os bancos escolares), ou ainda, promover educação de qualidade, que tivesse como princípio a formação do homem para compreensão e transformação de sua realidade.</w:t>
+        <w:t xml:space="preserve">Estas reformas, cumpriam interesses do colonizador, e por isso, tendiam a cumprir uma agenda que permitia maior controle e exploração sobre a população colonial, não tendo de fato como intuito promover uma educação de amplo alcance (ao que se refere às camadas sociais, formada em sua maioria por trabalhadores escravizados, impedidos de frequentarem os bancos escolares), ou ainda, promover educação de qualidade, que tivesse como princípio a formação do homem para compreensão e transformação de sua realidade. </w:t>
       </w:r>
       <w:r>
         <w:rPr>
@@ -1242,23 +1493,363 @@
           <w:sz w:val="20"/>
           <w:szCs w:val="20"/>
         </w:rPr>
+        <w:t>(MEDEIROS, 2021, p.6 | 169)</w:t>
+      </w:r>
+    </w:p>
+    <w:p>
+      <w:pPr>
+        <w:spacing w:after="0" w:line="360" w:lineRule="auto"/>
+        <w:jc w:val="both"/>
+        <w:rPr>
+          <w:rFonts w:ascii="Arial" w:hAnsi="Arial" w:cs="Arial"/>
+          <w:sz w:val="24"/>
+          <w:szCs w:val="24"/>
+        </w:rPr>
+      </w:pPr>
+    </w:p>
+    <w:p>
+      <w:pPr>
+        <w:spacing w:after="0" w:line="360" w:lineRule="auto"/>
+        <w:jc w:val="both"/>
+        <w:rPr>
+          <w:rFonts w:ascii="Arial" w:hAnsi="Arial" w:cs="Arial"/>
+          <w:sz w:val="24"/>
+          <w:szCs w:val="24"/>
+        </w:rPr>
+      </w:pPr>
+      <w:r>
+        <w:rPr>
+          <w:rFonts w:ascii="Arial" w:hAnsi="Arial" w:cs="Arial"/>
+          <w:sz w:val="24"/>
+          <w:szCs w:val="24"/>
+        </w:rPr>
+        <w:t>Com a chegada da Família Real Portuguesa no Brasil, em 1808, D. João VI implementou algumas medidas para desenvolver o ensino superior na colônia, como a cri</w:t>
+      </w:r>
+      <w:r>
+        <w:rPr>
+          <w:rFonts w:ascii="Arial" w:hAnsi="Arial" w:cs="Arial"/>
+          <w:sz w:val="24"/>
+          <w:szCs w:val="24"/>
+        </w:rPr>
+        <w:t>ação das primeiras instituições de ensino superior</w:t>
+      </w:r>
+      <w:r>
+        <w:rPr>
+          <w:rFonts w:ascii="Arial" w:hAnsi="Arial" w:cs="Arial"/>
+          <w:sz w:val="24"/>
+          <w:szCs w:val="24"/>
+        </w:rPr>
+        <w:t>, mas o ensino básico e popular foi deixado de lado. Além disso, durante todo o período</w:t>
+      </w:r>
+      <w:r>
+        <w:rPr>
+          <w:rFonts w:ascii="Arial" w:hAnsi="Arial" w:cs="Arial"/>
+          <w:sz w:val="24"/>
+          <w:szCs w:val="24"/>
+        </w:rPr>
+        <w:t xml:space="preserve"> colonial</w:t>
+      </w:r>
+      <w:r>
+        <w:rPr>
+          <w:rFonts w:ascii="Arial" w:hAnsi="Arial" w:cs="Arial"/>
+          <w:sz w:val="24"/>
+          <w:szCs w:val="24"/>
+        </w:rPr>
+        <w:t>, a disciplina de História nã</w:t>
+      </w:r>
+      <w:r>
+        <w:rPr>
+          <w:rFonts w:ascii="Arial" w:hAnsi="Arial" w:cs="Arial"/>
+          <w:sz w:val="24"/>
+          <w:szCs w:val="24"/>
+        </w:rPr>
+        <w:t>o foi considerada</w:t>
+      </w:r>
+      <w:r>
+        <w:rPr>
+          <w:rFonts w:ascii="Arial" w:hAnsi="Arial" w:cs="Arial"/>
+          <w:sz w:val="24"/>
+          <w:szCs w:val="24"/>
+        </w:rPr>
+        <w:t xml:space="preserve"> nos projetos de estudo</w:t>
+      </w:r>
+      <w:r>
+        <w:rPr>
+          <w:rFonts w:ascii="Arial" w:hAnsi="Arial" w:cs="Arial"/>
+          <w:sz w:val="24"/>
+          <w:szCs w:val="24"/>
+        </w:rPr>
+        <w:t xml:space="preserve">, segundo Fonseca (2011, apud </w:t>
+      </w:r>
+      <w:r>
+        <w:rPr>
+          <w:rFonts w:ascii="Arial" w:hAnsi="Arial" w:cs="Arial"/>
+          <w:sz w:val="24"/>
+          <w:szCs w:val="24"/>
+        </w:rPr>
+        <w:t>SCHNEIDER</w:t>
+      </w:r>
+      <w:r>
+        <w:rPr>
+          <w:rFonts w:ascii="Arial" w:hAnsi="Arial" w:cs="Arial"/>
+          <w:sz w:val="24"/>
+          <w:szCs w:val="24"/>
+        </w:rPr>
+        <w:t xml:space="preserve">, </w:t>
+      </w:r>
+      <w:r>
+        <w:rPr>
+          <w:rFonts w:ascii="Arial" w:hAnsi="Arial" w:cs="Arial"/>
+          <w:sz w:val="24"/>
+          <w:szCs w:val="24"/>
+        </w:rPr>
+        <w:t>LEON</w:t>
+      </w:r>
+      <w:r>
+        <w:rPr>
+          <w:rFonts w:ascii="Arial" w:hAnsi="Arial" w:cs="Arial"/>
+          <w:sz w:val="24"/>
+          <w:szCs w:val="24"/>
+        </w:rPr>
+        <w:t>, 2022, p.2) “</w:t>
+      </w:r>
+      <w:r>
+        <w:rPr>
+          <w:rFonts w:ascii="Arial" w:hAnsi="Arial" w:cs="Arial"/>
+          <w:sz w:val="24"/>
+          <w:szCs w:val="24"/>
+        </w:rPr>
+        <w:t>é após a independência que a disciplina de História ganha status no espaço escolar</w:t>
+      </w:r>
+      <w:r>
+        <w:rPr>
+          <w:rFonts w:ascii="Arial" w:hAnsi="Arial" w:cs="Arial"/>
+          <w:sz w:val="24"/>
+          <w:szCs w:val="24"/>
+        </w:rPr>
+        <w:t>”.</w:t>
+      </w:r>
+    </w:p>
+    <w:p>
+      <w:pPr>
+        <w:spacing w:after="0" w:line="360" w:lineRule="auto"/>
+        <w:jc w:val="both"/>
+        <w:rPr>
+          <w:rFonts w:ascii="Arial" w:hAnsi="Arial" w:cs="Arial"/>
+          <w:sz w:val="24"/>
+          <w:szCs w:val="24"/>
+        </w:rPr>
+      </w:pPr>
+      <w:r>
+        <w:rPr>
+          <w:rFonts w:ascii="Arial" w:hAnsi="Arial" w:cs="Arial"/>
+          <w:sz w:val="24"/>
+          <w:szCs w:val="24"/>
+        </w:rPr>
+        <w:t>Assim, os momentos histórico</w:t>
+      </w:r>
+      <w:r>
+        <w:rPr>
+          <w:rFonts w:ascii="Arial" w:hAnsi="Arial" w:cs="Arial"/>
+          <w:sz w:val="24"/>
+          <w:szCs w:val="24"/>
+        </w:rPr>
+        <w:t>s</w:t>
+      </w:r>
+      <w:r>
+        <w:rPr>
+          <w:rFonts w:ascii="Arial" w:hAnsi="Arial" w:cs="Arial"/>
+          <w:sz w:val="24"/>
+          <w:szCs w:val="24"/>
+        </w:rPr>
+        <w:t xml:space="preserve"> que impactaram significativamente o ensino da História do Brasil foram o Império, a República e a Ditadura Militar, </w:t>
+      </w:r>
+      <w:r>
+        <w:rPr>
+          <w:rFonts w:ascii="Arial" w:hAnsi="Arial" w:cs="Arial"/>
+          <w:sz w:val="24"/>
+          <w:szCs w:val="24"/>
+        </w:rPr>
+        <w:t>pois</w:t>
+      </w:r>
+      <w:r>
+        <w:rPr>
+          <w:rFonts w:ascii="Arial" w:hAnsi="Arial" w:cs="Arial"/>
+          <w:sz w:val="24"/>
+          <w:szCs w:val="24"/>
+        </w:rPr>
+        <w:t xml:space="preserve"> foi a partir do período imperial que matéria de História começou a ser discutida nas instituições de ensino. </w:t>
+      </w:r>
+    </w:p>
+    <w:p>
+      <w:pPr>
+        <w:spacing w:after="0" w:line="360" w:lineRule="auto"/>
+        <w:jc w:val="both"/>
+        <w:rPr>
+          <w:rFonts w:ascii="Arial" w:hAnsi="Arial" w:cs="Arial"/>
+          <w:sz w:val="24"/>
+          <w:szCs w:val="24"/>
+        </w:rPr>
+      </w:pPr>
+    </w:p>
+    <w:p>
+      <w:pPr>
+        <w:spacing w:after="0" w:line="360" w:lineRule="auto"/>
+        <w:jc w:val="both"/>
+        <w:rPr>
+          <w:rFonts w:ascii="Arial" w:hAnsi="Arial" w:cs="Arial"/>
+          <w:b/>
+          <w:bCs/>
+          <w:sz w:val="24"/>
+          <w:szCs w:val="24"/>
+        </w:rPr>
+      </w:pPr>
+      <w:r>
+        <w:rPr>
+          <w:rFonts w:ascii="Arial" w:hAnsi="Arial" w:cs="Arial"/>
+          <w:b/>
+          <w:bCs/>
+          <w:sz w:val="24"/>
+          <w:szCs w:val="24"/>
+        </w:rPr>
+        <w:t>2.1 Do Império ao século XXI</w:t>
+      </w:r>
+    </w:p>
+    <w:p>
+      <w:pPr>
+        <w:spacing w:after="0" w:line="360" w:lineRule="auto"/>
+        <w:jc w:val="both"/>
+        <w:rPr>
+          <w:rFonts w:ascii="Arial" w:hAnsi="Arial" w:cs="Arial"/>
+          <w:sz w:val="24"/>
+          <w:szCs w:val="24"/>
+        </w:rPr>
+      </w:pPr>
+    </w:p>
+    <w:p>
+      <w:pPr>
+        <w:spacing w:after="0" w:line="360" w:lineRule="auto"/>
+        <w:jc w:val="both"/>
+        <w:rPr>
+          <w:rFonts w:ascii="Arial" w:hAnsi="Arial" w:cs="Arial"/>
+          <w:sz w:val="24"/>
+          <w:szCs w:val="24"/>
+        </w:rPr>
+      </w:pPr>
+      <w:r>
+        <w:rPr>
+          <w:rFonts w:ascii="Arial" w:hAnsi="Arial" w:cs="Arial"/>
+          <w:sz w:val="24"/>
+          <w:szCs w:val="24"/>
+        </w:rPr>
+        <w:t>Desde o período imperial, a</w:t>
+      </w:r>
+      <w:r>
+        <w:rPr>
+          <w:rFonts w:ascii="Arial" w:hAnsi="Arial" w:cs="Arial"/>
+          <w:sz w:val="24"/>
+          <w:szCs w:val="24"/>
+        </w:rPr>
+        <w:t xml:space="preserve"> disciplina de</w:t>
+      </w:r>
+      <w:r>
+        <w:rPr>
+          <w:rFonts w:ascii="Arial" w:hAnsi="Arial" w:cs="Arial"/>
+          <w:sz w:val="24"/>
+          <w:szCs w:val="24"/>
+        </w:rPr>
+        <w:t xml:space="preserve"> História sempre teve um papel moralizante, mas, muitas vezes essa moral era definida de acordo com os ideais e objetivos da classe dominante e do Estado. Além disso, a educ</w:t>
+      </w:r>
+      <w:r>
+        <w:rPr>
+          <w:rFonts w:ascii="Arial" w:hAnsi="Arial" w:cs="Arial"/>
+          <w:sz w:val="24"/>
+          <w:szCs w:val="24"/>
+        </w:rPr>
+        <w:t>ação não era acessível a todos nem</w:t>
+      </w:r>
+      <w:r>
+        <w:rPr>
+          <w:rFonts w:ascii="Arial" w:hAnsi="Arial" w:cs="Arial"/>
+          <w:sz w:val="24"/>
+          <w:szCs w:val="24"/>
+        </w:rPr>
+        <w:t xml:space="preserve"> priorizada pelas entidades reguladoras da nação. Apesar de ter ocorrido vários </w:t>
+      </w:r>
+      <w:r>
+        <w:rPr>
+          <w:rFonts w:ascii="Arial" w:hAnsi="Arial" w:cs="Arial"/>
+          <w:sz w:val="24"/>
+          <w:szCs w:val="24"/>
+        </w:rPr>
+        <w:lastRenderedPageBreak/>
+        <w:t xml:space="preserve">avanços no sistema de ensino, é possível perceber na sociedade brasileira do século XXI vestígios desse passado </w:t>
+      </w:r>
+      <w:r>
+        <w:rPr>
+          <w:rFonts w:ascii="Arial" w:hAnsi="Arial" w:cs="Arial"/>
+          <w:sz w:val="24"/>
+          <w:szCs w:val="24"/>
+        </w:rPr>
+        <w:t xml:space="preserve">histórico. </w:t>
+      </w:r>
+    </w:p>
+    <w:p>
+      <w:pPr>
+        <w:spacing w:after="0" w:line="360" w:lineRule="auto"/>
+        <w:jc w:val="both"/>
+        <w:rPr>
+          <w:rFonts w:ascii="Arial" w:hAnsi="Arial" w:cs="Arial"/>
+          <w:sz w:val="24"/>
+          <w:szCs w:val="24"/>
+        </w:rPr>
+      </w:pPr>
+      <w:r>
+        <w:rPr>
+          <w:rFonts w:ascii="Arial" w:hAnsi="Arial" w:cs="Arial"/>
+          <w:sz w:val="24"/>
+          <w:szCs w:val="24"/>
+        </w:rPr>
+        <w:t>Por isso, é necessário analisar como a educação e o ensino da História do Brasil foram construídos no decorrer do tempo. Então, começando pelo Império, Medeiros (2021) expõem:</w:t>
+      </w:r>
+      <w:r>
+        <w:rPr>
+          <w:rFonts w:ascii="Arial" w:hAnsi="Arial" w:cs="Arial"/>
+          <w:sz w:val="24"/>
+          <w:szCs w:val="24"/>
+        </w:rPr>
         <w:t xml:space="preserve"> </w:t>
       </w:r>
-      <w:r>
+    </w:p>
+    <w:p>
+      <w:pPr>
+        <w:spacing w:after="0" w:line="360" w:lineRule="auto"/>
+        <w:jc w:val="both"/>
+        <w:rPr>
+          <w:rFonts w:ascii="Arial" w:hAnsi="Arial" w:cs="Arial"/>
+          <w:sz w:val="24"/>
+          <w:szCs w:val="24"/>
+        </w:rPr>
+      </w:pPr>
+    </w:p>
+    <w:p>
+      <w:pPr>
+        <w:spacing w:after="0" w:line="240" w:lineRule="auto"/>
+        <w:ind w:left="2268"/>
+        <w:jc w:val="both"/>
         <w:rPr>
           <w:rFonts w:ascii="Arial" w:hAnsi="Arial" w:cs="Arial"/>
           <w:sz w:val="20"/>
           <w:szCs w:val="20"/>
         </w:rPr>
-        <w:t>(MEDEIROS, 2021, p.</w:t>
-      </w:r>
+      </w:pPr>
       <w:r>
         <w:rPr>
           <w:rFonts w:ascii="Arial" w:hAnsi="Arial" w:cs="Arial"/>
           <w:sz w:val="20"/>
           <w:szCs w:val="20"/>
         </w:rPr>
-        <w:t>6</w:t>
+        <w:t>Podemos aferir que a educação brasileira ao longo deste período, pode ser identificada pelo seu caráter elitista e propedêutico, sendo as escassas escolas, atreladas ao Estado sem autonomia em relação à escolha dos conteúdos. Foram ainda influenciados pelas doutrinas religiosas que formaram durante os primeiros séculos de colonização, a base da educação brasileira, devido ao monopólio jesuítico em relação à educação colonial, o que não garantiu uma emancipação do pensamento e da cultura brasileira ao que se refere à herança europeia.</w:t>
       </w:r>
       <w:r>
         <w:rPr>
@@ -1266,7 +1857,7 @@
           <w:sz w:val="20"/>
           <w:szCs w:val="20"/>
         </w:rPr>
-        <w:t xml:space="preserve"> | 1</w:t>
+        <w:t xml:space="preserve"> (MEDEIROS, 2021, p.8</w:t>
       </w:r>
       <w:r>
         <w:rPr>
@@ -1274,7 +1865,7 @@
           <w:sz w:val="20"/>
           <w:szCs w:val="20"/>
         </w:rPr>
-        <w:t>69</w:t>
+        <w:t xml:space="preserve"> | 171</w:t>
       </w:r>
       <w:r>
         <w:rPr>
@@ -1284,293 +1875,14 @@
         </w:rPr>
         <w:t>)</w:t>
       </w:r>
-    </w:p>
-    <w:p>
-      <w:pPr>
-        <w:spacing w:after="0" w:line="360" w:lineRule="auto"/>
-        <w:jc w:val="both"/>
-        <w:rPr>
-          <w:rFonts w:ascii="Arial" w:hAnsi="Arial" w:cs="Arial"/>
-          <w:sz w:val="24"/>
-          <w:szCs w:val="24"/>
-        </w:rPr>
-      </w:pPr>
-    </w:p>
-    <w:p>
-      <w:pPr>
-        <w:spacing w:after="0" w:line="360" w:lineRule="auto"/>
-        <w:jc w:val="both"/>
-        <w:rPr>
-          <w:rFonts w:ascii="Arial" w:hAnsi="Arial" w:cs="Arial"/>
-          <w:sz w:val="24"/>
-          <w:szCs w:val="24"/>
-        </w:rPr>
-      </w:pPr>
-      <w:r>
-        <w:rPr>
-          <w:rFonts w:ascii="Arial" w:hAnsi="Arial" w:cs="Arial"/>
-          <w:sz w:val="24"/>
-          <w:szCs w:val="24"/>
-        </w:rPr>
-        <w:t>Com a chegada da Família Real Portuguesa no Brasil, em 1808, D. João VI implementou algumas medidas para desenvolver o ensino superior na colônia, como a criação das primeiras universidades, mas o ensino básico e popular foi deixado de lado. Além disso, durante todo o período, a disciplina de História não foi inserida nos projetos de estudo</w:t>
-      </w:r>
-      <w:r>
-        <w:rPr>
-          <w:rFonts w:ascii="Arial" w:hAnsi="Arial" w:cs="Arial"/>
-          <w:sz w:val="24"/>
-          <w:szCs w:val="24"/>
-        </w:rPr>
-        <w:t xml:space="preserve">, segundo Fonseca (2011, apud </w:t>
-      </w:r>
-      <w:r>
-        <w:rPr>
-          <w:rFonts w:ascii="Arial" w:hAnsi="Arial" w:cs="Arial"/>
-          <w:sz w:val="24"/>
-          <w:szCs w:val="24"/>
-        </w:rPr>
-        <w:t>SCHNEIDER</w:t>
-      </w:r>
-      <w:r>
-        <w:rPr>
-          <w:rFonts w:ascii="Arial" w:hAnsi="Arial" w:cs="Arial"/>
-          <w:sz w:val="24"/>
-          <w:szCs w:val="24"/>
-        </w:rPr>
-        <w:t xml:space="preserve">, </w:t>
-      </w:r>
-      <w:r>
-        <w:rPr>
-          <w:rFonts w:ascii="Arial" w:hAnsi="Arial" w:cs="Arial"/>
-          <w:sz w:val="24"/>
-          <w:szCs w:val="24"/>
-        </w:rPr>
-        <w:t>LEON</w:t>
-      </w:r>
-      <w:r>
-        <w:rPr>
-          <w:rFonts w:ascii="Arial" w:hAnsi="Arial" w:cs="Arial"/>
-          <w:sz w:val="24"/>
-          <w:szCs w:val="24"/>
-        </w:rPr>
-        <w:t>, 2022, p.2) “</w:t>
-      </w:r>
-      <w:r>
-        <w:rPr>
-          <w:rFonts w:ascii="Arial" w:hAnsi="Arial" w:cs="Arial"/>
-          <w:sz w:val="24"/>
-          <w:szCs w:val="24"/>
-        </w:rPr>
-        <w:t>é após a independência que a disciplina de História ganha status no espaço escolar</w:t>
-      </w:r>
-      <w:r>
-        <w:rPr>
-          <w:rFonts w:ascii="Arial" w:hAnsi="Arial" w:cs="Arial"/>
-          <w:sz w:val="24"/>
-          <w:szCs w:val="24"/>
-        </w:rPr>
-        <w:t>”.</w:t>
-      </w:r>
-    </w:p>
-    <w:p>
-      <w:pPr>
-        <w:spacing w:after="0" w:line="360" w:lineRule="auto"/>
-        <w:jc w:val="both"/>
-        <w:rPr>
-          <w:rFonts w:ascii="Arial" w:hAnsi="Arial" w:cs="Arial"/>
-          <w:sz w:val="24"/>
-          <w:szCs w:val="24"/>
-        </w:rPr>
-      </w:pPr>
-      <w:r>
-        <w:rPr>
-          <w:rFonts w:ascii="Arial" w:hAnsi="Arial" w:cs="Arial"/>
-          <w:sz w:val="24"/>
-          <w:szCs w:val="24"/>
-        </w:rPr>
-        <w:t>Assim,</w:t>
-      </w:r>
-      <w:r>
-        <w:rPr>
-          <w:rFonts w:ascii="Arial" w:hAnsi="Arial" w:cs="Arial"/>
-          <w:sz w:val="24"/>
-          <w:szCs w:val="24"/>
-        </w:rPr>
-        <w:t xml:space="preserve"> </w:t>
-      </w:r>
-      <w:r>
-        <w:rPr>
-          <w:rFonts w:ascii="Arial" w:hAnsi="Arial" w:cs="Arial"/>
-          <w:sz w:val="24"/>
-          <w:szCs w:val="24"/>
-        </w:rPr>
-        <w:t>os momentos histórico</w:t>
-      </w:r>
-      <w:r>
-        <w:rPr>
-          <w:rFonts w:ascii="Arial" w:hAnsi="Arial" w:cs="Arial"/>
-          <w:sz w:val="24"/>
-          <w:szCs w:val="24"/>
-        </w:rPr>
-        <w:t>s</w:t>
-      </w:r>
-      <w:r>
-        <w:rPr>
-          <w:rFonts w:ascii="Arial" w:hAnsi="Arial" w:cs="Arial"/>
-          <w:sz w:val="24"/>
-          <w:szCs w:val="24"/>
-        </w:rPr>
-        <w:t xml:space="preserve"> que impactaram significativamente o ensino da História do Brasil foram o Império, a República e a Ditadura Militar,</w:t>
-      </w:r>
-      <w:r>
-        <w:rPr>
-          <w:rFonts w:ascii="Arial" w:hAnsi="Arial" w:cs="Arial"/>
-          <w:sz w:val="24"/>
-          <w:szCs w:val="24"/>
-        </w:rPr>
-        <w:t xml:space="preserve"> </w:t>
-      </w:r>
-      <w:r>
-        <w:rPr>
-          <w:rFonts w:ascii="Arial" w:hAnsi="Arial" w:cs="Arial"/>
-          <w:sz w:val="24"/>
-          <w:szCs w:val="24"/>
-        </w:rPr>
-        <w:t>pois</w:t>
-      </w:r>
-      <w:r>
-        <w:rPr>
-          <w:rFonts w:ascii="Arial" w:hAnsi="Arial" w:cs="Arial"/>
-          <w:sz w:val="24"/>
-          <w:szCs w:val="24"/>
-        </w:rPr>
-        <w:t xml:space="preserve"> foi a partir do período imperial que matéria de História começou a ser discutida nas instituições de ensino. </w:t>
-      </w:r>
-    </w:p>
-    <w:p>
-      <w:pPr>
-        <w:spacing w:after="0" w:line="360" w:lineRule="auto"/>
-        <w:jc w:val="both"/>
-        <w:rPr>
-          <w:rFonts w:ascii="Arial" w:hAnsi="Arial" w:cs="Arial"/>
-          <w:sz w:val="24"/>
-          <w:szCs w:val="24"/>
-        </w:rPr>
-      </w:pPr>
-    </w:p>
-    <w:p>
-      <w:pPr>
-        <w:spacing w:after="0" w:line="360" w:lineRule="auto"/>
-        <w:jc w:val="both"/>
-        <w:rPr>
-          <w:rFonts w:ascii="Arial" w:hAnsi="Arial" w:cs="Arial"/>
-          <w:b/>
-          <w:bCs/>
-          <w:sz w:val="24"/>
-          <w:szCs w:val="24"/>
-        </w:rPr>
-      </w:pPr>
-      <w:r>
-        <w:rPr>
-          <w:rFonts w:ascii="Arial" w:hAnsi="Arial" w:cs="Arial"/>
-          <w:b/>
-          <w:bCs/>
-          <w:sz w:val="24"/>
-          <w:szCs w:val="24"/>
-        </w:rPr>
-        <w:t>2.1 Do Império ao século XXI</w:t>
-      </w:r>
-    </w:p>
-    <w:p>
-      <w:pPr>
-        <w:spacing w:after="0" w:line="360" w:lineRule="auto"/>
-        <w:jc w:val="both"/>
-        <w:rPr>
-          <w:rFonts w:ascii="Arial" w:hAnsi="Arial" w:cs="Arial"/>
-          <w:sz w:val="24"/>
-          <w:szCs w:val="24"/>
-        </w:rPr>
-      </w:pPr>
-    </w:p>
-    <w:p>
-      <w:pPr>
-        <w:spacing w:after="0" w:line="360" w:lineRule="auto"/>
-        <w:jc w:val="both"/>
-        <w:rPr>
-          <w:rFonts w:ascii="Arial" w:hAnsi="Arial" w:cs="Arial"/>
-          <w:sz w:val="24"/>
-          <w:szCs w:val="24"/>
-        </w:rPr>
-      </w:pPr>
-      <w:r>
-        <w:rPr>
-          <w:rFonts w:ascii="Arial" w:hAnsi="Arial" w:cs="Arial"/>
-          <w:sz w:val="24"/>
-          <w:szCs w:val="24"/>
-        </w:rPr>
-        <w:t>Desde o período imperial, a</w:t>
-      </w:r>
-      <w:r>
-        <w:rPr>
-          <w:rFonts w:ascii="Arial" w:hAnsi="Arial" w:cs="Arial"/>
-          <w:sz w:val="24"/>
-          <w:szCs w:val="24"/>
-        </w:rPr>
-        <w:t xml:space="preserve"> disciplina de</w:t>
-      </w:r>
-      <w:r>
-        <w:rPr>
-          <w:rFonts w:ascii="Arial" w:hAnsi="Arial" w:cs="Arial"/>
-          <w:sz w:val="24"/>
-          <w:szCs w:val="24"/>
-        </w:rPr>
-        <w:t xml:space="preserve"> História sempre teve um papel moralizante, mas, muitas vezes essa moral era definida de acordo com os ideais e objetivos da classe dominante e do Estado. Além disso, a educação não era acessível a todos e priorizada pelas entidades reguladoras da nação. Apesar de ter ocorrido vários avanços no sistema de ensino, é possível perceber na sociedade brasileira do século XXI vestígios desse passado </w:t>
-      </w:r>
-      <w:r>
-        <w:rPr>
-          <w:rFonts w:ascii="Arial" w:hAnsi="Arial" w:cs="Arial"/>
-          <w:sz w:val="24"/>
-          <w:szCs w:val="24"/>
-        </w:rPr>
-        <w:t xml:space="preserve">histórico. </w:t>
-      </w:r>
-    </w:p>
-    <w:p>
-      <w:pPr>
-        <w:spacing w:after="0" w:line="360" w:lineRule="auto"/>
-        <w:jc w:val="both"/>
-        <w:rPr>
-          <w:rFonts w:ascii="Arial" w:hAnsi="Arial" w:cs="Arial"/>
-          <w:sz w:val="24"/>
-          <w:szCs w:val="24"/>
-        </w:rPr>
-      </w:pPr>
-      <w:r>
-        <w:rPr>
-          <w:rFonts w:ascii="Arial" w:hAnsi="Arial" w:cs="Arial"/>
-          <w:sz w:val="24"/>
-          <w:szCs w:val="24"/>
-        </w:rPr>
-        <w:t>Por isso, é necessário analisar como a educação e o ensino da História do Brasil foram construídos no decorrer do tempo. Então, começando pelo Império, Medeiros (2021) expõem:</w:t>
-      </w:r>
-      <w:r>
-        <w:rPr>
-          <w:rFonts w:ascii="Arial" w:hAnsi="Arial" w:cs="Arial"/>
-          <w:sz w:val="24"/>
-          <w:szCs w:val="24"/>
-        </w:rPr>
-        <w:t xml:space="preserve"> </w:t>
-      </w:r>
-    </w:p>
-    <w:p>
-      <w:pPr>
-        <w:spacing w:after="0" w:line="360" w:lineRule="auto"/>
-        <w:jc w:val="both"/>
-        <w:rPr>
-          <w:rFonts w:ascii="Arial" w:hAnsi="Arial" w:cs="Arial"/>
-          <w:sz w:val="24"/>
-          <w:szCs w:val="24"/>
-        </w:rPr>
-      </w:pPr>
+      <w:r>
+        <w:rPr>
+          <w:rFonts w:ascii="Arial" w:hAnsi="Arial" w:cs="Arial"/>
+          <w:sz w:val="20"/>
+          <w:szCs w:val="20"/>
+        </w:rPr>
+        <w:tab/>
+      </w:r>
     </w:p>
     <w:p>
       <w:pPr>
@@ -1583,58 +1895,6 @@
           <w:szCs w:val="20"/>
         </w:rPr>
       </w:pPr>
-      <w:r>
-        <w:rPr>
-          <w:rFonts w:ascii="Arial" w:hAnsi="Arial" w:cs="Arial"/>
-          <w:sz w:val="20"/>
-          <w:szCs w:val="20"/>
-        </w:rPr>
-        <w:t>Podemos aferir que a educação brasileira ao longo deste período, pode ser identificada pelo seu caráter elitista e propedêutico, sendo as escassas escolas, atreladas ao Estado sem autonomia em relação à escolha dos conteúdos. Foram ainda influenciados pelas doutrinas religiosas que formaram durante os primeiros séculos de colonização, a base da educação brasileira, devido ao monopólio jesuítico em relação à educação colonial, o que não garantiu uma emancipação do pensamento e da cultura brasileira ao que se refere à herança europeia.</w:t>
-      </w:r>
-      <w:r>
-        <w:rPr>
-          <w:rFonts w:ascii="Arial" w:hAnsi="Arial" w:cs="Arial"/>
-          <w:sz w:val="20"/>
-          <w:szCs w:val="20"/>
-        </w:rPr>
-        <w:t xml:space="preserve"> (MEDEIROS, 2021, p.8</w:t>
-      </w:r>
-      <w:r>
-        <w:rPr>
-          <w:rFonts w:ascii="Arial" w:hAnsi="Arial" w:cs="Arial"/>
-          <w:sz w:val="20"/>
-          <w:szCs w:val="20"/>
-        </w:rPr>
-        <w:t xml:space="preserve"> | 171</w:t>
-      </w:r>
-      <w:r>
-        <w:rPr>
-          <w:rFonts w:ascii="Arial" w:hAnsi="Arial" w:cs="Arial"/>
-          <w:sz w:val="20"/>
-          <w:szCs w:val="20"/>
-        </w:rPr>
-        <w:t>)</w:t>
-      </w:r>
-      <w:r>
-        <w:rPr>
-          <w:rFonts w:ascii="Arial" w:hAnsi="Arial" w:cs="Arial"/>
-          <w:sz w:val="20"/>
-          <w:szCs w:val="20"/>
-        </w:rPr>
-        <w:tab/>
-      </w:r>
-    </w:p>
-    <w:p>
-      <w:pPr>
-        <w:spacing w:after="0" w:line="240" w:lineRule="auto"/>
-        <w:ind w:left="2268"/>
-        <w:jc w:val="both"/>
-        <w:rPr>
-          <w:rFonts w:ascii="Arial" w:hAnsi="Arial" w:cs="Arial"/>
-          <w:sz w:val="20"/>
-          <w:szCs w:val="20"/>
-        </w:rPr>
-      </w:pPr>
     </w:p>
     <w:p>
       <w:pPr>
@@ -1743,26 +2003,90 @@
           <w:sz w:val="24"/>
           <w:szCs w:val="24"/>
         </w:rPr>
-        <w:t>, utilizando a metodologia francesa que favorecia o pensamento eurocêntrico.</w:t>
-      </w:r>
-    </w:p>
-    <w:p>
-      <w:pPr>
-        <w:spacing w:after="0" w:line="360" w:lineRule="auto"/>
-        <w:jc w:val="both"/>
-        <w:rPr>
-          <w:rFonts w:ascii="Arial" w:hAnsi="Arial" w:cs="Arial"/>
-          <w:sz w:val="24"/>
-          <w:szCs w:val="24"/>
-        </w:rPr>
-      </w:pPr>
-      <w:r>
-        <w:rPr>
-          <w:rFonts w:ascii="Arial" w:hAnsi="Arial" w:cs="Arial"/>
-          <w:sz w:val="24"/>
-          <w:szCs w:val="24"/>
-        </w:rPr>
-        <w:t xml:space="preserve">Após a Proclamação da República, em 1889, </w:t>
+        <w:t xml:space="preserve">, </w:t>
+      </w:r>
+      <w:r>
+        <w:rPr>
+          <w:rFonts w:ascii="Arial" w:hAnsi="Arial" w:cs="Arial"/>
+          <w:sz w:val="24"/>
+          <w:szCs w:val="24"/>
+        </w:rPr>
+        <w:t>além de utilizar</w:t>
+      </w:r>
+      <w:r>
+        <w:rPr>
+          <w:rFonts w:ascii="Arial" w:hAnsi="Arial" w:cs="Arial"/>
+          <w:sz w:val="24"/>
+          <w:szCs w:val="24"/>
+        </w:rPr>
+        <w:t xml:space="preserve"> </w:t>
+      </w:r>
+      <w:r>
+        <w:rPr>
+          <w:rFonts w:ascii="Arial" w:hAnsi="Arial" w:cs="Arial"/>
+          <w:sz w:val="24"/>
+          <w:szCs w:val="24"/>
+        </w:rPr>
+        <w:t>metodologias estrangeiras</w:t>
+      </w:r>
+      <w:r>
+        <w:rPr>
+          <w:rFonts w:ascii="Arial" w:hAnsi="Arial" w:cs="Arial"/>
+          <w:sz w:val="24"/>
+          <w:szCs w:val="24"/>
+        </w:rPr>
+        <w:t xml:space="preserve"> que favorecia</w:t>
+      </w:r>
+      <w:r>
+        <w:rPr>
+          <w:rFonts w:ascii="Arial" w:hAnsi="Arial" w:cs="Arial"/>
+          <w:sz w:val="24"/>
+          <w:szCs w:val="24"/>
+        </w:rPr>
+        <w:t>m</w:t>
+      </w:r>
+      <w:r>
+        <w:rPr>
+          <w:rFonts w:ascii="Arial" w:hAnsi="Arial" w:cs="Arial"/>
+          <w:sz w:val="24"/>
+          <w:szCs w:val="24"/>
+        </w:rPr>
+        <w:t xml:space="preserve"> o pensamento eurocêntrico.</w:t>
+      </w:r>
+    </w:p>
+    <w:p>
+      <w:pPr>
+        <w:spacing w:after="0" w:line="360" w:lineRule="auto"/>
+        <w:jc w:val="both"/>
+        <w:rPr>
+          <w:rFonts w:ascii="Arial" w:hAnsi="Arial" w:cs="Arial"/>
+          <w:sz w:val="24"/>
+          <w:szCs w:val="24"/>
+        </w:rPr>
+      </w:pPr>
+      <w:r>
+        <w:rPr>
+          <w:rFonts w:ascii="Arial" w:hAnsi="Arial" w:cs="Arial"/>
+          <w:sz w:val="24"/>
+          <w:szCs w:val="24"/>
+        </w:rPr>
+        <w:t>Após a Proclamação da República, em 1889,</w:t>
+      </w:r>
+      <w:r>
+        <w:rPr>
+          <w:rFonts w:ascii="Arial" w:hAnsi="Arial" w:cs="Arial"/>
+          <w:sz w:val="24"/>
+          <w:szCs w:val="24"/>
+        </w:rPr>
+        <w:t xml:space="preserve"> os governantes passaram a encarar</w:t>
+      </w:r>
+      <w:r>
+        <w:rPr>
+          <w:rFonts w:ascii="Arial" w:hAnsi="Arial" w:cs="Arial"/>
+          <w:sz w:val="24"/>
+          <w:szCs w:val="24"/>
+        </w:rPr>
+        <w:t xml:space="preserve"> </w:t>
       </w:r>
       <w:r>
         <w:rPr>
@@ -1778,7 +2102,7 @@
           <w:sz w:val="24"/>
           <w:szCs w:val="24"/>
         </w:rPr>
-        <w:t xml:space="preserve">foi visto como uma maneira de estimular o patriotismo e </w:t>
+        <w:t xml:space="preserve">como uma maneira de estimular o patriotismo e </w:t>
       </w:r>
       <w:r>
         <w:rPr>
@@ -1802,15 +2126,211 @@
           <w:sz w:val="24"/>
           <w:szCs w:val="24"/>
         </w:rPr>
-        <w:t>, por isso, alguns investimentos foram feitos, por exemplo, a História foi dividida em História Geral e História do Brasil</w:t>
-      </w:r>
-      <w:r>
-        <w:rPr>
-          <w:rFonts w:ascii="Arial" w:hAnsi="Arial" w:cs="Arial"/>
-          <w:sz w:val="24"/>
-          <w:szCs w:val="24"/>
-        </w:rPr>
-        <w:t>.</w:t>
+        <w:t>. Assim</w:t>
+      </w:r>
+      <w:r>
+        <w:rPr>
+          <w:rFonts w:ascii="Arial" w:hAnsi="Arial" w:cs="Arial"/>
+          <w:sz w:val="24"/>
+          <w:szCs w:val="24"/>
+        </w:rPr>
+        <w:t>, alguns investim</w:t>
+      </w:r>
+      <w:r>
+        <w:rPr>
+          <w:rFonts w:ascii="Arial" w:hAnsi="Arial" w:cs="Arial"/>
+          <w:sz w:val="24"/>
+          <w:szCs w:val="24"/>
+        </w:rPr>
+        <w:t>entos foram feitos, como</w:t>
+      </w:r>
+      <w:r>
+        <w:rPr>
+          <w:rFonts w:ascii="Arial" w:hAnsi="Arial" w:cs="Arial"/>
+          <w:sz w:val="24"/>
+          <w:szCs w:val="24"/>
+        </w:rPr>
+        <w:t xml:space="preserve"> </w:t>
+      </w:r>
+      <w:r>
+        <w:rPr>
+          <w:rFonts w:ascii="Arial" w:hAnsi="Arial" w:cs="Arial"/>
+          <w:sz w:val="24"/>
+          <w:szCs w:val="24"/>
+        </w:rPr>
+        <w:t>a cria</w:t>
+      </w:r>
+      <w:r>
+        <w:rPr>
+          <w:rFonts w:ascii="Arial" w:hAnsi="Arial" w:cs="Arial"/>
+          <w:sz w:val="24"/>
+          <w:szCs w:val="24"/>
+        </w:rPr>
+        <w:t>ção do Ministério da Educação (1930), que, segundo Medeiros (2021), deu ao ensino de História um caráter utilitarista com objetivo o exercício da cidadania. Ademais,</w:t>
+      </w:r>
+      <w:r>
+        <w:rPr>
+          <w:rFonts w:ascii="Arial" w:hAnsi="Arial" w:cs="Arial"/>
+          <w:sz w:val="24"/>
+          <w:szCs w:val="24"/>
+        </w:rPr>
+        <w:t xml:space="preserve"> no governo de Getúlio Vargas, a educação tornou-se determinantemente obrigatória, pública </w:t>
+      </w:r>
+      <w:r>
+        <w:rPr>
+          <w:rFonts w:ascii="Arial" w:hAnsi="Arial" w:cs="Arial"/>
+          <w:sz w:val="24"/>
+          <w:szCs w:val="24"/>
+        </w:rPr>
+        <w:t>e laica</w:t>
+      </w:r>
+      <w:r>
+        <w:rPr>
+          <w:rFonts w:ascii="Arial" w:hAnsi="Arial" w:cs="Arial"/>
+          <w:sz w:val="24"/>
+          <w:szCs w:val="24"/>
+        </w:rPr>
+        <w:t xml:space="preserve">, </w:t>
+      </w:r>
+      <w:r>
+        <w:rPr>
+          <w:rFonts w:ascii="Arial" w:hAnsi="Arial" w:cs="Arial"/>
+          <w:sz w:val="24"/>
+          <w:szCs w:val="24"/>
+        </w:rPr>
+        <w:t xml:space="preserve">e </w:t>
+      </w:r>
+      <w:r>
+        <w:rPr>
+          <w:rFonts w:ascii="Arial" w:hAnsi="Arial" w:cs="Arial"/>
+          <w:sz w:val="24"/>
+          <w:szCs w:val="24"/>
+        </w:rPr>
+        <w:t>a História foi dividida em História Geral e História do Brasil</w:t>
+      </w:r>
+      <w:r>
+        <w:rPr>
+          <w:rFonts w:ascii="Arial" w:hAnsi="Arial" w:cs="Arial"/>
+          <w:sz w:val="24"/>
+          <w:szCs w:val="24"/>
+        </w:rPr>
+        <w:t xml:space="preserve"> pela Reforma de Gustavo Capanema (1942).</w:t>
+      </w:r>
+    </w:p>
+    <w:p>
+      <w:pPr>
+        <w:spacing w:after="0" w:line="360" w:lineRule="auto"/>
+        <w:jc w:val="both"/>
+        <w:rPr>
+          <w:rFonts w:ascii="Arial" w:hAnsi="Arial" w:cs="Arial"/>
+          <w:sz w:val="24"/>
+          <w:szCs w:val="24"/>
+        </w:rPr>
+      </w:pPr>
+      <w:r>
+        <w:rPr>
+          <w:rFonts w:ascii="Arial" w:hAnsi="Arial" w:cs="Arial"/>
+          <w:sz w:val="24"/>
+          <w:szCs w:val="24"/>
+        </w:rPr>
+        <w:t>Durante a Ditadura Militar (1964-1985)</w:t>
+      </w:r>
+      <w:r>
+        <w:rPr>
+          <w:rFonts w:ascii="Arial" w:hAnsi="Arial" w:cs="Arial"/>
+          <w:sz w:val="24"/>
+          <w:szCs w:val="24"/>
+        </w:rPr>
+        <w:t>, o ocorreu diversas formas de censura, vigilância e controle por parte das</w:t>
+      </w:r>
+      <w:bookmarkStart w:id="0" w:name="_GoBack"/>
+      <w:bookmarkEnd w:id="0"/>
+      <w:r>
+        <w:rPr>
+          <w:rFonts w:ascii="Arial" w:hAnsi="Arial" w:cs="Arial"/>
+          <w:sz w:val="24"/>
+          <w:szCs w:val="24"/>
+        </w:rPr>
+        <w:t xml:space="preserve"> autoridades a fim de manter a estabilidade do regime. Dessa forma, o professor de História, como principal agente do desenvolvimento da consciência crítica da população jovem, teve sua atuação limitada, baixos investimentos, como na qualificação profissional e salários vantajosos, e até mesmo foram alvos de perseguição.</w:t>
+      </w:r>
+      <w:r>
+        <w:rPr>
+          <w:rFonts w:ascii="Arial" w:hAnsi="Arial" w:cs="Arial"/>
+          <w:sz w:val="24"/>
+          <w:szCs w:val="24"/>
+        </w:rPr>
+        <w:t xml:space="preserve"> </w:t>
+      </w:r>
+    </w:p>
+    <w:p>
+      <w:pPr>
+        <w:spacing w:after="0" w:line="360" w:lineRule="auto"/>
+        <w:jc w:val="both"/>
+        <w:rPr>
+          <w:rFonts w:ascii="Arial" w:hAnsi="Arial" w:cs="Arial"/>
+          <w:sz w:val="24"/>
+          <w:szCs w:val="24"/>
+        </w:rPr>
+      </w:pPr>
+      <w:r>
+        <w:rPr>
+          <w:rFonts w:ascii="Arial" w:hAnsi="Arial" w:cs="Arial"/>
+          <w:sz w:val="24"/>
+          <w:szCs w:val="24"/>
+        </w:rPr>
+        <w:t xml:space="preserve">Mas, após a queda desse governo e a redemocratização, houve avanços na qualidade, nos conteúdos e nos objetivos do ensino de História do Brasil. Novos livros </w:t>
+      </w:r>
+      <w:r>
+        <w:rPr>
+          <w:rFonts w:ascii="Arial" w:hAnsi="Arial" w:cs="Arial"/>
+          <w:sz w:val="24"/>
+          <w:szCs w:val="24"/>
+        </w:rPr>
+        <w:lastRenderedPageBreak/>
+        <w:t xml:space="preserve">didáticos foram elaborados focados em interligar o saber científico e escolar; as matérias de História e Geografia tornaram-se independentes e </w:t>
+      </w:r>
+      <w:r>
+        <w:rPr>
+          <w:rFonts w:ascii="Arial" w:hAnsi="Arial" w:cs="Arial"/>
+          <w:sz w:val="24"/>
+          <w:szCs w:val="24"/>
+        </w:rPr>
+        <w:t>teve como obrigatoriedade nas escolas o estudo da História e Cultura Afro-brasileira e da temática dos povos originários.</w:t>
+      </w:r>
+    </w:p>
+    <w:p>
+      <w:pPr>
+        <w:spacing w:after="0" w:line="360" w:lineRule="auto"/>
+        <w:jc w:val="both"/>
+        <w:rPr>
+          <w:rFonts w:ascii="Arial" w:hAnsi="Arial" w:cs="Arial"/>
+          <w:sz w:val="24"/>
+          <w:szCs w:val="24"/>
+        </w:rPr>
+      </w:pPr>
+      <w:r>
+        <w:rPr>
+          <w:rFonts w:ascii="Arial" w:hAnsi="Arial" w:cs="Arial"/>
+          <w:sz w:val="24"/>
+          <w:szCs w:val="24"/>
+        </w:rPr>
+        <w:t>Contudo, a História ensinada nas escolas ainda carrega muito de sua base tradicional, prevalecendo grandes feitos, heróis, datas, memorização e repetição.</w:t>
+      </w:r>
+      <w:r>
+        <w:rPr>
+          <w:rFonts w:ascii="Arial" w:hAnsi="Arial" w:cs="Arial"/>
+          <w:sz w:val="24"/>
+          <w:szCs w:val="24"/>
+        </w:rPr>
+        <w:t xml:space="preserve"> (SCHENEIDER, LEON</w:t>
+      </w:r>
+      <w:r>
+        <w:rPr>
+          <w:rFonts w:ascii="Arial" w:hAnsi="Arial" w:cs="Arial"/>
+          <w:sz w:val="24"/>
+          <w:szCs w:val="24"/>
+        </w:rPr>
+        <w:t>, 2021)</w:t>
       </w:r>
     </w:p>
     <w:p>
@@ -1977,11 +2497,20 @@
       <w:r>
         <w:rPr>
           <w:noProof/>
+          <w:lang w:eastAsia="pt-BR"/>
         </w:rPr>
         <w:drawing>
-          <wp:inline distT="0" distB="0" distL="0" distR="0" wp14:anchorId="17F21169" wp14:editId="7BE39370">
+          <wp:anchor distT="0" distB="0" distL="114300" distR="114300" simplePos="0" relativeHeight="251658240" behindDoc="0" locked="0" layoutInCell="1" allowOverlap="1" wp14:anchorId="64E6B2E7" wp14:editId="6111AC2A">
+            <wp:simplePos x="1079500" y="3968750"/>
+            <wp:positionH relativeFrom="column">
+              <wp:align>left</wp:align>
+            </wp:positionH>
+            <wp:positionV relativeFrom="paragraph">
+              <wp:align>top</wp:align>
+            </wp:positionV>
             <wp:extent cx="4320000" cy="1818772"/>
             <wp:effectExtent l="0" t="0" r="4445" b="0"/>
+            <wp:wrapSquare wrapText="bothSides"/>
             <wp:docPr id="15385014" name="Imagem 1" descr="Gráfico de respostas do Google Formulários. Título da pergunta: Você gosta de História?. Número de respostas: 75 respostas."/>
             <wp:cNvGraphicFramePr>
               <a:graphicFrameLocks xmlns:a="http://schemas.openxmlformats.org/drawingml/2006/main" noChangeAspect="1"/>
@@ -2024,12 +2553,39 @@
                 </pic:pic>
               </a:graphicData>
             </a:graphic>
-          </wp:inline>
+          </wp:anchor>
         </w:drawing>
       </w:r>
     </w:p>
     <w:p>
       <w:pPr>
+        <w:rPr>
+          <w:rFonts w:ascii="Arial" w:hAnsi="Arial" w:cs="Arial"/>
+          <w:sz w:val="24"/>
+          <w:szCs w:val="24"/>
+        </w:rPr>
+      </w:pPr>
+    </w:p>
+    <w:p>
+      <w:pPr>
+        <w:rPr>
+          <w:rFonts w:ascii="Arial" w:hAnsi="Arial" w:cs="Arial"/>
+          <w:sz w:val="24"/>
+          <w:szCs w:val="24"/>
+        </w:rPr>
+      </w:pPr>
+    </w:p>
+    <w:p>
+      <w:pPr>
+        <w:rPr>
+          <w:rFonts w:ascii="Arial" w:hAnsi="Arial" w:cs="Arial"/>
+          <w:sz w:val="24"/>
+          <w:szCs w:val="24"/>
+        </w:rPr>
+      </w:pPr>
+    </w:p>
+    <w:p>
+      <w:pPr>
         <w:spacing w:after="0" w:line="360" w:lineRule="auto"/>
         <w:jc w:val="both"/>
         <w:rPr>
@@ -2055,9 +2611,45 @@
       </w:pPr>
       <w:r>
         <w:rPr>
+          <w:rFonts w:ascii="Arial" w:hAnsi="Arial" w:cs="Arial"/>
+          <w:b/>
+          <w:bCs/>
+          <w:sz w:val="24"/>
+          <w:szCs w:val="24"/>
+        </w:rPr>
+        <w:br w:type="textWrapping" w:clear="all"/>
+      </w:r>
+    </w:p>
+    <w:p>
+      <w:pPr>
+        <w:spacing w:after="0" w:line="360" w:lineRule="auto"/>
+        <w:jc w:val="both"/>
+        <w:rPr>
+          <w:rFonts w:ascii="Arial" w:hAnsi="Arial" w:cs="Arial"/>
+          <w:b/>
+          <w:bCs/>
+          <w:sz w:val="24"/>
+          <w:szCs w:val="24"/>
+        </w:rPr>
+      </w:pPr>
+    </w:p>
+    <w:p>
+      <w:pPr>
+        <w:spacing w:after="0" w:line="360" w:lineRule="auto"/>
+        <w:jc w:val="both"/>
+        <w:rPr>
+          <w:rFonts w:ascii="Arial" w:hAnsi="Arial" w:cs="Arial"/>
+          <w:b/>
+          <w:bCs/>
+          <w:sz w:val="24"/>
+          <w:szCs w:val="24"/>
+        </w:rPr>
+      </w:pPr>
+      <w:r>
+        <w:rPr>
           <w:noProof/>
-        </w:rPr>
-        <w:lastRenderedPageBreak/>
+          <w:lang w:eastAsia="pt-BR"/>
+        </w:rPr>
         <w:drawing>
           <wp:inline distT="0" distB="0" distL="0" distR="0" wp14:anchorId="038A34C6" wp14:editId="31C20917">
             <wp:extent cx="4320000" cy="1818772"/>
@@ -2136,7 +2728,9 @@
       <w:r>
         <w:rPr>
           <w:noProof/>
-        </w:rPr>
+          <w:lang w:eastAsia="pt-BR"/>
+        </w:rPr>
+        <w:lastRenderedPageBreak/>
         <w:drawing>
           <wp:inline distT="0" distB="0" distL="0" distR="0" wp14:anchorId="50975079" wp14:editId="04364A03">
             <wp:extent cx="4320000" cy="2406932"/>
@@ -2313,303 +2907,209 @@
     </w:p>
     <w:p>
       <w:pPr>
-        <w:spacing w:after="0" w:line="360" w:lineRule="auto"/>
-        <w:jc w:val="both"/>
-        <w:rPr>
-          <w:rFonts w:ascii="Arial" w:hAnsi="Arial" w:cs="Arial"/>
-          <w:sz w:val="24"/>
-          <w:szCs w:val="24"/>
-        </w:rPr>
-      </w:pPr>
-    </w:p>
-    <w:p>
-      <w:pPr>
-        <w:spacing w:after="0" w:line="360" w:lineRule="auto"/>
-        <w:jc w:val="both"/>
-        <w:rPr>
-          <w:rFonts w:ascii="Arial" w:hAnsi="Arial" w:cs="Arial"/>
-          <w:b/>
-          <w:sz w:val="24"/>
-          <w:szCs w:val="24"/>
-        </w:rPr>
-      </w:pPr>
-    </w:p>
-    <w:p>
-      <w:pPr>
-        <w:spacing w:after="0" w:line="360" w:lineRule="auto"/>
-        <w:jc w:val="both"/>
-        <w:rPr>
-          <w:rFonts w:ascii="Arial" w:hAnsi="Arial" w:cs="Arial"/>
-          <w:b/>
-          <w:sz w:val="24"/>
-          <w:szCs w:val="24"/>
-        </w:rPr>
-      </w:pPr>
-    </w:p>
-    <w:p>
-      <w:pPr>
-        <w:spacing w:after="0" w:line="360" w:lineRule="auto"/>
-        <w:jc w:val="both"/>
-        <w:rPr>
-          <w:rFonts w:ascii="Arial" w:hAnsi="Arial" w:cs="Arial"/>
-          <w:b/>
-          <w:sz w:val="24"/>
-          <w:szCs w:val="24"/>
-        </w:rPr>
-      </w:pPr>
-    </w:p>
-    <w:p>
-      <w:pPr>
-        <w:spacing w:after="0" w:line="360" w:lineRule="auto"/>
-        <w:jc w:val="both"/>
-        <w:rPr>
-          <w:rFonts w:ascii="Arial" w:hAnsi="Arial" w:cs="Arial"/>
-          <w:b/>
-          <w:sz w:val="24"/>
-          <w:szCs w:val="24"/>
-        </w:rPr>
-      </w:pPr>
-    </w:p>
-    <w:p>
-      <w:pPr>
-        <w:spacing w:after="0" w:line="360" w:lineRule="auto"/>
-        <w:jc w:val="both"/>
-        <w:rPr>
-          <w:rFonts w:ascii="Arial" w:hAnsi="Arial" w:cs="Arial"/>
-          <w:b/>
-          <w:sz w:val="24"/>
-          <w:szCs w:val="24"/>
-        </w:rPr>
-      </w:pPr>
-    </w:p>
-    <w:p>
-      <w:pPr>
-        <w:spacing w:after="0" w:line="360" w:lineRule="auto"/>
-        <w:jc w:val="both"/>
-        <w:rPr>
-          <w:rFonts w:ascii="Arial" w:hAnsi="Arial" w:cs="Arial"/>
-          <w:b/>
-          <w:sz w:val="24"/>
-          <w:szCs w:val="24"/>
-        </w:rPr>
-      </w:pPr>
-    </w:p>
-    <w:p>
-      <w:pPr>
-        <w:spacing w:after="0" w:line="360" w:lineRule="auto"/>
-        <w:jc w:val="both"/>
-        <w:rPr>
-          <w:rFonts w:ascii="Arial" w:hAnsi="Arial" w:cs="Arial"/>
-          <w:b/>
-          <w:sz w:val="24"/>
-          <w:szCs w:val="24"/>
-        </w:rPr>
-      </w:pPr>
-    </w:p>
-    <w:p>
-      <w:pPr>
-        <w:spacing w:after="0" w:line="360" w:lineRule="auto"/>
-        <w:jc w:val="both"/>
-        <w:rPr>
-          <w:rFonts w:ascii="Arial" w:hAnsi="Arial" w:cs="Arial"/>
-          <w:sz w:val="24"/>
-          <w:szCs w:val="24"/>
-        </w:rPr>
-      </w:pPr>
-    </w:p>
-    <w:p>
-      <w:pPr>
-        <w:spacing w:after="0" w:line="360" w:lineRule="auto"/>
-        <w:jc w:val="both"/>
-        <w:rPr>
-          <w:rFonts w:ascii="Arial" w:hAnsi="Arial" w:cs="Arial"/>
-          <w:b/>
-          <w:sz w:val="24"/>
-          <w:szCs w:val="24"/>
-        </w:rPr>
-      </w:pPr>
-      <w:r>
-        <w:rPr>
-          <w:rFonts w:ascii="Arial" w:hAnsi="Arial" w:cs="Arial"/>
-          <w:b/>
+        <w:spacing w:after="0" w:line="240" w:lineRule="auto"/>
+        <w:ind w:left="2268"/>
+        <w:jc w:val="both"/>
+        <w:rPr>
+          <w:rFonts w:ascii="Arial" w:hAnsi="Arial" w:cs="Arial"/>
+          <w:sz w:val="20"/>
+          <w:szCs w:val="20"/>
+        </w:rPr>
+      </w:pPr>
+    </w:p>
+    <w:p>
+      <w:pPr>
+        <w:spacing w:after="0" w:line="360" w:lineRule="auto"/>
+        <w:jc w:val="both"/>
+        <w:rPr>
+          <w:rFonts w:ascii="Arial" w:hAnsi="Arial" w:cs="Arial"/>
+          <w:b/>
+          <w:sz w:val="24"/>
+          <w:szCs w:val="24"/>
+        </w:rPr>
+      </w:pPr>
+      <w:r>
+        <w:rPr>
+          <w:rFonts w:ascii="Arial" w:hAnsi="Arial" w:cs="Arial"/>
+          <w:b/>
+          <w:sz w:val="24"/>
+          <w:szCs w:val="24"/>
+        </w:rPr>
+        <w:t>REFERÊNCIAS</w:t>
+      </w:r>
+    </w:p>
+    <w:p>
+      <w:pPr>
+        <w:spacing w:after="0" w:line="360" w:lineRule="auto"/>
+        <w:jc w:val="both"/>
+        <w:rPr>
+          <w:rFonts w:ascii="Arial" w:hAnsi="Arial" w:cs="Arial"/>
+          <w:bCs/>
+          <w:sz w:val="24"/>
+          <w:szCs w:val="24"/>
+        </w:rPr>
+      </w:pPr>
+    </w:p>
+    <w:p>
+      <w:pPr>
+        <w:spacing w:after="0" w:line="360" w:lineRule="auto"/>
+        <w:jc w:val="both"/>
+        <w:rPr>
+          <w:rFonts w:ascii="Arial" w:hAnsi="Arial" w:cs="Arial"/>
+          <w:bCs/>
+          <w:sz w:val="24"/>
+          <w:szCs w:val="24"/>
+        </w:rPr>
+      </w:pPr>
+    </w:p>
+    <w:p>
+      <w:pPr>
+        <w:spacing w:after="0" w:line="360" w:lineRule="auto"/>
+        <w:jc w:val="both"/>
+        <w:rPr>
+          <w:rFonts w:ascii="Arial" w:hAnsi="Arial" w:cs="Arial"/>
+          <w:sz w:val="24"/>
+          <w:szCs w:val="24"/>
+        </w:rPr>
+      </w:pPr>
+      <w:r>
+        <w:rPr>
+          <w:rFonts w:ascii="Arial" w:hAnsi="Arial" w:cs="Arial"/>
+          <w:sz w:val="24"/>
+          <w:szCs w:val="24"/>
+        </w:rPr>
+        <w:t xml:space="preserve">SOBRENOME, Nome do autor. </w:t>
+      </w:r>
+      <w:r>
+        <w:rPr>
+          <w:rFonts w:ascii="Arial" w:hAnsi="Arial" w:cs="Arial"/>
+          <w:b/>
+          <w:bCs/>
+          <w:sz w:val="24"/>
+          <w:szCs w:val="24"/>
+        </w:rPr>
+        <w:t>Título da obra</w:t>
+      </w:r>
+      <w:r>
+        <w:rPr>
+          <w:rFonts w:ascii="Arial" w:hAnsi="Arial" w:cs="Arial"/>
+          <w:sz w:val="24"/>
+          <w:szCs w:val="24"/>
+        </w:rPr>
+        <w:t xml:space="preserve">. Edição. Cidade: Editora, Ano de Publicação. </w:t>
+      </w:r>
+    </w:p>
+    <w:p>
+      <w:pPr>
+        <w:spacing w:after="0" w:line="360" w:lineRule="auto"/>
+        <w:jc w:val="both"/>
+        <w:rPr>
+          <w:rFonts w:ascii="Arial" w:hAnsi="Arial" w:cs="Arial"/>
+          <w:sz w:val="24"/>
+          <w:szCs w:val="24"/>
+        </w:rPr>
+      </w:pPr>
+    </w:p>
+    <w:p>
+      <w:pPr>
+        <w:spacing w:after="0" w:line="360" w:lineRule="auto"/>
+        <w:jc w:val="both"/>
+        <w:rPr>
+          <w:rFonts w:ascii="Arial" w:hAnsi="Arial" w:cs="Arial"/>
+          <w:bCs/>
+          <w:sz w:val="24"/>
+          <w:szCs w:val="24"/>
+        </w:rPr>
+      </w:pPr>
+    </w:p>
+    <w:p>
+      <w:pPr>
+        <w:spacing w:after="0" w:line="360" w:lineRule="auto"/>
+        <w:rPr>
+          <w:rFonts w:ascii="Arial" w:hAnsi="Arial" w:cs="Arial"/>
+          <w:sz w:val="24"/>
+          <w:szCs w:val="24"/>
+        </w:rPr>
+      </w:pPr>
+      <w:r>
+        <w:rPr>
+          <w:rFonts w:ascii="Arial" w:hAnsi="Arial" w:cs="Arial"/>
+          <w:sz w:val="24"/>
+          <w:szCs w:val="24"/>
+        </w:rPr>
+        <w:t>UNIÃO BRASILEIRA DOS ESTUDANTES SECUNDARISTAS (UBES). A importância de estudar história nas escolas. Brasília, 30 nov. 2024. Disponível em: https://www.ubes.org.br/2024/a-importancia-de-estudar-historia-nas-escolas/. Acesso em: 21 maio. 2026.</w:t>
+      </w:r>
+    </w:p>
+    <w:p>
+      <w:pPr>
+        <w:spacing w:after="0" w:line="360" w:lineRule="auto"/>
+        <w:rPr>
+          <w:rFonts w:ascii="Arial" w:hAnsi="Arial" w:cs="Arial"/>
+          <w:sz w:val="24"/>
+          <w:szCs w:val="24"/>
+        </w:rPr>
+      </w:pPr>
+      <w:r>
+        <w:rPr>
+          <w:rFonts w:ascii="Arial" w:hAnsi="Arial" w:cs="Arial"/>
+          <w:sz w:val="24"/>
+          <w:szCs w:val="24"/>
+        </w:rPr>
+        <w:t>GAMEFIC. O que é gamificação? O g</w:t>
+      </w:r>
+      <w:r>
+        <w:rPr>
+          <w:rFonts w:ascii="Arial" w:hAnsi="Arial" w:cs="Arial"/>
+          <w:sz w:val="24"/>
+          <w:szCs w:val="24"/>
+        </w:rPr>
+        <w:t>uia definitivo</w:t>
+      </w:r>
+      <w:r>
+        <w:rPr>
+          <w:rFonts w:ascii="Arial" w:hAnsi="Arial" w:cs="Arial"/>
+          <w:sz w:val="24"/>
+          <w:szCs w:val="24"/>
+        </w:rPr>
+        <w:t>. Disponível em: https://www.gamefic.me/blog/o-que-e-gamificacao-o-guia-definitivo/. Acesso em: 6 ago. 2026.</w:t>
+      </w:r>
+    </w:p>
+    <w:p>
+      <w:pPr>
+        <w:spacing w:after="0" w:line="360" w:lineRule="auto"/>
+        <w:rPr>
+          <w:rFonts w:ascii="Arial" w:hAnsi="Arial" w:cs="Arial"/>
+          <w:bCs/>
+          <w:sz w:val="24"/>
+          <w:szCs w:val="24"/>
+        </w:rPr>
+      </w:pPr>
+      <w:r>
+        <w:rPr>
+          <w:rFonts w:ascii="Arial" w:hAnsi="Arial" w:cs="Arial"/>
+          <w:sz w:val="24"/>
+          <w:szCs w:val="24"/>
+        </w:rPr>
+        <w:t>BALDISSERA, Olivia. O que é gamificação e como ela aumenta o engajamento. Pós PUCPR Digital, 5 abr. 2021. Disponível em: https://posdigital.pucpr.br/blog/gamificacao-engajamento. Acesso em: 6 ago. 2026.</w:t>
+      </w:r>
+    </w:p>
+    <w:p>
+      <w:pPr>
+        <w:spacing w:after="0" w:line="360" w:lineRule="auto"/>
+        <w:rPr>
+          <w:rFonts w:ascii="Arial" w:hAnsi="Arial" w:cs="Arial"/>
+          <w:sz w:val="24"/>
+          <w:szCs w:val="24"/>
+          <w:u w:val="single"/>
+        </w:rPr>
+      </w:pPr>
+      <w:r>
+        <w:rPr>
+          <w:rFonts w:ascii="Arial" w:hAnsi="Arial" w:cs="Arial"/>
           <w:sz w:val="24"/>
           <w:szCs w:val="24"/>
         </w:rPr>
         <w:lastRenderedPageBreak/>
-        <w:t>REFERÊNCIAS</w:t>
-      </w:r>
-    </w:p>
-    <w:p>
-      <w:pPr>
-        <w:spacing w:after="0" w:line="360" w:lineRule="auto"/>
-        <w:jc w:val="both"/>
-        <w:rPr>
-          <w:rFonts w:ascii="Arial" w:hAnsi="Arial" w:cs="Arial"/>
-          <w:bCs/>
-          <w:sz w:val="24"/>
-          <w:szCs w:val="24"/>
-        </w:rPr>
-      </w:pPr>
-    </w:p>
-    <w:p>
-      <w:pPr>
-        <w:spacing w:after="0" w:line="360" w:lineRule="auto"/>
-        <w:jc w:val="both"/>
-        <w:rPr>
-          <w:rFonts w:ascii="Arial" w:hAnsi="Arial" w:cs="Arial"/>
-          <w:bCs/>
-          <w:sz w:val="24"/>
-          <w:szCs w:val="24"/>
-        </w:rPr>
-      </w:pPr>
-    </w:p>
-    <w:p>
-      <w:pPr>
-        <w:spacing w:after="0" w:line="360" w:lineRule="auto"/>
-        <w:jc w:val="both"/>
-        <w:rPr>
-          <w:rFonts w:ascii="Arial" w:hAnsi="Arial" w:cs="Arial"/>
-          <w:sz w:val="24"/>
-          <w:szCs w:val="24"/>
-        </w:rPr>
-      </w:pPr>
-      <w:r>
-        <w:rPr>
-          <w:rFonts w:ascii="Arial" w:hAnsi="Arial" w:cs="Arial"/>
-          <w:sz w:val="24"/>
-          <w:szCs w:val="24"/>
-        </w:rPr>
-        <w:t xml:space="preserve">SOBRENOME, Nome do autor. </w:t>
-      </w:r>
-      <w:r>
-        <w:rPr>
-          <w:rFonts w:ascii="Arial" w:hAnsi="Arial" w:cs="Arial"/>
-          <w:b/>
-          <w:bCs/>
-          <w:sz w:val="24"/>
-          <w:szCs w:val="24"/>
-        </w:rPr>
-        <w:t>Título da obra</w:t>
-      </w:r>
-      <w:r>
-        <w:rPr>
-          <w:rFonts w:ascii="Arial" w:hAnsi="Arial" w:cs="Arial"/>
-          <w:sz w:val="24"/>
-          <w:szCs w:val="24"/>
-        </w:rPr>
-        <w:t xml:space="preserve">. Edição. Cidade: Editora, Ano de Publicação. </w:t>
-      </w:r>
-    </w:p>
-    <w:p>
-      <w:pPr>
-        <w:spacing w:after="0" w:line="360" w:lineRule="auto"/>
-        <w:jc w:val="both"/>
-        <w:rPr>
-          <w:rFonts w:ascii="Arial" w:hAnsi="Arial" w:cs="Arial"/>
-          <w:sz w:val="24"/>
-          <w:szCs w:val="24"/>
-        </w:rPr>
-      </w:pPr>
-    </w:p>
-    <w:p>
-      <w:pPr>
-        <w:spacing w:after="0" w:line="360" w:lineRule="auto"/>
-        <w:jc w:val="both"/>
-        <w:rPr>
-          <w:rFonts w:ascii="Arial" w:hAnsi="Arial" w:cs="Arial"/>
-          <w:bCs/>
-          <w:sz w:val="24"/>
-          <w:szCs w:val="24"/>
-        </w:rPr>
-      </w:pPr>
-    </w:p>
-    <w:p>
-      <w:pPr>
-        <w:spacing w:after="0" w:line="360" w:lineRule="auto"/>
-        <w:rPr>
-          <w:rFonts w:ascii="Arial" w:hAnsi="Arial" w:cs="Arial"/>
-          <w:sz w:val="24"/>
-          <w:szCs w:val="24"/>
-        </w:rPr>
-      </w:pPr>
-      <w:r>
-        <w:rPr>
-          <w:rFonts w:ascii="Arial" w:hAnsi="Arial" w:cs="Arial"/>
-          <w:sz w:val="24"/>
-          <w:szCs w:val="24"/>
-        </w:rPr>
-        <w:t>UNIÃO BRASILEIRA DOS ESTUDANTES SECUNDARISTAS (UBES). A importância de estudar história nas escolas. Brasília, 30 nov. 2024. Disponível em: https://www.ubes.org.br/2024/a-importancia-de-estudar-historia-nas-escolas/. Acesso em: 21 maio. 2026.</w:t>
-      </w:r>
-    </w:p>
-    <w:p>
-      <w:pPr>
-        <w:spacing w:after="0" w:line="360" w:lineRule="auto"/>
-        <w:rPr>
-          <w:rFonts w:ascii="Arial" w:hAnsi="Arial" w:cs="Arial"/>
-          <w:sz w:val="24"/>
-          <w:szCs w:val="24"/>
-        </w:rPr>
-      </w:pPr>
-      <w:r>
-        <w:rPr>
-          <w:rFonts w:ascii="Arial" w:hAnsi="Arial" w:cs="Arial"/>
-          <w:sz w:val="24"/>
-          <w:szCs w:val="24"/>
-        </w:rPr>
-        <w:t>GAMEFIC. O que é gamificação? O g</w:t>
-      </w:r>
-      <w:r>
-        <w:rPr>
-          <w:rFonts w:ascii="Arial" w:hAnsi="Arial" w:cs="Arial"/>
-          <w:sz w:val="24"/>
-          <w:szCs w:val="24"/>
-        </w:rPr>
-        <w:t>uia definitivo</w:t>
-      </w:r>
-      <w:r>
-        <w:rPr>
-          <w:rFonts w:ascii="Arial" w:hAnsi="Arial" w:cs="Arial"/>
-          <w:sz w:val="24"/>
-          <w:szCs w:val="24"/>
-        </w:rPr>
-        <w:t>. Disponível em: https://www.gamefic.me/blog/o-que-e-gamificacao-o-guia-definitivo/. Acesso em: 6 ago. 2026.</w:t>
-      </w:r>
-    </w:p>
-    <w:p>
-      <w:pPr>
-        <w:spacing w:after="0" w:line="360" w:lineRule="auto"/>
-        <w:rPr>
-          <w:rFonts w:ascii="Arial" w:hAnsi="Arial" w:cs="Arial"/>
-          <w:bCs/>
-          <w:sz w:val="24"/>
-          <w:szCs w:val="24"/>
-        </w:rPr>
-      </w:pPr>
-      <w:r>
-        <w:rPr>
-          <w:rFonts w:ascii="Arial" w:hAnsi="Arial" w:cs="Arial"/>
-          <w:sz w:val="24"/>
-          <w:szCs w:val="24"/>
-        </w:rPr>
-        <w:t>BALDISSERA, Olivia. O que é gamificação e como ela aumenta o engajamento. Pós PUCPR Digital, 5 abr. 2021. Disponível em: https://posdigital.pucpr.br/blog/gamificacao-engajamento. Acesso em: 6 ago. 2026.</w:t>
-      </w:r>
-    </w:p>
-    <w:p>
-      <w:pPr>
-        <w:spacing w:after="0" w:line="360" w:lineRule="auto"/>
-        <w:rPr>
-          <w:rFonts w:ascii="Arial" w:hAnsi="Arial" w:cs="Arial"/>
-          <w:sz w:val="24"/>
-          <w:szCs w:val="24"/>
-          <w:u w:val="single"/>
-        </w:rPr>
-      </w:pPr>
-      <w:r>
-        <w:rPr>
-          <w:rFonts w:ascii="Arial" w:hAnsi="Arial" w:cs="Arial"/>
-          <w:sz w:val="24"/>
-          <w:szCs w:val="24"/>
-        </w:rPr>
         <w:t xml:space="preserve">MEDEIROS, Adriana de Carvalho. </w:t>
       </w:r>
       <w:r>
@@ -2792,7 +3292,7 @@
 </file>
 
 <file path=word/endnotes.xml><?xml version="1.0" encoding="utf-8"?>
-<w:endnotes xmlns:wpc="http://schemas.microsoft.com/office/word/2010/wordprocessingCanvas" xmlns:cx="http://schemas.microsoft.com/office/drawing/2014/chartex" xmlns:cx1="http://schemas.microsoft.com/office/drawing/2015/9/8/chartex" xmlns:cx2="http://schemas.microsoft.com/office/drawing/2015/10/21/chartex" xmlns:cx3="http://schemas.microsoft.com/office/drawing/2016/5/9/chartex" xmlns:cx4="http://schemas.microsoft.com/office/drawing/2016/5/10/chartex" xmlns:cx5="http://schemas.microsoft.com/office/drawing/2016/5/11/chartex" xmlns:cx6="http://schemas.microsoft.com/office/drawing/2016/5/12/chartex" xmlns:cx7="http://schemas.microsoft.com/office/drawing/2016/5/13/chartex" xmlns:cx8="http://schemas.microsoft.com/office/drawing/2016/5/14/chartex" xmlns:mc="http://schemas.openxmlformats.org/markup-compatibility/2006" xmlns:aink="http://schemas.microsoft.com/office/drawing/2016/ink" xmlns:am3d="http://schemas.microsoft.com/office/drawing/2017/model3d" xmlns:o="urn:schemas-microsoft-com:office:office" xmlns:oel="http://schemas.microsoft.com/office/2019/extlst" xmlns:r="http://schemas.openxmlformats.org/officeDocument/2006/relationships" xmlns:m="http://schemas.openxmlformats.org/officeDocument/2006/math" xmlns:v="urn:schemas-microsoft-com:vml" xmlns:wp14="http://schemas.microsoft.com/office/word/2010/wordprocessingDrawing" xmlns:wp="http://schemas.openxmlformats.org/drawingml/2006/wordprocessingDrawing" xmlns:w10="urn:schemas-microsoft-com:office:word" xmlns:w="http://schemas.openxmlformats.org/wordprocessingml/2006/main" xmlns:w14="http://schemas.microsoft.com/office/word/2010/wordml" xmlns:w15="http://schemas.microsoft.com/office/word/2012/wordml" xmlns:w16cex="http://schemas.microsoft.com/office/word/2018/wordml/cex" xmlns:w16cid="http://schemas.microsoft.com/office/word/2016/wordml/cid" xmlns:w16="http://schemas.microsoft.com/office/word/2018/wordml" xmlns:w16du="http://schemas.microsoft.com/office/word/2023/wordml/word16du" xmlns:w16sdtdh="http://schemas.microsoft.com/office/word/2020/wordml/sdtdatahash" xmlns:w16sdtfl="http://schemas.microsoft.com/office/word/2024/wordml/sdtformatlock" xmlns:w16se="http://schemas.microsoft.com/office/word/2015/wordml/symex" xmlns:wpg="http://schemas.microsoft.com/office/word/2010/wordprocessingGroup" xmlns:wpi="http://schemas.microsoft.com/office/word/2010/wordprocessingInk" xmlns:wne="http://schemas.microsoft.com/office/word/2006/wordml" xmlns:wps="http://schemas.microsoft.com/office/word/2010/wordprocessingShape" mc:Ignorable="w14 w15 w16se w16cid w16 w16cex w16sdtdh w16sdtfl w16du wp14">
+<w:endnotes xmlns:wpc="http://schemas.microsoft.com/office/word/2010/wordprocessingCanvas" xmlns:cx="http://schemas.microsoft.com/office/drawing/2014/chartex" xmlns:mc="http://schemas.openxmlformats.org/markup-compatibility/2006" xmlns:o="urn:schemas-microsoft-com:office:office" xmlns:r="http://schemas.openxmlformats.org/officeDocument/2006/relationships" xmlns:m="http://schemas.openxmlformats.org/officeDocument/2006/math" xmlns:v="urn:schemas-microsoft-com:vml" xmlns:wp14="http://schemas.microsoft.com/office/word/2010/wordprocessingDrawing" xmlns:wp="http://schemas.openxmlformats.org/drawingml/2006/wordprocessingDrawing" xmlns:w10="urn:schemas-microsoft-com:office:word" xmlns:w="http://schemas.openxmlformats.org/wordprocessingml/2006/main" xmlns:w14="http://schemas.microsoft.com/office/word/2010/wordml" xmlns:w15="http://schemas.microsoft.com/office/word/2012/wordml" xmlns:w16se="http://schemas.microsoft.com/office/word/2015/wordml/symex" xmlns:wpg="http://schemas.microsoft.com/office/word/2010/wordprocessingGroup" xmlns:wpi="http://schemas.microsoft.com/office/word/2010/wordprocessingInk" xmlns:wne="http://schemas.microsoft.com/office/word/2006/wordml" xmlns:wps="http://schemas.microsoft.com/office/word/2010/wordprocessingShape" mc:Ignorable="w14 w15 w16se wp14">
   <w:endnote w:type="separator" w:id="-1">
     <w:p>
       <w:pPr>
@@ -2817,7 +3317,7 @@
 </file>
 
 <file path=word/footnotes.xml><?xml version="1.0" encoding="utf-8"?>
-<w:footnotes xmlns:wpc="http://schemas.microsoft.com/office/word/2010/wordprocessingCanvas" xmlns:cx="http://schemas.microsoft.com/office/drawing/2014/chartex" xmlns:cx1="http://schemas.microsoft.com/office/drawing/2015/9/8/chartex" xmlns:cx2="http://schemas.microsoft.com/office/drawing/2015/10/21/chartex" xmlns:cx3="http://schemas.microsoft.com/office/drawing/2016/5/9/chartex" xmlns:cx4="http://schemas.microsoft.com/office/drawing/2016/5/10/chartex" xmlns:cx5="http://schemas.microsoft.com/office/drawing/2016/5/11/chartex" xmlns:cx6="http://schemas.microsoft.com/office/drawing/2016/5/12/chartex" xmlns:cx7="http://schemas.microsoft.com/office/drawing/2016/5/13/chartex" xmlns:cx8="http://schemas.microsoft.com/office/drawing/2016/5/14/chartex" xmlns:mc="http://schemas.openxmlformats.org/markup-compatibility/2006" xmlns:aink="http://schemas.microsoft.com/office/drawing/2016/ink" xmlns:am3d="http://schemas.microsoft.com/office/drawing/2017/model3d" xmlns:o="urn:schemas-microsoft-com:office:office" xmlns:oel="http://schemas.microsoft.com/office/2019/extlst" xmlns:r="http://schemas.openxmlformats.org/officeDocument/2006/relationships" xmlns:m="http://schemas.openxmlformats.org/officeDocument/2006/math" xmlns:v="urn:schemas-microsoft-com:vml" xmlns:wp14="http://schemas.microsoft.com/office/word/2010/wordprocessingDrawing" xmlns:wp="http://schemas.openxmlformats.org/drawingml/2006/wordprocessingDrawing" xmlns:w10="urn:schemas-microsoft-com:office:word" xmlns:w="http://schemas.openxmlformats.org/wordprocessingml/2006/main" xmlns:w14="http://schemas.microsoft.com/office/word/2010/wordml" xmlns:w15="http://schemas.microsoft.com/office/word/2012/wordml" xmlns:w16cex="http://schemas.microsoft.com/office/word/2018/wordml/cex" xmlns:w16cid="http://schemas.microsoft.com/office/word/2016/wordml/cid" xmlns:w16="http://schemas.microsoft.com/office/word/2018/wordml" xmlns:w16du="http://schemas.microsoft.com/office/word/2023/wordml/word16du" xmlns:w16sdtdh="http://schemas.microsoft.com/office/word/2020/wordml/sdtdatahash" xmlns:w16sdtfl="http://schemas.microsoft.com/office/word/2024/wordml/sdtformatlock" xmlns:w16se="http://schemas.microsoft.com/office/word/2015/wordml/symex" xmlns:wpg="http://schemas.microsoft.com/office/word/2010/wordprocessingGroup" xmlns:wpi="http://schemas.microsoft.com/office/word/2010/wordprocessingInk" xmlns:wne="http://schemas.microsoft.com/office/word/2006/wordml" xmlns:wps="http://schemas.microsoft.com/office/word/2010/wordprocessingShape" mc:Ignorable="w14 w15 w16se w16cid w16 w16cex w16sdtdh w16sdtfl w16du wp14">
+<w:footnotes xmlns:wpc="http://schemas.microsoft.com/office/word/2010/wordprocessingCanvas" xmlns:cx="http://schemas.microsoft.com/office/drawing/2014/chartex" xmlns:mc="http://schemas.openxmlformats.org/markup-compatibility/2006" xmlns:o="urn:schemas-microsoft-com:office:office" xmlns:r="http://schemas.openxmlformats.org/officeDocument/2006/relationships" xmlns:m="http://schemas.openxmlformats.org/officeDocument/2006/math" xmlns:v="urn:schemas-microsoft-com:vml" xmlns:wp14="http://schemas.microsoft.com/office/word/2010/wordprocessingDrawing" xmlns:wp="http://schemas.openxmlformats.org/drawingml/2006/wordprocessingDrawing" xmlns:w10="urn:schemas-microsoft-com:office:word" xmlns:w="http://schemas.openxmlformats.org/wordprocessingml/2006/main" xmlns:w14="http://schemas.microsoft.com/office/word/2010/wordml" xmlns:w15="http://schemas.microsoft.com/office/word/2012/wordml" xmlns:w16se="http://schemas.microsoft.com/office/word/2015/wordml/symex" xmlns:wpg="http://schemas.microsoft.com/office/word/2010/wordprocessingGroup" xmlns:wpi="http://schemas.microsoft.com/office/word/2010/wordprocessingInk" xmlns:wne="http://schemas.microsoft.com/office/word/2006/wordml" xmlns:wps="http://schemas.microsoft.com/office/word/2010/wordprocessingShape" mc:Ignorable="w14 w15 w16se wp14">
   <w:footnote w:type="separator" w:id="-1">
     <w:p>
       <w:pPr>
@@ -2842,7 +3342,7 @@
 </file>
 
 <file path=word/styles.xml><?xml version="1.0" encoding="utf-8"?>
-<w:styles xmlns:mc="http://schemas.openxmlformats.org/markup-compatibility/2006" xmlns:r="http://schemas.openxmlformats.org/officeDocument/2006/relationships" xmlns:w="http://schemas.openxmlformats.org/wordprocessingml/2006/main" xmlns:w14="http://schemas.microsoft.com/office/word/2010/wordml" xmlns:w15="http://schemas.microsoft.com/office/word/2012/wordml" xmlns:w16cex="http://schemas.microsoft.com/office/word/2018/wordml/cex" xmlns:w16cid="http://schemas.microsoft.com/office/word/2016/wordml/cid" xmlns:w16="http://schemas.microsoft.com/office/word/2018/wordml" xmlns:w16du="http://schemas.microsoft.com/office/word/2023/wordml/word16du" xmlns:w16sdtdh="http://schemas.microsoft.com/office/word/2020/wordml/sdtdatahash" xmlns:w16sdtfl="http://schemas.microsoft.com/office/word/2024/wordml/sdtformatlock" xmlns:w16se="http://schemas.microsoft.com/office/word/2015/wordml/symex" mc:Ignorable="w14 w15 w16se w16cid w16 w16cex w16sdtdh w16sdtfl w16du">
+<w:styles xmlns:mc="http://schemas.openxmlformats.org/markup-compatibility/2006" xmlns:r="http://schemas.openxmlformats.org/officeDocument/2006/relationships" xmlns:w="http://schemas.openxmlformats.org/wordprocessingml/2006/main" xmlns:w14="http://schemas.microsoft.com/office/word/2010/wordml" xmlns:w15="http://schemas.microsoft.com/office/word/2012/wordml" xmlns:w16se="http://schemas.microsoft.com/office/word/2015/wordml/symex" mc:Ignorable="w14 w15 w16se">
   <w:docDefaults>
     <w:rPrDefault>
       <w:rPr>
@@ -2858,7 +3358,7 @@
       </w:pPr>
     </w:pPrDefault>
   </w:docDefaults>
-  <w:latentStyles w:defLockedState="0" w:defUIPriority="99" w:defSemiHidden="0" w:defUnhideWhenUsed="0" w:defQFormat="0" w:count="376">
+  <w:latentStyles w:defLockedState="0" w:defUIPriority="99" w:defSemiHidden="0" w:defUnhideWhenUsed="0" w:defQFormat="0" w:count="371">
     <w:lsdException w:name="Normal" w:uiPriority="0" w:qFormat="1"/>
     <w:lsdException w:name="heading 1" w:uiPriority="9" w:qFormat="1"/>
     <w:lsdException w:name="heading 2" w:semiHidden="1" w:uiPriority="9" w:unhideWhenUsed="1" w:qFormat="1"/>
@@ -3230,11 +3730,6 @@
     <w:lsdException w:name="List Table 5 Dark Accent 6" w:uiPriority="50"/>
     <w:lsdException w:name="List Table 6 Colorful Accent 6" w:uiPriority="51"/>
     <w:lsdException w:name="List Table 7 Colorful Accent 6" w:uiPriority="52"/>
-    <w:lsdException w:name="Mention" w:semiHidden="1" w:unhideWhenUsed="1"/>
-    <w:lsdException w:name="Smart Hyperlink" w:semiHidden="1" w:unhideWhenUsed="1"/>
-    <w:lsdException w:name="Hashtag" w:semiHidden="1" w:unhideWhenUsed="1"/>
-    <w:lsdException w:name="Unresolved Mention" w:semiHidden="1" w:unhideWhenUsed="1"/>
-    <w:lsdException w:name="Smart Link" w:semiHidden="1" w:unhideWhenUsed="1"/>
   </w:latentStyles>
   <w:style w:type="paragraph" w:default="1" w:styleId="Normal">
     <w:name w:val="Normal"/>
@@ -3243,6 +3738,7 @@
   <w:style w:type="character" w:default="1" w:styleId="Fontepargpadro">
     <w:name w:val="Default Paragraph Font"/>
     <w:uiPriority w:val="1"/>
+    <w:semiHidden/>
     <w:unhideWhenUsed/>
   </w:style>
   <w:style w:type="table" w:default="1" w:styleId="Tabelanormal">
@@ -3603,7 +4099,7 @@
 </file>
 
 <file path=customXml/itemProps1.xml><?xml version="1.0" encoding="utf-8"?>
-<ds:datastoreItem xmlns:ds="http://schemas.openxmlformats.org/officeDocument/2006/customXml" ds:itemID="{585CAE05-937B-437E-B279-04A3A9F37E12}">
+<ds:datastoreItem xmlns:ds="http://schemas.openxmlformats.org/officeDocument/2006/customXml" ds:itemID="{97CA96A7-09AF-4685-A1C7-792E38B8192A}">
   <ds:schemaRefs>
     <ds:schemaRef ds:uri="http://schemas.openxmlformats.org/officeDocument/2006/bibliography"/>
   </ds:schemaRefs>

</xml_diff>